<commit_message>
2 Kings 18:28-35 completed
</commit_message>
<xml_diff>
--- a/Public Talks/No 147/No 147.docx
+++ b/Public Talks/No 147/No 147.docx
@@ -938,20 +938,24 @@
     </w:p>
     <w:p>
       <w:pPr>
-        <w:ind w:left="1440" w:hanging="720"/>
-        <w:rPr>
-          <w:rFonts w:ascii="Segoe UI Light" w:hAnsi="Segoe UI Light" w:cs="Segoe UI Light"/>
-          <w:b/>
-          <w:bCs/>
-        </w:rPr>
-      </w:pPr>
-      <w:r>
-        <w:rPr>
-          <w:rFonts w:ascii="Segoe UI Light" w:hAnsi="Segoe UI Light" w:cs="Segoe UI Light"/>
-          <w:b/>
-          <w:bCs/>
-        </w:rPr>
-        <w:t>2 Kings 18:28-35</w:t>
+        <w:pStyle w:val="ListParagraph"/>
+        <w:numPr>
+          <w:ilvl w:val="0"/>
+          <w:numId w:val="13"/>
+        </w:numPr>
+        <w:rPr>
+          <w:rFonts w:ascii="Segoe UI Light" w:hAnsi="Segoe UI Light" w:cs="Segoe UI Light"/>
+          <w:b/>
+          <w:bCs/>
+        </w:rPr>
+      </w:pPr>
+      <w:r>
+        <w:rPr>
+          <w:rFonts w:ascii="Segoe UI Light" w:hAnsi="Segoe UI Light" w:cs="Segoe UI Light"/>
+          <w:b/>
+          <w:bCs/>
+        </w:rPr>
+        <w:t>Kings 18:28-35</w:t>
       </w:r>
       <w:r>
         <w:rPr>
@@ -964,15 +968,597 @@
     </w:p>
     <w:p>
       <w:pPr>
-        <w:ind w:left="720"/>
-        <w:rPr>
-          <w:rFonts w:ascii="Segoe UI Light" w:hAnsi="Segoe UI Light" w:cs="Segoe UI Light"/>
-        </w:rPr>
-      </w:pPr>
-    </w:p>
-    <w:p>
-      <w:pPr>
-        <w:ind w:left="1440"/>
+        <w:pStyle w:val="ListParagraph"/>
+        <w:numPr>
+          <w:ilvl w:val="0"/>
+          <w:numId w:val="12"/>
+        </w:numPr>
+        <w:rPr>
+          <w:rFonts w:ascii="Segoe UI Light" w:hAnsi="Segoe UI Light" w:cs="Segoe UI Light"/>
+          <w:b/>
+          <w:bCs/>
+        </w:rPr>
+      </w:pPr>
+      <w:r>
+        <w:rPr>
+          <w:rFonts w:ascii="Segoe UI Light" w:hAnsi="Segoe UI Light" w:cs="Segoe UI Light"/>
+          <w:b/>
+          <w:bCs/>
+        </w:rPr>
+        <w:t>Verse</w:t>
+      </w:r>
+      <w:r>
+        <w:rPr>
+          <w:rFonts w:ascii="Segoe UI Light" w:hAnsi="Segoe UI Light" w:cs="Segoe UI Light"/>
+          <w:b/>
+          <w:bCs/>
+        </w:rPr>
+        <w:t>s</w:t>
+      </w:r>
+      <w:r>
+        <w:rPr>
+          <w:rFonts w:ascii="Segoe UI Light" w:hAnsi="Segoe UI Light" w:cs="Segoe UI Light"/>
+          <w:b/>
+          <w:bCs/>
+        </w:rPr>
+        <w:t xml:space="preserve"> 29, 30</w:t>
+      </w:r>
+      <w:r>
+        <w:rPr>
+          <w:rFonts w:ascii="Segoe UI Light" w:hAnsi="Segoe UI Light" w:cs="Segoe UI Light"/>
+          <w:b/>
+          <w:bCs/>
+        </w:rPr>
+        <w:t xml:space="preserve">. </w:t>
+      </w:r>
+      <w:r>
+        <w:rPr>
+          <w:rFonts w:ascii="Segoe UI Light" w:hAnsi="Segoe UI Light" w:cs="Segoe UI Light"/>
+        </w:rPr>
+        <w:t xml:space="preserve">They tried to </w:t>
+      </w:r>
+      <w:r>
+        <w:rPr>
+          <w:rFonts w:ascii="Segoe UI Light" w:hAnsi="Segoe UI Light" w:cs="Segoe UI Light"/>
+          <w:b/>
+          <w:bCs/>
+          <w:i/>
+          <w:iCs/>
+          <w:color w:val="F4B083" w:themeColor="accent2" w:themeTint="99"/>
+        </w:rPr>
+        <w:t>undermine people’s trust in God’s representatives</w:t>
+      </w:r>
+      <w:r>
+        <w:rPr>
+          <w:rFonts w:ascii="Segoe UI Light" w:hAnsi="Segoe UI Light" w:cs="Segoe UI Light"/>
+        </w:rPr>
+        <w:t xml:space="preserve">; </w:t>
+      </w:r>
+    </w:p>
+    <w:p>
+      <w:pPr>
+        <w:pStyle w:val="ListParagraph"/>
+        <w:ind w:left="1800"/>
+        <w:rPr>
+          <w:rFonts w:ascii="Segoe UI Light" w:hAnsi="Segoe UI Light" w:cs="Segoe UI Light"/>
+          <w:b/>
+          <w:bCs/>
+        </w:rPr>
+      </w:pPr>
+      <w:r>
+        <w:rPr>
+          <w:rFonts w:ascii="Segoe UI Light" w:hAnsi="Segoe UI Light" w:cs="Segoe UI Light"/>
+          <w:b/>
+          <w:bCs/>
+        </w:rPr>
+        <w:t>Purpose</w:t>
+      </w:r>
+      <w:r>
+        <w:rPr>
+          <w:rFonts w:ascii="Segoe UI Light" w:hAnsi="Segoe UI Light" w:cs="Segoe UI Light"/>
+        </w:rPr>
+        <w:t xml:space="preserve">: </w:t>
+      </w:r>
+      <w:r>
+        <w:rPr>
+          <w:rFonts w:ascii="Segoe UI Light" w:hAnsi="Segoe UI Light" w:cs="Segoe UI Light"/>
+        </w:rPr>
+        <w:t>seed</w:t>
+      </w:r>
+      <w:r>
+        <w:rPr>
+          <w:rFonts w:ascii="Segoe UI Light" w:hAnsi="Segoe UI Light" w:cs="Segoe UI Light"/>
+        </w:rPr>
+        <w:t xml:space="preserve"> doubts in </w:t>
+      </w:r>
+      <w:r>
+        <w:rPr>
+          <w:rFonts w:ascii="Segoe UI Light" w:hAnsi="Segoe UI Light" w:cs="Segoe UI Light"/>
+        </w:rPr>
+        <w:t>the</w:t>
+      </w:r>
+      <w:r>
+        <w:rPr>
+          <w:rFonts w:ascii="Segoe UI Light" w:hAnsi="Segoe UI Light" w:cs="Segoe UI Light"/>
+        </w:rPr>
+        <w:t xml:space="preserve"> heart</w:t>
+      </w:r>
+      <w:r>
+        <w:rPr>
+          <w:rFonts w:ascii="Segoe UI Light" w:hAnsi="Segoe UI Light" w:cs="Segoe UI Light"/>
+        </w:rPr>
+        <w:t>s and create division among the people</w:t>
+      </w:r>
+    </w:p>
+    <w:p>
+      <w:pPr>
+        <w:pStyle w:val="ListParagraph"/>
+        <w:numPr>
+          <w:ilvl w:val="2"/>
+          <w:numId w:val="15"/>
+        </w:numPr>
+        <w:rPr>
+          <w:rFonts w:ascii="Segoe UI Light" w:hAnsi="Segoe UI Light" w:cs="Segoe UI Light"/>
+          <w:b/>
+          <w:bCs/>
+        </w:rPr>
+      </w:pPr>
+      <w:r>
+        <w:rPr>
+          <w:rFonts w:ascii="Segoe UI Light" w:hAnsi="Segoe UI Light" w:cs="Segoe UI Light"/>
+        </w:rPr>
+        <w:t>Apostates and God’s enemies spread false report on those taking the lead among God’s people. To create doubts and con</w:t>
+      </w:r>
+      <w:r>
+        <w:rPr>
+          <w:rFonts w:ascii="Segoe UI Light" w:hAnsi="Segoe UI Light" w:cs="Segoe UI Light"/>
+        </w:rPr>
+        <w:t>fusion, distrust</w:t>
+      </w:r>
+    </w:p>
+    <w:p>
+      <w:pPr>
+        <w:pStyle w:val="ListParagraph"/>
+        <w:numPr>
+          <w:ilvl w:val="2"/>
+          <w:numId w:val="15"/>
+        </w:numPr>
+        <w:rPr>
+          <w:rFonts w:ascii="Segoe UI Light" w:hAnsi="Segoe UI Light" w:cs="Segoe UI Light"/>
+          <w:b/>
+          <w:bCs/>
+        </w:rPr>
+      </w:pPr>
+      <w:r>
+        <w:rPr>
+          <w:rFonts w:ascii="Segoe UI Light" w:hAnsi="Segoe UI Light" w:cs="Segoe UI Light"/>
+        </w:rPr>
+        <w:t>Why changing our understanding of the scriptures?</w:t>
+      </w:r>
+    </w:p>
+    <w:p>
+      <w:pPr>
+        <w:pStyle w:val="ListParagraph"/>
+        <w:numPr>
+          <w:ilvl w:val="2"/>
+          <w:numId w:val="15"/>
+        </w:numPr>
+        <w:rPr>
+          <w:rFonts w:ascii="Segoe UI Light" w:hAnsi="Segoe UI Light" w:cs="Segoe UI Light"/>
+          <w:b/>
+          <w:bCs/>
+        </w:rPr>
+      </w:pPr>
+      <w:r>
+        <w:rPr>
+          <w:rFonts w:ascii="Segoe UI Light" w:hAnsi="Segoe UI Light" w:cs="Segoe UI Light"/>
+        </w:rPr>
+        <w:t>Should we trust these new directions…</w:t>
+      </w:r>
+    </w:p>
+    <w:p>
+      <w:pPr>
+        <w:pStyle w:val="ListParagraph"/>
+        <w:numPr>
+          <w:ilvl w:val="0"/>
+          <w:numId w:val="12"/>
+        </w:numPr>
+        <w:rPr>
+          <w:rFonts w:ascii="Segoe UI Light" w:hAnsi="Segoe UI Light" w:cs="Segoe UI Light"/>
+          <w:b/>
+          <w:bCs/>
+        </w:rPr>
+      </w:pPr>
+      <w:r>
+        <w:rPr>
+          <w:rFonts w:ascii="Segoe UI Light" w:hAnsi="Segoe UI Light" w:cs="Segoe UI Light"/>
+          <w:b/>
+          <w:bCs/>
+        </w:rPr>
+        <w:t>Verses 31, 32.</w:t>
+      </w:r>
+      <w:r>
+        <w:rPr>
+          <w:rFonts w:ascii="Segoe UI Light" w:hAnsi="Segoe UI Light" w:cs="Segoe UI Light"/>
+        </w:rPr>
+        <w:t xml:space="preserve"> </w:t>
+      </w:r>
+      <w:r>
+        <w:rPr>
+          <w:rFonts w:ascii="Segoe UI Light" w:hAnsi="Segoe UI Light" w:cs="Segoe UI Light"/>
+          <w:b/>
+          <w:bCs/>
+          <w:i/>
+          <w:iCs/>
+          <w:color w:val="F4B083" w:themeColor="accent2" w:themeTint="99"/>
+        </w:rPr>
+        <w:t>False promises</w:t>
+      </w:r>
+      <w:r>
+        <w:rPr>
+          <w:rFonts w:ascii="Segoe UI Light" w:hAnsi="Segoe UI Light" w:cs="Segoe UI Light"/>
+        </w:rPr>
+        <w:t xml:space="preserve">. </w:t>
+      </w:r>
+    </w:p>
+    <w:p>
+      <w:pPr>
+        <w:pStyle w:val="ListParagraph"/>
+        <w:ind w:left="1797"/>
+        <w:rPr>
+          <w:rFonts w:ascii="Segoe UI Light" w:hAnsi="Segoe UI Light" w:cs="Segoe UI Light"/>
+        </w:rPr>
+      </w:pPr>
+      <w:r>
+        <w:rPr>
+          <w:rFonts w:ascii="Segoe UI Light" w:hAnsi="Segoe UI Light" w:cs="Segoe UI Light"/>
+          <w:b/>
+          <w:bCs/>
+        </w:rPr>
+        <w:t>Purpose</w:t>
+      </w:r>
+      <w:r>
+        <w:rPr>
+          <w:rFonts w:ascii="Segoe UI Light" w:hAnsi="Segoe UI Light" w:cs="Segoe UI Light"/>
+        </w:rPr>
+        <w:t>: A false sense of security; There is a better way than following theocratic directions</w:t>
+      </w:r>
+      <w:r>
+        <w:rPr>
+          <w:rFonts w:ascii="Segoe UI Light" w:hAnsi="Segoe UI Light" w:cs="Segoe UI Light"/>
+        </w:rPr>
+        <w:t xml:space="preserve"> – To trust in Jehovah and stay put</w:t>
+      </w:r>
+      <w:r>
+        <w:rPr>
+          <w:rFonts w:ascii="Segoe UI Light" w:hAnsi="Segoe UI Light" w:cs="Segoe UI Light"/>
+        </w:rPr>
+        <w:t>.</w:t>
+      </w:r>
+    </w:p>
+    <w:p>
+      <w:pPr>
+        <w:pStyle w:val="ListParagraph"/>
+        <w:numPr>
+          <w:ilvl w:val="0"/>
+          <w:numId w:val="14"/>
+        </w:numPr>
+        <w:rPr>
+          <w:rFonts w:ascii="Segoe UI Light" w:hAnsi="Segoe UI Light" w:cs="Segoe UI Light"/>
+        </w:rPr>
+      </w:pPr>
+      <w:r>
+        <w:rPr>
+          <w:rFonts w:ascii="Segoe UI Light" w:hAnsi="Segoe UI Light" w:cs="Segoe UI Light"/>
+        </w:rPr>
+        <w:t>More money or material things will make us happy.</w:t>
+      </w:r>
+    </w:p>
+    <w:p>
+      <w:pPr>
+        <w:pStyle w:val="ListParagraph"/>
+        <w:numPr>
+          <w:ilvl w:val="0"/>
+          <w:numId w:val="14"/>
+        </w:numPr>
+        <w:rPr>
+          <w:rFonts w:ascii="Segoe UI Light" w:hAnsi="Segoe UI Light" w:cs="Segoe UI Light"/>
+        </w:rPr>
+      </w:pPr>
+      <w:r>
+        <w:rPr>
+          <w:rFonts w:ascii="Segoe UI Light" w:hAnsi="Segoe UI Light" w:cs="Segoe UI Light"/>
+        </w:rPr>
+        <w:t xml:space="preserve">You miss out if you don’t have sex. </w:t>
+      </w:r>
+    </w:p>
+    <w:p>
+      <w:pPr>
+        <w:pStyle w:val="ListParagraph"/>
+        <w:numPr>
+          <w:ilvl w:val="0"/>
+          <w:numId w:val="14"/>
+        </w:numPr>
+        <w:rPr>
+          <w:rFonts w:ascii="Segoe UI Light" w:hAnsi="Segoe UI Light" w:cs="Segoe UI Light"/>
+        </w:rPr>
+      </w:pPr>
+      <w:r>
+        <w:rPr>
+          <w:rFonts w:ascii="Segoe UI Light" w:hAnsi="Segoe UI Light" w:cs="Segoe UI Light"/>
+        </w:rPr>
+        <w:t xml:space="preserve">Political promises; </w:t>
+      </w:r>
+      <w:r>
+        <w:rPr>
+          <w:rFonts w:ascii="Segoe UI Light" w:hAnsi="Segoe UI Light" w:cs="Segoe UI Light"/>
+          <w:i/>
+          <w:iCs/>
+        </w:rPr>
+        <w:t>Peace and Security</w:t>
+      </w:r>
+      <w:r>
+        <w:rPr>
+          <w:rFonts w:ascii="Segoe UI Light" w:hAnsi="Segoe UI Light" w:cs="Segoe UI Light"/>
+        </w:rPr>
+        <w:t>.</w:t>
+      </w:r>
+    </w:p>
+    <w:p>
+      <w:pPr>
+        <w:pStyle w:val="ListParagraph"/>
+        <w:numPr>
+          <w:ilvl w:val="0"/>
+          <w:numId w:val="12"/>
+        </w:numPr>
+        <w:rPr>
+          <w:rFonts w:ascii="Segoe UI Light" w:hAnsi="Segoe UI Light" w:cs="Segoe UI Light"/>
+          <w:b/>
+          <w:bCs/>
+        </w:rPr>
+      </w:pPr>
+      <w:r>
+        <w:rPr>
+          <w:rFonts w:ascii="Segoe UI Light" w:hAnsi="Segoe UI Light" w:cs="Segoe UI Light"/>
+          <w:b/>
+          <w:bCs/>
+        </w:rPr>
+        <w:t xml:space="preserve">Verses 33-35. </w:t>
+      </w:r>
+      <w:r>
+        <w:rPr>
+          <w:rFonts w:ascii="Segoe UI Light" w:hAnsi="Segoe UI Light" w:cs="Segoe UI Light"/>
+          <w:b/>
+          <w:bCs/>
+          <w:i/>
+          <w:iCs/>
+          <w:color w:val="F4B083" w:themeColor="accent2" w:themeTint="99"/>
+        </w:rPr>
+        <w:t>Undermine Faith in God</w:t>
+      </w:r>
+      <w:r>
+        <w:rPr>
+          <w:rFonts w:ascii="Segoe UI Light" w:hAnsi="Segoe UI Light" w:cs="Segoe UI Light"/>
+          <w:i/>
+          <w:iCs/>
+        </w:rPr>
+        <w:t>.</w:t>
+      </w:r>
+    </w:p>
+    <w:p>
+      <w:pPr>
+        <w:pStyle w:val="ListParagraph"/>
+        <w:ind w:left="1800"/>
+        <w:rPr>
+          <w:rFonts w:ascii="Segoe UI Light" w:hAnsi="Segoe UI Light" w:cs="Segoe UI Light"/>
+        </w:rPr>
+      </w:pPr>
+      <w:r>
+        <w:rPr>
+          <w:rFonts w:ascii="Segoe UI Light" w:hAnsi="Segoe UI Light" w:cs="Segoe UI Light"/>
+          <w:b/>
+          <w:bCs/>
+        </w:rPr>
+        <w:t>Purpose</w:t>
+      </w:r>
+      <w:r>
+        <w:rPr>
+          <w:rFonts w:ascii="Segoe UI Light" w:hAnsi="Segoe UI Light" w:cs="Segoe UI Light"/>
+        </w:rPr>
+        <w:t>: Loose trust in Jehovah.</w:t>
+      </w:r>
+    </w:p>
+    <w:p>
+      <w:pPr>
+        <w:pStyle w:val="ListParagraph"/>
+        <w:numPr>
+          <w:ilvl w:val="1"/>
+          <w:numId w:val="12"/>
+        </w:numPr>
+        <w:rPr>
+          <w:rFonts w:ascii="Segoe UI Light" w:hAnsi="Segoe UI Light" w:cs="Segoe UI Light"/>
+        </w:rPr>
+      </w:pPr>
+      <w:r>
+        <w:rPr>
+          <w:rFonts w:ascii="Segoe UI Light" w:hAnsi="Segoe UI Light" w:cs="Segoe UI Light"/>
+        </w:rPr>
+        <w:t>Philosoph</w:t>
+      </w:r>
+      <w:r>
+        <w:rPr>
+          <w:rFonts w:ascii="Segoe UI Light" w:hAnsi="Segoe UI Light" w:cs="Segoe UI Light"/>
+        </w:rPr>
+        <w:t>ies</w:t>
+      </w:r>
+      <w:r>
+        <w:rPr>
+          <w:rFonts w:ascii="Segoe UI Light" w:hAnsi="Segoe UI Light" w:cs="Segoe UI Light"/>
+        </w:rPr>
+        <w:t xml:space="preserve"> </w:t>
+      </w:r>
+      <w:r>
+        <w:rPr>
+          <w:rFonts w:ascii="Segoe UI Light" w:hAnsi="Segoe UI Light" w:cs="Segoe UI Light"/>
+        </w:rPr>
+        <w:t>and theories of this world</w:t>
+      </w:r>
+      <w:r>
+        <w:rPr>
+          <w:rFonts w:ascii="Segoe UI Light" w:hAnsi="Segoe UI Light" w:cs="Segoe UI Light"/>
+        </w:rPr>
+        <w:t>. They go as far as questioning the very existence of God.</w:t>
+      </w:r>
+    </w:p>
+    <w:p>
+      <w:pPr>
+        <w:pStyle w:val="ListParagraph"/>
+        <w:numPr>
+          <w:ilvl w:val="1"/>
+          <w:numId w:val="12"/>
+        </w:numPr>
+        <w:rPr>
+          <w:rFonts w:ascii="Segoe UI Light" w:hAnsi="Segoe UI Light" w:cs="Segoe UI Light"/>
+        </w:rPr>
+      </w:pPr>
+      <w:r>
+        <w:rPr>
+          <w:rFonts w:ascii="Segoe UI Light" w:hAnsi="Segoe UI Light" w:cs="Segoe UI Light"/>
+        </w:rPr>
+        <w:lastRenderedPageBreak/>
+        <w:t>Will Jehovah actually provide what I need if I put Kingdom interest first? Or should I take matters in my own hands?</w:t>
+      </w:r>
+    </w:p>
+    <w:p>
+      <w:pPr>
+        <w:pStyle w:val="ListParagraph"/>
+        <w:numPr>
+          <w:ilvl w:val="0"/>
+          <w:numId w:val="12"/>
+        </w:numPr>
+        <w:rPr>
+          <w:rFonts w:ascii="Segoe UI Light" w:hAnsi="Segoe UI Light" w:cs="Segoe UI Light"/>
+          <w:b/>
+          <w:bCs/>
+        </w:rPr>
+      </w:pPr>
+      <w:r>
+        <w:rPr>
+          <w:rFonts w:ascii="Segoe UI Light" w:hAnsi="Segoe UI Light" w:cs="Segoe UI Light"/>
+          <w:b/>
+          <w:bCs/>
+        </w:rPr>
+        <w:t>Verse 28.</w:t>
+      </w:r>
+      <w:r>
+        <w:rPr>
+          <w:rFonts w:ascii="Segoe UI Light" w:hAnsi="Segoe UI Light" w:cs="Segoe UI Light"/>
+        </w:rPr>
+        <w:t xml:space="preserve"> They spoke in the Hebrew language and not in the </w:t>
+      </w:r>
+      <w:r>
+        <w:rPr>
+          <w:rFonts w:ascii="Segoe UI Light" w:hAnsi="Segoe UI Light" w:cs="Segoe UI Light"/>
+          <w:b/>
+          <w:bCs/>
+          <w:i/>
+          <w:iCs/>
+          <w:color w:val="F4B083" w:themeColor="accent2" w:themeTint="99"/>
+        </w:rPr>
+        <w:t>Aramaic language</w:t>
+      </w:r>
+      <w:r>
+        <w:rPr>
+          <w:rFonts w:ascii="Segoe UI Light" w:hAnsi="Segoe UI Light" w:cs="Segoe UI Light"/>
+        </w:rPr>
+        <w:t>.</w:t>
+      </w:r>
+      <w:r>
+        <w:rPr>
+          <w:rFonts w:ascii="Segoe UI Light" w:hAnsi="Segoe UI Light" w:cs="Segoe UI Light"/>
+        </w:rPr>
+        <w:t xml:space="preserve"> Why?</w:t>
+      </w:r>
+    </w:p>
+    <w:p>
+      <w:pPr>
+        <w:pStyle w:val="ListParagraph"/>
+        <w:ind w:left="1797"/>
+        <w:rPr>
+          <w:rFonts w:ascii="Segoe UI Light" w:hAnsi="Segoe UI Light" w:cs="Segoe UI Light"/>
+        </w:rPr>
+      </w:pPr>
+      <w:r>
+        <w:rPr>
+          <w:rFonts w:ascii="Segoe UI Light" w:hAnsi="Segoe UI Light" w:cs="Segoe UI Light"/>
+          <w:b/>
+          <w:bCs/>
+        </w:rPr>
+        <w:t>Purpose</w:t>
+      </w:r>
+      <w:r>
+        <w:rPr>
+          <w:rFonts w:ascii="Segoe UI Light" w:hAnsi="Segoe UI Light" w:cs="Segoe UI Light"/>
+        </w:rPr>
+        <w:t xml:space="preserve">: To reach the heart of all listeners. </w:t>
+      </w:r>
+      <w:r>
+        <w:rPr>
+          <w:rFonts w:ascii="Segoe UI Light" w:hAnsi="Segoe UI Light" w:cs="Segoe UI Light"/>
+        </w:rPr>
+        <w:t>To seed doubts and distrust in the hearts of people and move them to disobey Jehovah through his representative.</w:t>
+      </w:r>
+    </w:p>
+    <w:p>
+      <w:pPr>
+        <w:pStyle w:val="ListParagraph"/>
+        <w:ind w:left="1797"/>
+        <w:rPr>
+          <w:rFonts w:ascii="Segoe UI Light" w:hAnsi="Segoe UI Light" w:cs="Segoe UI Light"/>
+        </w:rPr>
+      </w:pPr>
+      <w:r>
+        <w:rPr>
+          <w:rFonts w:ascii="Segoe UI Light" w:hAnsi="Segoe UI Light" w:cs="Segoe UI Light"/>
+        </w:rPr>
+        <w:t>Is it not true that the challenges we face in life at times have the same effect on us?</w:t>
+      </w:r>
+    </w:p>
+    <w:p>
+      <w:pPr>
+        <w:ind w:left="360"/>
+        <w:rPr>
+          <w:rFonts w:ascii="Segoe UI Light" w:hAnsi="Segoe UI Light" w:cs="Segoe UI Light"/>
+        </w:rPr>
+      </w:pPr>
+      <w:r>
+        <w:rPr>
+          <w:rFonts w:ascii="Segoe UI Light" w:hAnsi="Segoe UI Light" w:cs="Segoe UI Light"/>
+        </w:rPr>
+        <w:tab/>
+      </w:r>
+      <w:r>
+        <w:rPr>
+          <w:rFonts w:ascii="Segoe UI Light" w:hAnsi="Segoe UI Light" w:cs="Segoe UI Light"/>
+        </w:rPr>
+        <w:t>What Assyrian-like army are you facing</w:t>
+      </w:r>
+      <w:r>
+        <w:rPr>
+          <w:rFonts w:ascii="Segoe UI Light" w:hAnsi="Segoe UI Light" w:cs="Segoe UI Light"/>
+        </w:rPr>
+        <w:t xml:space="preserve"> in your personal life</w:t>
+      </w:r>
+      <w:r>
+        <w:rPr>
+          <w:rFonts w:ascii="Segoe UI Light" w:hAnsi="Segoe UI Light" w:cs="Segoe UI Light"/>
+        </w:rPr>
+        <w:t>?</w:t>
+      </w:r>
+    </w:p>
+    <w:p>
+      <w:pPr>
+        <w:ind w:left="360"/>
         <w:rPr>
           <w:rFonts w:ascii="Segoe UI Light" w:hAnsi="Segoe UI Light" w:cs="Segoe UI Light"/>
         </w:rPr>
@@ -1491,6 +2077,208 @@
     </w:lvl>
   </w:abstractNum>
   <w:abstractNum w:abstractNumId="3" w15:restartNumberingAfterBreak="0">
+    <w:nsid w:val="1C535D0B"/>
+    <w:multiLevelType w:val="hybridMultilevel"/>
+    <w:tmpl w:val="8A64A996"/>
+    <w:lvl w:ilvl="0" w:tplc="10090003">
+      <w:start w:val="1"/>
+      <w:numFmt w:val="bullet"/>
+      <w:lvlText w:val="o"/>
+      <w:lvlJc w:val="left"/>
+      <w:pPr>
+        <w:ind w:left="2157" w:hanging="360"/>
+      </w:pPr>
+      <w:rPr>
+        <w:rFonts w:ascii="Courier New" w:hAnsi="Courier New" w:cs="Courier New" w:hint="default"/>
+      </w:rPr>
+    </w:lvl>
+    <w:lvl w:ilvl="1" w:tplc="10090003" w:tentative="1">
+      <w:start w:val="1"/>
+      <w:numFmt w:val="bullet"/>
+      <w:lvlText w:val="o"/>
+      <w:lvlJc w:val="left"/>
+      <w:pPr>
+        <w:ind w:left="2877" w:hanging="360"/>
+      </w:pPr>
+      <w:rPr>
+        <w:rFonts w:ascii="Courier New" w:hAnsi="Courier New" w:cs="Courier New" w:hint="default"/>
+      </w:rPr>
+    </w:lvl>
+    <w:lvl w:ilvl="2" w:tplc="10090005" w:tentative="1">
+      <w:start w:val="1"/>
+      <w:numFmt w:val="bullet"/>
+      <w:lvlText w:val=""/>
+      <w:lvlJc w:val="left"/>
+      <w:pPr>
+        <w:ind w:left="3597" w:hanging="360"/>
+      </w:pPr>
+      <w:rPr>
+        <w:rFonts w:ascii="Wingdings" w:hAnsi="Wingdings" w:hint="default"/>
+      </w:rPr>
+    </w:lvl>
+    <w:lvl w:ilvl="3" w:tplc="10090001" w:tentative="1">
+      <w:start w:val="1"/>
+      <w:numFmt w:val="bullet"/>
+      <w:lvlText w:val=""/>
+      <w:lvlJc w:val="left"/>
+      <w:pPr>
+        <w:ind w:left="4317" w:hanging="360"/>
+      </w:pPr>
+      <w:rPr>
+        <w:rFonts w:ascii="Symbol" w:hAnsi="Symbol" w:hint="default"/>
+      </w:rPr>
+    </w:lvl>
+    <w:lvl w:ilvl="4" w:tplc="10090003" w:tentative="1">
+      <w:start w:val="1"/>
+      <w:numFmt w:val="bullet"/>
+      <w:lvlText w:val="o"/>
+      <w:lvlJc w:val="left"/>
+      <w:pPr>
+        <w:ind w:left="5037" w:hanging="360"/>
+      </w:pPr>
+      <w:rPr>
+        <w:rFonts w:ascii="Courier New" w:hAnsi="Courier New" w:cs="Courier New" w:hint="default"/>
+      </w:rPr>
+    </w:lvl>
+    <w:lvl w:ilvl="5" w:tplc="10090005" w:tentative="1">
+      <w:start w:val="1"/>
+      <w:numFmt w:val="bullet"/>
+      <w:lvlText w:val=""/>
+      <w:lvlJc w:val="left"/>
+      <w:pPr>
+        <w:ind w:left="5757" w:hanging="360"/>
+      </w:pPr>
+      <w:rPr>
+        <w:rFonts w:ascii="Wingdings" w:hAnsi="Wingdings" w:hint="default"/>
+      </w:rPr>
+    </w:lvl>
+    <w:lvl w:ilvl="6" w:tplc="10090001" w:tentative="1">
+      <w:start w:val="1"/>
+      <w:numFmt w:val="bullet"/>
+      <w:lvlText w:val=""/>
+      <w:lvlJc w:val="left"/>
+      <w:pPr>
+        <w:ind w:left="6477" w:hanging="360"/>
+      </w:pPr>
+      <w:rPr>
+        <w:rFonts w:ascii="Symbol" w:hAnsi="Symbol" w:hint="default"/>
+      </w:rPr>
+    </w:lvl>
+    <w:lvl w:ilvl="7" w:tplc="10090003" w:tentative="1">
+      <w:start w:val="1"/>
+      <w:numFmt w:val="bullet"/>
+      <w:lvlText w:val="o"/>
+      <w:lvlJc w:val="left"/>
+      <w:pPr>
+        <w:ind w:left="7197" w:hanging="360"/>
+      </w:pPr>
+      <w:rPr>
+        <w:rFonts w:ascii="Courier New" w:hAnsi="Courier New" w:cs="Courier New" w:hint="default"/>
+      </w:rPr>
+    </w:lvl>
+    <w:lvl w:ilvl="8" w:tplc="10090005" w:tentative="1">
+      <w:start w:val="1"/>
+      <w:numFmt w:val="bullet"/>
+      <w:lvlText w:val=""/>
+      <w:lvlJc w:val="left"/>
+      <w:pPr>
+        <w:ind w:left="7917" w:hanging="360"/>
+      </w:pPr>
+      <w:rPr>
+        <w:rFonts w:ascii="Wingdings" w:hAnsi="Wingdings" w:hint="default"/>
+      </w:rPr>
+    </w:lvl>
+  </w:abstractNum>
+  <w:abstractNum w:abstractNumId="4" w15:restartNumberingAfterBreak="0">
+    <w:nsid w:val="249F2707"/>
+    <w:multiLevelType w:val="hybridMultilevel"/>
+    <w:tmpl w:val="6A048F76"/>
+    <w:lvl w:ilvl="0" w:tplc="70B44460">
+      <w:start w:val="2"/>
+      <w:numFmt w:val="decimal"/>
+      <w:lvlText w:val="%1"/>
+      <w:lvlJc w:val="left"/>
+      <w:pPr>
+        <w:ind w:left="1080" w:hanging="360"/>
+      </w:pPr>
+      <w:rPr>
+        <w:rFonts w:hint="default"/>
+      </w:rPr>
+    </w:lvl>
+    <w:lvl w:ilvl="1" w:tplc="10090019" w:tentative="1">
+      <w:start w:val="1"/>
+      <w:numFmt w:val="lowerLetter"/>
+      <w:lvlText w:val="%2."/>
+      <w:lvlJc w:val="left"/>
+      <w:pPr>
+        <w:ind w:left="1800" w:hanging="360"/>
+      </w:pPr>
+    </w:lvl>
+    <w:lvl w:ilvl="2" w:tplc="1009001B" w:tentative="1">
+      <w:start w:val="1"/>
+      <w:numFmt w:val="lowerRoman"/>
+      <w:lvlText w:val="%3."/>
+      <w:lvlJc w:val="right"/>
+      <w:pPr>
+        <w:ind w:left="2520" w:hanging="180"/>
+      </w:pPr>
+    </w:lvl>
+    <w:lvl w:ilvl="3" w:tplc="1009000F" w:tentative="1">
+      <w:start w:val="1"/>
+      <w:numFmt w:val="decimal"/>
+      <w:lvlText w:val="%4."/>
+      <w:lvlJc w:val="left"/>
+      <w:pPr>
+        <w:ind w:left="3240" w:hanging="360"/>
+      </w:pPr>
+    </w:lvl>
+    <w:lvl w:ilvl="4" w:tplc="10090019" w:tentative="1">
+      <w:start w:val="1"/>
+      <w:numFmt w:val="lowerLetter"/>
+      <w:lvlText w:val="%5."/>
+      <w:lvlJc w:val="left"/>
+      <w:pPr>
+        <w:ind w:left="3960" w:hanging="360"/>
+      </w:pPr>
+    </w:lvl>
+    <w:lvl w:ilvl="5" w:tplc="1009001B" w:tentative="1">
+      <w:start w:val="1"/>
+      <w:numFmt w:val="lowerRoman"/>
+      <w:lvlText w:val="%6."/>
+      <w:lvlJc w:val="right"/>
+      <w:pPr>
+        <w:ind w:left="4680" w:hanging="180"/>
+      </w:pPr>
+    </w:lvl>
+    <w:lvl w:ilvl="6" w:tplc="1009000F" w:tentative="1">
+      <w:start w:val="1"/>
+      <w:numFmt w:val="decimal"/>
+      <w:lvlText w:val="%7."/>
+      <w:lvlJc w:val="left"/>
+      <w:pPr>
+        <w:ind w:left="5400" w:hanging="360"/>
+      </w:pPr>
+    </w:lvl>
+    <w:lvl w:ilvl="7" w:tplc="10090019" w:tentative="1">
+      <w:start w:val="1"/>
+      <w:numFmt w:val="lowerLetter"/>
+      <w:lvlText w:val="%8."/>
+      <w:lvlJc w:val="left"/>
+      <w:pPr>
+        <w:ind w:left="6120" w:hanging="360"/>
+      </w:pPr>
+    </w:lvl>
+    <w:lvl w:ilvl="8" w:tplc="1009001B" w:tentative="1">
+      <w:start w:val="1"/>
+      <w:numFmt w:val="lowerRoman"/>
+      <w:lvlText w:val="%9."/>
+      <w:lvlJc w:val="right"/>
+      <w:pPr>
+        <w:ind w:left="6840" w:hanging="180"/>
+      </w:pPr>
+    </w:lvl>
+  </w:abstractNum>
+  <w:abstractNum w:abstractNumId="5" w15:restartNumberingAfterBreak="0">
     <w:nsid w:val="24A80059"/>
     <w:multiLevelType w:val="hybridMultilevel"/>
     <w:tmpl w:val="11B24C7E"/>
@@ -1603,7 +2391,7 @@
       </w:rPr>
     </w:lvl>
   </w:abstractNum>
-  <w:abstractNum w:abstractNumId="4" w15:restartNumberingAfterBreak="0">
+  <w:abstractNum w:abstractNumId="6" w15:restartNumberingAfterBreak="0">
     <w:nsid w:val="29F30EFE"/>
     <w:multiLevelType w:val="hybridMultilevel"/>
     <w:tmpl w:val="8D849220"/>
@@ -1716,7 +2504,120 @@
       </w:rPr>
     </w:lvl>
   </w:abstractNum>
-  <w:abstractNum w:abstractNumId="5" w15:restartNumberingAfterBreak="0">
+  <w:abstractNum w:abstractNumId="7" w15:restartNumberingAfterBreak="0">
+    <w:nsid w:val="307F4271"/>
+    <w:multiLevelType w:val="hybridMultilevel"/>
+    <w:tmpl w:val="6650950A"/>
+    <w:lvl w:ilvl="0" w:tplc="FFFFFFFF">
+      <w:start w:val="1"/>
+      <w:numFmt w:val="bullet"/>
+      <w:lvlText w:val=""/>
+      <w:lvlJc w:val="left"/>
+      <w:pPr>
+        <w:ind w:left="1440" w:hanging="360"/>
+      </w:pPr>
+      <w:rPr>
+        <w:rFonts w:ascii="Wingdings" w:hAnsi="Wingdings" w:hint="default"/>
+      </w:rPr>
+    </w:lvl>
+    <w:lvl w:ilvl="1" w:tplc="FFFFFFFF">
+      <w:start w:val="1"/>
+      <w:numFmt w:val="bullet"/>
+      <w:lvlText w:val="o"/>
+      <w:lvlJc w:val="left"/>
+      <w:pPr>
+        <w:ind w:left="2160" w:hanging="360"/>
+      </w:pPr>
+      <w:rPr>
+        <w:rFonts w:ascii="Courier New" w:hAnsi="Courier New" w:cs="Courier New" w:hint="default"/>
+      </w:rPr>
+    </w:lvl>
+    <w:lvl w:ilvl="2" w:tplc="10090003">
+      <w:start w:val="1"/>
+      <w:numFmt w:val="bullet"/>
+      <w:lvlText w:val="o"/>
+      <w:lvlJc w:val="left"/>
+      <w:pPr>
+        <w:ind w:left="2160" w:hanging="360"/>
+      </w:pPr>
+      <w:rPr>
+        <w:rFonts w:ascii="Courier New" w:hAnsi="Courier New" w:cs="Courier New" w:hint="default"/>
+      </w:rPr>
+    </w:lvl>
+    <w:lvl w:ilvl="3" w:tplc="FFFFFFFF">
+      <w:start w:val="1"/>
+      <w:numFmt w:val="bullet"/>
+      <w:lvlText w:val=""/>
+      <w:lvlJc w:val="left"/>
+      <w:pPr>
+        <w:ind w:left="3600" w:hanging="360"/>
+      </w:pPr>
+      <w:rPr>
+        <w:rFonts w:ascii="Symbol" w:hAnsi="Symbol" w:hint="default"/>
+      </w:rPr>
+    </w:lvl>
+    <w:lvl w:ilvl="4" w:tplc="FFFFFFFF" w:tentative="1">
+      <w:start w:val="1"/>
+      <w:numFmt w:val="bullet"/>
+      <w:lvlText w:val="o"/>
+      <w:lvlJc w:val="left"/>
+      <w:pPr>
+        <w:ind w:left="4320" w:hanging="360"/>
+      </w:pPr>
+      <w:rPr>
+        <w:rFonts w:ascii="Courier New" w:hAnsi="Courier New" w:cs="Courier New" w:hint="default"/>
+      </w:rPr>
+    </w:lvl>
+    <w:lvl w:ilvl="5" w:tplc="FFFFFFFF" w:tentative="1">
+      <w:start w:val="1"/>
+      <w:numFmt w:val="bullet"/>
+      <w:lvlText w:val=""/>
+      <w:lvlJc w:val="left"/>
+      <w:pPr>
+        <w:ind w:left="5040" w:hanging="360"/>
+      </w:pPr>
+      <w:rPr>
+        <w:rFonts w:ascii="Wingdings" w:hAnsi="Wingdings" w:hint="default"/>
+      </w:rPr>
+    </w:lvl>
+    <w:lvl w:ilvl="6" w:tplc="FFFFFFFF" w:tentative="1">
+      <w:start w:val="1"/>
+      <w:numFmt w:val="bullet"/>
+      <w:lvlText w:val=""/>
+      <w:lvlJc w:val="left"/>
+      <w:pPr>
+        <w:ind w:left="5760" w:hanging="360"/>
+      </w:pPr>
+      <w:rPr>
+        <w:rFonts w:ascii="Symbol" w:hAnsi="Symbol" w:hint="default"/>
+      </w:rPr>
+    </w:lvl>
+    <w:lvl w:ilvl="7" w:tplc="FFFFFFFF" w:tentative="1">
+      <w:start w:val="1"/>
+      <w:numFmt w:val="bullet"/>
+      <w:lvlText w:val="o"/>
+      <w:lvlJc w:val="left"/>
+      <w:pPr>
+        <w:ind w:left="6480" w:hanging="360"/>
+      </w:pPr>
+      <w:rPr>
+        <w:rFonts w:ascii="Courier New" w:hAnsi="Courier New" w:cs="Courier New" w:hint="default"/>
+      </w:rPr>
+    </w:lvl>
+    <w:lvl w:ilvl="8" w:tplc="FFFFFFFF" w:tentative="1">
+      <w:start w:val="1"/>
+      <w:numFmt w:val="bullet"/>
+      <w:lvlText w:val=""/>
+      <w:lvlJc w:val="left"/>
+      <w:pPr>
+        <w:ind w:left="7200" w:hanging="360"/>
+      </w:pPr>
+      <w:rPr>
+        <w:rFonts w:ascii="Wingdings" w:hAnsi="Wingdings" w:hint="default"/>
+      </w:rPr>
+    </w:lvl>
+  </w:abstractNum>
+  <w:abstractNum w:abstractNumId="8" w15:restartNumberingAfterBreak="0">
     <w:nsid w:val="3E4E7E1D"/>
     <w:multiLevelType w:val="hybridMultilevel"/>
     <w:tmpl w:val="C4183DF8"/>
@@ -1829,7 +2730,7 @@
       </w:rPr>
     </w:lvl>
   </w:abstractNum>
-  <w:abstractNum w:abstractNumId="6" w15:restartNumberingAfterBreak="0">
+  <w:abstractNum w:abstractNumId="9" w15:restartNumberingAfterBreak="0">
     <w:nsid w:val="3EC24676"/>
     <w:multiLevelType w:val="hybridMultilevel"/>
     <w:tmpl w:val="AD10C83C"/>
@@ -1915,7 +2816,7 @@
       </w:pPr>
     </w:lvl>
   </w:abstractNum>
-  <w:abstractNum w:abstractNumId="7" w15:restartNumberingAfterBreak="0">
+  <w:abstractNum w:abstractNumId="10" w15:restartNumberingAfterBreak="0">
     <w:nsid w:val="69010C8B"/>
     <w:multiLevelType w:val="hybridMultilevel"/>
     <w:tmpl w:val="AB9ACF8C"/>
@@ -2028,7 +2929,7 @@
       </w:rPr>
     </w:lvl>
   </w:abstractNum>
-  <w:abstractNum w:abstractNumId="8" w15:restartNumberingAfterBreak="0">
+  <w:abstractNum w:abstractNumId="11" w15:restartNumberingAfterBreak="0">
     <w:nsid w:val="72236AAD"/>
     <w:multiLevelType w:val="hybridMultilevel"/>
     <w:tmpl w:val="1FF8BAB6"/>
@@ -2141,7 +3042,120 @@
       </w:rPr>
     </w:lvl>
   </w:abstractNum>
-  <w:abstractNum w:abstractNumId="9" w15:restartNumberingAfterBreak="0">
+  <w:abstractNum w:abstractNumId="12" w15:restartNumberingAfterBreak="0">
+    <w:nsid w:val="74CF7FBC"/>
+    <w:multiLevelType w:val="hybridMultilevel"/>
+    <w:tmpl w:val="454E1412"/>
+    <w:lvl w:ilvl="0" w:tplc="10090005">
+      <w:start w:val="1"/>
+      <w:numFmt w:val="bullet"/>
+      <w:lvlText w:val=""/>
+      <w:lvlJc w:val="left"/>
+      <w:pPr>
+        <w:ind w:left="1440" w:hanging="360"/>
+      </w:pPr>
+      <w:rPr>
+        <w:rFonts w:ascii="Wingdings" w:hAnsi="Wingdings" w:hint="default"/>
+      </w:rPr>
+    </w:lvl>
+    <w:lvl w:ilvl="1" w:tplc="10090003">
+      <w:start w:val="1"/>
+      <w:numFmt w:val="bullet"/>
+      <w:lvlText w:val="o"/>
+      <w:lvlJc w:val="left"/>
+      <w:pPr>
+        <w:ind w:left="2160" w:hanging="360"/>
+      </w:pPr>
+      <w:rPr>
+        <w:rFonts w:ascii="Courier New" w:hAnsi="Courier New" w:cs="Courier New" w:hint="default"/>
+      </w:rPr>
+    </w:lvl>
+    <w:lvl w:ilvl="2" w:tplc="10090005">
+      <w:start w:val="1"/>
+      <w:numFmt w:val="bullet"/>
+      <w:lvlText w:val=""/>
+      <w:lvlJc w:val="left"/>
+      <w:pPr>
+        <w:ind w:left="2880" w:hanging="360"/>
+      </w:pPr>
+      <w:rPr>
+        <w:rFonts w:ascii="Wingdings" w:hAnsi="Wingdings" w:hint="default"/>
+      </w:rPr>
+    </w:lvl>
+    <w:lvl w:ilvl="3" w:tplc="10090001" w:tentative="1">
+      <w:start w:val="1"/>
+      <w:numFmt w:val="bullet"/>
+      <w:lvlText w:val=""/>
+      <w:lvlJc w:val="left"/>
+      <w:pPr>
+        <w:ind w:left="3600" w:hanging="360"/>
+      </w:pPr>
+      <w:rPr>
+        <w:rFonts w:ascii="Symbol" w:hAnsi="Symbol" w:hint="default"/>
+      </w:rPr>
+    </w:lvl>
+    <w:lvl w:ilvl="4" w:tplc="10090003" w:tentative="1">
+      <w:start w:val="1"/>
+      <w:numFmt w:val="bullet"/>
+      <w:lvlText w:val="o"/>
+      <w:lvlJc w:val="left"/>
+      <w:pPr>
+        <w:ind w:left="4320" w:hanging="360"/>
+      </w:pPr>
+      <w:rPr>
+        <w:rFonts w:ascii="Courier New" w:hAnsi="Courier New" w:cs="Courier New" w:hint="default"/>
+      </w:rPr>
+    </w:lvl>
+    <w:lvl w:ilvl="5" w:tplc="10090005" w:tentative="1">
+      <w:start w:val="1"/>
+      <w:numFmt w:val="bullet"/>
+      <w:lvlText w:val=""/>
+      <w:lvlJc w:val="left"/>
+      <w:pPr>
+        <w:ind w:left="5040" w:hanging="360"/>
+      </w:pPr>
+      <w:rPr>
+        <w:rFonts w:ascii="Wingdings" w:hAnsi="Wingdings" w:hint="default"/>
+      </w:rPr>
+    </w:lvl>
+    <w:lvl w:ilvl="6" w:tplc="10090001" w:tentative="1">
+      <w:start w:val="1"/>
+      <w:numFmt w:val="bullet"/>
+      <w:lvlText w:val=""/>
+      <w:lvlJc w:val="left"/>
+      <w:pPr>
+        <w:ind w:left="5760" w:hanging="360"/>
+      </w:pPr>
+      <w:rPr>
+        <w:rFonts w:ascii="Symbol" w:hAnsi="Symbol" w:hint="default"/>
+      </w:rPr>
+    </w:lvl>
+    <w:lvl w:ilvl="7" w:tplc="10090003" w:tentative="1">
+      <w:start w:val="1"/>
+      <w:numFmt w:val="bullet"/>
+      <w:lvlText w:val="o"/>
+      <w:lvlJc w:val="left"/>
+      <w:pPr>
+        <w:ind w:left="6480" w:hanging="360"/>
+      </w:pPr>
+      <w:rPr>
+        <w:rFonts w:ascii="Courier New" w:hAnsi="Courier New" w:cs="Courier New" w:hint="default"/>
+      </w:rPr>
+    </w:lvl>
+    <w:lvl w:ilvl="8" w:tplc="10090005" w:tentative="1">
+      <w:start w:val="1"/>
+      <w:numFmt w:val="bullet"/>
+      <w:lvlText w:val=""/>
+      <w:lvlJc w:val="left"/>
+      <w:pPr>
+        <w:ind w:left="7200" w:hanging="360"/>
+      </w:pPr>
+      <w:rPr>
+        <w:rFonts w:ascii="Wingdings" w:hAnsi="Wingdings" w:hint="default"/>
+      </w:rPr>
+    </w:lvl>
+  </w:abstractNum>
+  <w:abstractNum w:abstractNumId="13" w15:restartNumberingAfterBreak="0">
     <w:nsid w:val="754071D0"/>
     <w:multiLevelType w:val="hybridMultilevel"/>
     <w:tmpl w:val="3698CDEC"/>
@@ -2227,7 +3241,7 @@
       </w:pPr>
     </w:lvl>
   </w:abstractNum>
-  <w:abstractNum w:abstractNumId="10" w15:restartNumberingAfterBreak="0">
+  <w:abstractNum w:abstractNumId="14" w15:restartNumberingAfterBreak="0">
     <w:nsid w:val="7F6C1CAC"/>
     <w:multiLevelType w:val="hybridMultilevel"/>
     <w:tmpl w:val="4E3EFFE6"/>
@@ -2341,37 +3355,49 @@
     </w:lvl>
   </w:abstractNum>
   <w:num w:numId="1" w16cid:durableId="1200126119">
-    <w:abstractNumId w:val="8"/>
+    <w:abstractNumId w:val="11"/>
   </w:num>
   <w:num w:numId="2" w16cid:durableId="2142964796">
     <w:abstractNumId w:val="1"/>
   </w:num>
   <w:num w:numId="3" w16cid:durableId="1686126829">
+    <w:abstractNumId w:val="13"/>
+  </w:num>
+  <w:num w:numId="4" w16cid:durableId="9256738">
     <w:abstractNumId w:val="9"/>
   </w:num>
-  <w:num w:numId="4" w16cid:durableId="9256738">
-    <w:abstractNumId w:val="6"/>
-  </w:num>
   <w:num w:numId="5" w16cid:durableId="1929270298">
-    <w:abstractNumId w:val="3"/>
+    <w:abstractNumId w:val="5"/>
   </w:num>
   <w:num w:numId="6" w16cid:durableId="1283686131">
     <w:abstractNumId w:val="0"/>
   </w:num>
   <w:num w:numId="7" w16cid:durableId="1973510224">
-    <w:abstractNumId w:val="4"/>
+    <w:abstractNumId w:val="6"/>
   </w:num>
   <w:num w:numId="8" w16cid:durableId="1322386662">
     <w:abstractNumId w:val="2"/>
   </w:num>
   <w:num w:numId="9" w16cid:durableId="1623069594">
-    <w:abstractNumId w:val="5"/>
+    <w:abstractNumId w:val="8"/>
   </w:num>
   <w:num w:numId="10" w16cid:durableId="389547150">
-    <w:abstractNumId w:val="7"/>
+    <w:abstractNumId w:val="10"/>
   </w:num>
   <w:num w:numId="11" w16cid:durableId="258147424">
-    <w:abstractNumId w:val="10"/>
+    <w:abstractNumId w:val="14"/>
+  </w:num>
+  <w:num w:numId="12" w16cid:durableId="1740980150">
+    <w:abstractNumId w:val="12"/>
+  </w:num>
+  <w:num w:numId="13" w16cid:durableId="1889342876">
+    <w:abstractNumId w:val="4"/>
+  </w:num>
+  <w:num w:numId="14" w16cid:durableId="253057507">
+    <w:abstractNumId w:val="3"/>
+  </w:num>
+  <w:num w:numId="15" w16cid:durableId="484205992">
+    <w:abstractNumId w:val="7"/>
   </w:num>
 </w:numbering>
 </file>

</xml_diff>

<commit_message>
started 2 kings 19:15-19
</commit_message>
<xml_diff>
--- a/Public Talks/No 147/No 147.docx
+++ b/Public Talks/No 147/No 147.docx
@@ -938,17 +938,21 @@
     </w:p>
     <w:p>
       <w:pPr>
-        <w:pStyle w:val="ListParagraph"/>
-        <w:numPr>
-          <w:ilvl w:val="0"/>
-          <w:numId w:val="13"/>
-        </w:numPr>
+        <w:ind w:left="720"/>
         <w:rPr>
           <w:rFonts w:ascii="Segoe UI Light" w:hAnsi="Segoe UI Light" w:cs="Segoe UI Light"/>
           <w:b/>
           <w:bCs/>
         </w:rPr>
       </w:pPr>
+      <w:r>
+        <w:rPr>
+          <w:rFonts w:ascii="Segoe UI Light" w:hAnsi="Segoe UI Light" w:cs="Segoe UI Light"/>
+          <w:b/>
+          <w:bCs/>
+        </w:rPr>
+        <w:t xml:space="preserve">2 </w:t>
+      </w:r>
       <w:r>
         <w:rPr>
           <w:rFonts w:ascii="Segoe UI Light" w:hAnsi="Segoe UI Light" w:cs="Segoe UI Light"/>
@@ -1041,16 +1045,14 @@
         <w:ind w:left="1800"/>
         <w:rPr>
           <w:rFonts w:ascii="Segoe UI Light" w:hAnsi="Segoe UI Light" w:cs="Segoe UI Light"/>
+        </w:rPr>
+      </w:pPr>
+      <w:r>
+        <w:rPr>
+          <w:rFonts w:ascii="Segoe UI Light" w:hAnsi="Segoe UI Light" w:cs="Segoe UI Light"/>
           <w:b/>
           <w:bCs/>
         </w:rPr>
-      </w:pPr>
-      <w:r>
-        <w:rPr>
-          <w:rFonts w:ascii="Segoe UI Light" w:hAnsi="Segoe UI Light" w:cs="Segoe UI Light"/>
-          <w:b/>
-          <w:bCs/>
-        </w:rPr>
         <w:t>Purpose</w:t>
       </w:r>
       <w:r>
@@ -1088,6 +1090,29 @@
           <w:rFonts w:ascii="Segoe UI Light" w:hAnsi="Segoe UI Light" w:cs="Segoe UI Light"/>
         </w:rPr>
         <w:t>s and create division among the people</w:t>
+      </w:r>
+      <w:r>
+        <w:rPr>
+          <w:rFonts w:ascii="Segoe UI Light" w:hAnsi="Segoe UI Light" w:cs="Segoe UI Light"/>
+        </w:rPr>
+        <w:t>.</w:t>
+      </w:r>
+    </w:p>
+    <w:p>
+      <w:pPr>
+        <w:pStyle w:val="ListParagraph"/>
+        <w:ind w:left="2160"/>
+        <w:rPr>
+          <w:rFonts w:ascii="Segoe UI Light" w:hAnsi="Segoe UI Light" w:cs="Segoe UI Light"/>
+          <w:color w:val="EE0000"/>
+        </w:rPr>
+      </w:pPr>
+      <w:r>
+        <w:rPr>
+          <w:rFonts w:ascii="Segoe UI Light" w:hAnsi="Segoe UI Light" w:cs="Segoe UI Light"/>
+          <w:color w:val="EE0000"/>
+        </w:rPr>
+        <w:t>Do we face similar threat today?</w:t>
       </w:r>
     </w:p>
     <w:p>
@@ -1097,6 +1122,7 @@
           <w:ilvl w:val="2"/>
           <w:numId w:val="15"/>
         </w:numPr>
+        <w:ind w:left="2512" w:hanging="357"/>
         <w:rPr>
           <w:rFonts w:ascii="Segoe UI Light" w:hAnsi="Segoe UI Light" w:cs="Segoe UI Light"/>
           <w:b/>
@@ -1123,6 +1149,7 @@
           <w:ilvl w:val="2"/>
           <w:numId w:val="15"/>
         </w:numPr>
+        <w:ind w:left="2512" w:hanging="357"/>
         <w:rPr>
           <w:rFonts w:ascii="Segoe UI Light" w:hAnsi="Segoe UI Light" w:cs="Segoe UI Light"/>
           <w:b/>
@@ -1143,6 +1170,7 @@
           <w:ilvl w:val="2"/>
           <w:numId w:val="15"/>
         </w:numPr>
+        <w:ind w:left="2512" w:hanging="357"/>
         <w:rPr>
           <w:rFonts w:ascii="Segoe UI Light" w:hAnsi="Segoe UI Light" w:cs="Segoe UI Light"/>
           <w:b/>
@@ -1204,7 +1232,7 @@
     <w:p>
       <w:pPr>
         <w:pStyle w:val="ListParagraph"/>
-        <w:ind w:left="1797"/>
+        <w:ind w:left="2517" w:hanging="720"/>
         <w:rPr>
           <w:rFonts w:ascii="Segoe UI Light" w:hAnsi="Segoe UI Light" w:cs="Segoe UI Light"/>
         </w:rPr>
@@ -1234,6 +1262,23 @@
           <w:rFonts w:ascii="Segoe UI Light" w:hAnsi="Segoe UI Light" w:cs="Segoe UI Light"/>
         </w:rPr>
         <w:t>.</w:t>
+      </w:r>
+    </w:p>
+    <w:p>
+      <w:pPr>
+        <w:pStyle w:val="ListParagraph"/>
+        <w:ind w:left="2160"/>
+        <w:rPr>
+          <w:rFonts w:ascii="Segoe UI Light" w:hAnsi="Segoe UI Light" w:cs="Segoe UI Light"/>
+          <w:color w:val="EE0000"/>
+        </w:rPr>
+      </w:pPr>
+      <w:r>
+        <w:rPr>
+          <w:rFonts w:ascii="Segoe UI Light" w:hAnsi="Segoe UI Light" w:cs="Segoe UI Light"/>
+          <w:color w:val="EE0000"/>
+        </w:rPr>
+        <w:t>Do we face similar threat today?</w:t>
       </w:r>
     </w:p>
     <w:p>
@@ -1371,43 +1416,19 @@
     <w:p>
       <w:pPr>
         <w:pStyle w:val="ListParagraph"/>
-        <w:numPr>
-          <w:ilvl w:val="1"/>
-          <w:numId w:val="12"/>
-        </w:numPr>
-        <w:rPr>
-          <w:rFonts w:ascii="Segoe UI Light" w:hAnsi="Segoe UI Light" w:cs="Segoe UI Light"/>
-        </w:rPr>
-      </w:pPr>
-      <w:r>
-        <w:rPr>
-          <w:rFonts w:ascii="Segoe UI Light" w:hAnsi="Segoe UI Light" w:cs="Segoe UI Light"/>
-        </w:rPr>
-        <w:t>Philosoph</w:t>
-      </w:r>
-      <w:r>
-        <w:rPr>
-          <w:rFonts w:ascii="Segoe UI Light" w:hAnsi="Segoe UI Light" w:cs="Segoe UI Light"/>
-        </w:rPr>
-        <w:t>ies</w:t>
-      </w:r>
-      <w:r>
-        <w:rPr>
-          <w:rFonts w:ascii="Segoe UI Light" w:hAnsi="Segoe UI Light" w:cs="Segoe UI Light"/>
-        </w:rPr>
-        <w:t xml:space="preserve"> </w:t>
-      </w:r>
-      <w:r>
-        <w:rPr>
-          <w:rFonts w:ascii="Segoe UI Light" w:hAnsi="Segoe UI Light" w:cs="Segoe UI Light"/>
-        </w:rPr>
-        <w:t>and theories of this world</w:t>
-      </w:r>
-      <w:r>
-        <w:rPr>
-          <w:rFonts w:ascii="Segoe UI Light" w:hAnsi="Segoe UI Light" w:cs="Segoe UI Light"/>
-        </w:rPr>
-        <w:t>. They go as far as questioning the very existence of God.</w:t>
+        <w:ind w:left="2160"/>
+        <w:rPr>
+          <w:rFonts w:ascii="Segoe UI Light" w:hAnsi="Segoe UI Light" w:cs="Segoe UI Light"/>
+          <w:color w:val="EE0000"/>
+        </w:rPr>
+      </w:pPr>
+      <w:r>
+        <w:rPr>
+          <w:rFonts w:ascii="Segoe UI Light" w:hAnsi="Segoe UI Light" w:cs="Segoe UI Light"/>
+          <w:color w:val="EE0000"/>
+        </w:rPr>
+        <w:lastRenderedPageBreak/>
+        <w:t>Do we face similar threat today?</w:t>
       </w:r>
     </w:p>
     <w:p>
@@ -1417,15 +1438,58 @@
           <w:ilvl w:val="1"/>
           <w:numId w:val="12"/>
         </w:numPr>
-        <w:rPr>
-          <w:rFonts w:ascii="Segoe UI Light" w:hAnsi="Segoe UI Light" w:cs="Segoe UI Light"/>
-        </w:rPr>
-      </w:pPr>
-      <w:r>
-        <w:rPr>
-          <w:rFonts w:ascii="Segoe UI Light" w:hAnsi="Segoe UI Light" w:cs="Segoe UI Light"/>
-        </w:rPr>
-        <w:lastRenderedPageBreak/>
+        <w:ind w:left="2512" w:hanging="357"/>
+        <w:rPr>
+          <w:rFonts w:ascii="Segoe UI Light" w:hAnsi="Segoe UI Light" w:cs="Segoe UI Light"/>
+        </w:rPr>
+      </w:pPr>
+      <w:r>
+        <w:rPr>
+          <w:rFonts w:ascii="Segoe UI Light" w:hAnsi="Segoe UI Light" w:cs="Segoe UI Light"/>
+        </w:rPr>
+        <w:t>Philosoph</w:t>
+      </w:r>
+      <w:r>
+        <w:rPr>
+          <w:rFonts w:ascii="Segoe UI Light" w:hAnsi="Segoe UI Light" w:cs="Segoe UI Light"/>
+        </w:rPr>
+        <w:t>ies</w:t>
+      </w:r>
+      <w:r>
+        <w:rPr>
+          <w:rFonts w:ascii="Segoe UI Light" w:hAnsi="Segoe UI Light" w:cs="Segoe UI Light"/>
+        </w:rPr>
+        <w:t xml:space="preserve"> </w:t>
+      </w:r>
+      <w:r>
+        <w:rPr>
+          <w:rFonts w:ascii="Segoe UI Light" w:hAnsi="Segoe UI Light" w:cs="Segoe UI Light"/>
+        </w:rPr>
+        <w:t>and theories of this world</w:t>
+      </w:r>
+      <w:r>
+        <w:rPr>
+          <w:rFonts w:ascii="Segoe UI Light" w:hAnsi="Segoe UI Light" w:cs="Segoe UI Light"/>
+        </w:rPr>
+        <w:t>. They go as far as questioning the very existence of God.</w:t>
+      </w:r>
+    </w:p>
+    <w:p>
+      <w:pPr>
+        <w:pStyle w:val="ListParagraph"/>
+        <w:numPr>
+          <w:ilvl w:val="1"/>
+          <w:numId w:val="12"/>
+        </w:numPr>
+        <w:ind w:left="2512" w:hanging="357"/>
+        <w:rPr>
+          <w:rFonts w:ascii="Segoe UI Light" w:hAnsi="Segoe UI Light" w:cs="Segoe UI Light"/>
+        </w:rPr>
+      </w:pPr>
+      <w:r>
+        <w:rPr>
+          <w:rFonts w:ascii="Segoe UI Light" w:hAnsi="Segoe UI Light" w:cs="Segoe UI Light"/>
+        </w:rPr>
         <w:t>Will Jehovah actually provide what I need if I put Kingdom interest first? Or should I take matters in my own hands?</w:t>
       </w:r>
     </w:p>
@@ -1454,7 +1518,19 @@
         <w:rPr>
           <w:rFonts w:ascii="Segoe UI Light" w:hAnsi="Segoe UI Light" w:cs="Segoe UI Light"/>
         </w:rPr>
-        <w:t xml:space="preserve"> They spoke in the Hebrew language and not in the </w:t>
+        <w:t xml:space="preserve"> The</w:t>
+      </w:r>
+      <w:r>
+        <w:rPr>
+          <w:rFonts w:ascii="Segoe UI Light" w:hAnsi="Segoe UI Light" w:cs="Segoe UI Light"/>
+        </w:rPr>
+        <w:t xml:space="preserve"> Rabshakeh</w:t>
+      </w:r>
+      <w:r>
+        <w:rPr>
+          <w:rFonts w:ascii="Segoe UI Light" w:hAnsi="Segoe UI Light" w:cs="Segoe UI Light"/>
+        </w:rPr>
+        <w:t xml:space="preserve"> spoke in the Hebrew language and not in the </w:t>
       </w:r>
       <w:r>
         <w:rPr>
@@ -1506,55 +1582,280 @@
         <w:rPr>
           <w:rFonts w:ascii="Segoe UI Light" w:hAnsi="Segoe UI Light" w:cs="Segoe UI Light"/>
         </w:rPr>
-        <w:t>To seed doubts and distrust in the hearts of people and move them to disobey Jehovah through his representative.</w:t>
+        <w:t>To seed doubts and distrust in the hearts of people and move them to disobey Jehovah through his representative</w:t>
+      </w:r>
+      <w:r>
+        <w:rPr>
+          <w:rFonts w:ascii="Segoe UI Light" w:hAnsi="Segoe UI Light" w:cs="Segoe UI Light"/>
+        </w:rPr>
+        <w:t>s</w:t>
+      </w:r>
+      <w:r>
+        <w:rPr>
+          <w:rFonts w:ascii="Segoe UI Light" w:hAnsi="Segoe UI Light" w:cs="Segoe UI Light"/>
+        </w:rPr>
+        <w:t>.</w:t>
       </w:r>
     </w:p>
     <w:p>
       <w:pPr>
         <w:pStyle w:val="ListParagraph"/>
-        <w:ind w:left="1797"/>
-        <w:rPr>
-          <w:rFonts w:ascii="Segoe UI Light" w:hAnsi="Segoe UI Light" w:cs="Segoe UI Light"/>
-        </w:rPr>
-      </w:pPr>
-      <w:r>
-        <w:rPr>
-          <w:rFonts w:ascii="Segoe UI Light" w:hAnsi="Segoe UI Light" w:cs="Segoe UI Light"/>
-        </w:rPr>
-        <w:t>Is it not true that the challenges we face in life at times have the same effect on us?</w:t>
-      </w:r>
-    </w:p>
-    <w:p>
-      <w:pPr>
-        <w:ind w:left="360"/>
-        <w:rPr>
-          <w:rFonts w:ascii="Segoe UI Light" w:hAnsi="Segoe UI Light" w:cs="Segoe UI Light"/>
-        </w:rPr>
-      </w:pPr>
-      <w:r>
-        <w:rPr>
-          <w:rFonts w:ascii="Segoe UI Light" w:hAnsi="Segoe UI Light" w:cs="Segoe UI Light"/>
-        </w:rPr>
-        <w:tab/>
-      </w:r>
-      <w:r>
-        <w:rPr>
-          <w:rFonts w:ascii="Segoe UI Light" w:hAnsi="Segoe UI Light" w:cs="Segoe UI Light"/>
-        </w:rPr>
-        <w:t>What Assyrian-like army are you facing</w:t>
-      </w:r>
-      <w:r>
-        <w:rPr>
-          <w:rFonts w:ascii="Segoe UI Light" w:hAnsi="Segoe UI Light" w:cs="Segoe UI Light"/>
-        </w:rPr>
-        <w:t xml:space="preserve"> in your personal life</w:t>
-      </w:r>
-      <w:r>
-        <w:rPr>
-          <w:rFonts w:ascii="Segoe UI Light" w:hAnsi="Segoe UI Light" w:cs="Segoe UI Light"/>
+        <w:ind w:left="2517" w:hanging="720"/>
+        <w:rPr>
+          <w:rFonts w:ascii="Segoe UI Light" w:hAnsi="Segoe UI Light" w:cs="Segoe UI Light"/>
+          <w:i/>
+          <w:iCs/>
+          <w:color w:val="C00000"/>
+        </w:rPr>
+      </w:pPr>
+      <w:r>
+        <w:rPr>
+          <w:rFonts w:ascii="Segoe UI Light" w:hAnsi="Segoe UI Light" w:cs="Segoe UI Light"/>
+          <w:i/>
+          <w:iCs/>
+          <w:color w:val="C00000"/>
+        </w:rPr>
+        <w:t xml:space="preserve">Is it not true that the challenges we face in life at times have the same effect on </w:t>
+      </w:r>
+      <w:r>
+        <w:rPr>
+          <w:rFonts w:ascii="Segoe UI Light" w:hAnsi="Segoe UI Light" w:cs="Segoe UI Light"/>
+          <w:i/>
+          <w:iCs/>
+          <w:color w:val="C00000"/>
+        </w:rPr>
+        <w:t>our own hearts</w:t>
+      </w:r>
+      <w:r>
+        <w:rPr>
+          <w:rFonts w:ascii="Segoe UI Light" w:hAnsi="Segoe UI Light" w:cs="Segoe UI Light"/>
+          <w:i/>
+          <w:iCs/>
+          <w:color w:val="C00000"/>
         </w:rPr>
         <w:t>?</w:t>
       </w:r>
+    </w:p>
+    <w:p>
+      <w:pPr>
+        <w:ind w:left="1440" w:hanging="720"/>
+        <w:rPr>
+          <w:rFonts w:ascii="Segoe UI Light" w:hAnsi="Segoe UI Light" w:cs="Segoe UI Light"/>
+        </w:rPr>
+      </w:pPr>
+      <w:r>
+        <w:rPr>
+          <w:rFonts w:ascii="Segoe UI Light" w:hAnsi="Segoe UI Light" w:cs="Segoe UI Light"/>
+        </w:rPr>
+        <w:t xml:space="preserve">What Assyrian-like army </w:t>
+      </w:r>
+      <w:r>
+        <w:rPr>
+          <w:rFonts w:ascii="Segoe UI Light" w:hAnsi="Segoe UI Light" w:cs="Segoe UI Light"/>
+        </w:rPr>
+        <w:t>is besieging your integrity to Jehovah right now</w:t>
+      </w:r>
+      <w:r>
+        <w:rPr>
+          <w:rFonts w:ascii="Segoe UI Light" w:hAnsi="Segoe UI Light" w:cs="Segoe UI Light"/>
+        </w:rPr>
+        <w:t>?</w:t>
+      </w:r>
+      <w:r>
+        <w:rPr>
+          <w:rFonts w:ascii="Segoe UI Light" w:hAnsi="Segoe UI Light" w:cs="Segoe UI Light"/>
+        </w:rPr>
+        <w:t xml:space="preserve"> </w:t>
+      </w:r>
+    </w:p>
+    <w:p>
+      <w:pPr>
+        <w:pStyle w:val="ListParagraph"/>
+        <w:numPr>
+          <w:ilvl w:val="0"/>
+          <w:numId w:val="16"/>
+        </w:numPr>
+        <w:rPr>
+          <w:rFonts w:ascii="Segoe UI Light" w:hAnsi="Segoe UI Light" w:cs="Segoe UI Light"/>
+        </w:rPr>
+      </w:pPr>
+      <w:r>
+        <w:rPr>
+          <w:rFonts w:ascii="Segoe UI Light" w:hAnsi="Segoe UI Light" w:cs="Segoe UI Light"/>
+        </w:rPr>
+        <w:t>Is it outright persecution from relatives?</w:t>
+      </w:r>
+    </w:p>
+    <w:p>
+      <w:pPr>
+        <w:pStyle w:val="ListParagraph"/>
+        <w:numPr>
+          <w:ilvl w:val="0"/>
+          <w:numId w:val="16"/>
+        </w:numPr>
+        <w:rPr>
+          <w:rFonts w:ascii="Segoe UI Light" w:hAnsi="Segoe UI Light" w:cs="Segoe UI Light"/>
+        </w:rPr>
+      </w:pPr>
+      <w:r>
+        <w:rPr>
+          <w:rFonts w:ascii="Segoe UI Light" w:hAnsi="Segoe UI Light" w:cs="Segoe UI Light"/>
+        </w:rPr>
+        <w:t xml:space="preserve">Is it the </w:t>
+      </w:r>
+      <w:r>
+        <w:rPr>
+          <w:rFonts w:ascii="Segoe UI Light" w:hAnsi="Segoe UI Light" w:cs="Segoe UI Light"/>
+        </w:rPr>
+        <w:t>pressure to fit in at school or at work</w:t>
+      </w:r>
+      <w:r>
+        <w:rPr>
+          <w:rFonts w:ascii="Segoe UI Light" w:hAnsi="Segoe UI Light" w:cs="Segoe UI Light"/>
+        </w:rPr>
+        <w:t>?</w:t>
+      </w:r>
+    </w:p>
+    <w:p>
+      <w:pPr>
+        <w:pStyle w:val="ListParagraph"/>
+        <w:numPr>
+          <w:ilvl w:val="0"/>
+          <w:numId w:val="16"/>
+        </w:numPr>
+        <w:rPr>
+          <w:rFonts w:ascii="Segoe UI Light" w:hAnsi="Segoe UI Light" w:cs="Segoe UI Light"/>
+        </w:rPr>
+      </w:pPr>
+      <w:r>
+        <w:rPr>
+          <w:rFonts w:ascii="Segoe UI Light" w:hAnsi="Segoe UI Light" w:cs="Segoe UI Light"/>
+        </w:rPr>
+        <w:t>Is it the thought of leaving your spouse for unscriptural reasons</w:t>
+      </w:r>
+      <w:r>
+        <w:rPr>
+          <w:rFonts w:ascii="Segoe UI Light" w:hAnsi="Segoe UI Light" w:cs="Segoe UI Light"/>
+        </w:rPr>
+        <w:t>?</w:t>
+      </w:r>
+    </w:p>
+    <w:p>
+      <w:pPr>
+        <w:ind w:left="1440" w:hanging="720"/>
+        <w:rPr>
+          <w:rFonts w:ascii="Segoe UI Light" w:hAnsi="Segoe UI Light" w:cs="Segoe UI Light"/>
+        </w:rPr>
+      </w:pPr>
+      <w:r>
+        <w:rPr>
+          <w:rFonts w:ascii="Segoe UI Light" w:hAnsi="Segoe UI Light" w:cs="Segoe UI Light"/>
+        </w:rPr>
+        <w:t xml:space="preserve">What Assyrian-like army is besieging your integrity to </w:t>
+      </w:r>
+      <w:r>
+        <w:rPr>
+          <w:rFonts w:ascii="Segoe UI Light" w:hAnsi="Segoe UI Light" w:cs="Segoe UI Light"/>
+        </w:rPr>
+        <w:t>God at this moment</w:t>
+      </w:r>
+      <w:r>
+        <w:rPr>
+          <w:rFonts w:ascii="Segoe UI Light" w:hAnsi="Segoe UI Light" w:cs="Segoe UI Light"/>
+        </w:rPr>
+        <w:t xml:space="preserve">? </w:t>
+      </w:r>
+      <w:r>
+        <w:rPr>
+          <w:rFonts w:ascii="Segoe UI Light" w:hAnsi="Segoe UI Light" w:cs="Segoe UI Light"/>
+        </w:rPr>
+        <w:t>What can you do about it? Where can we go for salvation?</w:t>
+      </w:r>
+    </w:p>
+    <w:p>
+      <w:pPr>
+        <w:ind w:left="720" w:hanging="720"/>
+        <w:rPr>
+          <w:rFonts w:ascii="Segoe UI Light" w:hAnsi="Segoe UI Light" w:cs="Segoe UI Light"/>
+        </w:rPr>
+      </w:pPr>
+      <w:r>
+        <w:rPr>
+          <w:rFonts w:ascii="Segoe UI Light" w:hAnsi="Segoe UI Light" w:cs="Segoe UI Light"/>
+        </w:rPr>
+        <w:t>Sennacherib sent letters to Hezekiah after the Rabshakeh left to remind him of the threats</w:t>
+      </w:r>
+      <w:r>
+        <w:rPr>
+          <w:rFonts w:ascii="Segoe UI Light" w:hAnsi="Segoe UI Light" w:cs="Segoe UI Light"/>
+        </w:rPr>
+        <w:t>; there is no way out for them, just as our own trials make us feel today</w:t>
+      </w:r>
+      <w:r>
+        <w:rPr>
+          <w:rFonts w:ascii="Segoe UI Light" w:hAnsi="Segoe UI Light" w:cs="Segoe UI Light"/>
+        </w:rPr>
+        <w:t>.</w:t>
+      </w:r>
+    </w:p>
+    <w:p>
+      <w:pPr>
+        <w:ind w:left="720" w:hanging="720"/>
+        <w:rPr>
+          <w:rFonts w:ascii="Segoe UI Light" w:hAnsi="Segoe UI Light" w:cs="Segoe UI Light"/>
+        </w:rPr>
+      </w:pPr>
+      <w:r>
+        <w:rPr>
+          <w:rFonts w:ascii="Segoe UI Light" w:hAnsi="Segoe UI Light" w:cs="Segoe UI Light"/>
+        </w:rPr>
+        <w:t>Hezekiah took the letters to the temple. Why?</w:t>
+      </w:r>
+    </w:p>
+    <w:p>
+      <w:pPr>
+        <w:rPr>
+          <w:rFonts w:ascii="Segoe UI Light" w:hAnsi="Segoe UI Light" w:cs="Segoe UI Light"/>
+        </w:rPr>
+      </w:pPr>
+      <w:r>
+        <w:rPr>
+          <w:rFonts w:ascii="Segoe UI Light" w:hAnsi="Segoe UI Light" w:cs="Segoe UI Light"/>
+        </w:rPr>
+        <w:t>Let’s see what King Hezekiah did.</w:t>
+      </w:r>
+    </w:p>
+    <w:p>
+      <w:pPr>
+        <w:ind w:left="720"/>
+        <w:rPr>
+          <w:rFonts w:ascii="Segoe UI Light" w:hAnsi="Segoe UI Light" w:cs="Segoe UI Light"/>
+        </w:rPr>
+      </w:pPr>
+      <w:r>
+        <w:rPr>
+          <w:rFonts w:ascii="Segoe UI Light" w:hAnsi="Segoe UI Light" w:cs="Segoe UI Light"/>
+          <w:b/>
+          <w:bCs/>
+        </w:rPr>
+        <w:t>2 kings 19:15-19.</w:t>
+      </w:r>
+    </w:p>
+    <w:p>
+      <w:pPr>
+        <w:ind w:left="1440"/>
+        <w:rPr>
+          <w:rFonts w:ascii="Segoe UI Light" w:hAnsi="Segoe UI Light" w:cs="Segoe UI Light"/>
+        </w:rPr>
+      </w:pPr>
+    </w:p>
+    <w:p>
+      <w:pPr>
+        <w:ind w:left="1440"/>
+        <w:rPr>
+          <w:rFonts w:ascii="Segoe UI Light" w:hAnsi="Segoe UI Light" w:cs="Segoe UI Light"/>
+        </w:rPr>
+      </w:pPr>
     </w:p>
     <w:p>
       <w:pPr>
@@ -2086,7 +2387,7 @@
       <w:lvlText w:val="o"/>
       <w:lvlJc w:val="left"/>
       <w:pPr>
-        <w:ind w:left="2157" w:hanging="360"/>
+        <w:ind w:left="2517" w:hanging="360"/>
       </w:pPr>
       <w:rPr>
         <w:rFonts w:ascii="Courier New" w:hAnsi="Courier New" w:cs="Courier New" w:hint="default"/>
@@ -2098,7 +2399,7 @@
       <w:lvlText w:val="o"/>
       <w:lvlJc w:val="left"/>
       <w:pPr>
-        <w:ind w:left="2877" w:hanging="360"/>
+        <w:ind w:left="3237" w:hanging="360"/>
       </w:pPr>
       <w:rPr>
         <w:rFonts w:ascii="Courier New" w:hAnsi="Courier New" w:cs="Courier New" w:hint="default"/>
@@ -2110,7 +2411,7 @@
       <w:lvlText w:val=""/>
       <w:lvlJc w:val="left"/>
       <w:pPr>
-        <w:ind w:left="3597" w:hanging="360"/>
+        <w:ind w:left="3957" w:hanging="360"/>
       </w:pPr>
       <w:rPr>
         <w:rFonts w:ascii="Wingdings" w:hAnsi="Wingdings" w:hint="default"/>
@@ -2122,7 +2423,7 @@
       <w:lvlText w:val=""/>
       <w:lvlJc w:val="left"/>
       <w:pPr>
-        <w:ind w:left="4317" w:hanging="360"/>
+        <w:ind w:left="4677" w:hanging="360"/>
       </w:pPr>
       <w:rPr>
         <w:rFonts w:ascii="Symbol" w:hAnsi="Symbol" w:hint="default"/>
@@ -2134,7 +2435,7 @@
       <w:lvlText w:val="o"/>
       <w:lvlJc w:val="left"/>
       <w:pPr>
-        <w:ind w:left="5037" w:hanging="360"/>
+        <w:ind w:left="5397" w:hanging="360"/>
       </w:pPr>
       <w:rPr>
         <w:rFonts w:ascii="Courier New" w:hAnsi="Courier New" w:cs="Courier New" w:hint="default"/>
@@ -2146,7 +2447,7 @@
       <w:lvlText w:val=""/>
       <w:lvlJc w:val="left"/>
       <w:pPr>
-        <w:ind w:left="5757" w:hanging="360"/>
+        <w:ind w:left="6117" w:hanging="360"/>
       </w:pPr>
       <w:rPr>
         <w:rFonts w:ascii="Wingdings" w:hAnsi="Wingdings" w:hint="default"/>
@@ -2158,7 +2459,7 @@
       <w:lvlText w:val=""/>
       <w:lvlJc w:val="left"/>
       <w:pPr>
-        <w:ind w:left="6477" w:hanging="360"/>
+        <w:ind w:left="6837" w:hanging="360"/>
       </w:pPr>
       <w:rPr>
         <w:rFonts w:ascii="Symbol" w:hAnsi="Symbol" w:hint="default"/>
@@ -2170,7 +2471,7 @@
       <w:lvlText w:val="o"/>
       <w:lvlJc w:val="left"/>
       <w:pPr>
-        <w:ind w:left="7197" w:hanging="360"/>
+        <w:ind w:left="7557" w:hanging="360"/>
       </w:pPr>
       <w:rPr>
         <w:rFonts w:ascii="Courier New" w:hAnsi="Courier New" w:cs="Courier New" w:hint="default"/>
@@ -2182,7 +2483,7 @@
       <w:lvlText w:val=""/>
       <w:lvlJc w:val="left"/>
       <w:pPr>
-        <w:ind w:left="7917" w:hanging="360"/>
+        <w:ind w:left="8277" w:hanging="360"/>
       </w:pPr>
       <w:rPr>
         <w:rFonts w:ascii="Wingdings" w:hAnsi="Wingdings" w:hint="default"/>
@@ -2190,6 +2491,119 @@
     </w:lvl>
   </w:abstractNum>
   <w:abstractNum w:abstractNumId="4" w15:restartNumberingAfterBreak="0">
+    <w:nsid w:val="1CEC314D"/>
+    <w:multiLevelType w:val="hybridMultilevel"/>
+    <w:tmpl w:val="070E12AC"/>
+    <w:lvl w:ilvl="0" w:tplc="1009000D">
+      <w:start w:val="1"/>
+      <w:numFmt w:val="bullet"/>
+      <w:lvlText w:val=""/>
+      <w:lvlJc w:val="left"/>
+      <w:pPr>
+        <w:ind w:left="1440" w:hanging="360"/>
+      </w:pPr>
+      <w:rPr>
+        <w:rFonts w:ascii="Wingdings" w:hAnsi="Wingdings" w:hint="default"/>
+      </w:rPr>
+    </w:lvl>
+    <w:lvl w:ilvl="1" w:tplc="10090003" w:tentative="1">
+      <w:start w:val="1"/>
+      <w:numFmt w:val="bullet"/>
+      <w:lvlText w:val="o"/>
+      <w:lvlJc w:val="left"/>
+      <w:pPr>
+        <w:ind w:left="2160" w:hanging="360"/>
+      </w:pPr>
+      <w:rPr>
+        <w:rFonts w:ascii="Courier New" w:hAnsi="Courier New" w:cs="Courier New" w:hint="default"/>
+      </w:rPr>
+    </w:lvl>
+    <w:lvl w:ilvl="2" w:tplc="10090005" w:tentative="1">
+      <w:start w:val="1"/>
+      <w:numFmt w:val="bullet"/>
+      <w:lvlText w:val=""/>
+      <w:lvlJc w:val="left"/>
+      <w:pPr>
+        <w:ind w:left="2880" w:hanging="360"/>
+      </w:pPr>
+      <w:rPr>
+        <w:rFonts w:ascii="Wingdings" w:hAnsi="Wingdings" w:hint="default"/>
+      </w:rPr>
+    </w:lvl>
+    <w:lvl w:ilvl="3" w:tplc="10090001" w:tentative="1">
+      <w:start w:val="1"/>
+      <w:numFmt w:val="bullet"/>
+      <w:lvlText w:val=""/>
+      <w:lvlJc w:val="left"/>
+      <w:pPr>
+        <w:ind w:left="3600" w:hanging="360"/>
+      </w:pPr>
+      <w:rPr>
+        <w:rFonts w:ascii="Symbol" w:hAnsi="Symbol" w:hint="default"/>
+      </w:rPr>
+    </w:lvl>
+    <w:lvl w:ilvl="4" w:tplc="10090003" w:tentative="1">
+      <w:start w:val="1"/>
+      <w:numFmt w:val="bullet"/>
+      <w:lvlText w:val="o"/>
+      <w:lvlJc w:val="left"/>
+      <w:pPr>
+        <w:ind w:left="4320" w:hanging="360"/>
+      </w:pPr>
+      <w:rPr>
+        <w:rFonts w:ascii="Courier New" w:hAnsi="Courier New" w:cs="Courier New" w:hint="default"/>
+      </w:rPr>
+    </w:lvl>
+    <w:lvl w:ilvl="5" w:tplc="10090005" w:tentative="1">
+      <w:start w:val="1"/>
+      <w:numFmt w:val="bullet"/>
+      <w:lvlText w:val=""/>
+      <w:lvlJc w:val="left"/>
+      <w:pPr>
+        <w:ind w:left="5040" w:hanging="360"/>
+      </w:pPr>
+      <w:rPr>
+        <w:rFonts w:ascii="Wingdings" w:hAnsi="Wingdings" w:hint="default"/>
+      </w:rPr>
+    </w:lvl>
+    <w:lvl w:ilvl="6" w:tplc="10090001" w:tentative="1">
+      <w:start w:val="1"/>
+      <w:numFmt w:val="bullet"/>
+      <w:lvlText w:val=""/>
+      <w:lvlJc w:val="left"/>
+      <w:pPr>
+        <w:ind w:left="5760" w:hanging="360"/>
+      </w:pPr>
+      <w:rPr>
+        <w:rFonts w:ascii="Symbol" w:hAnsi="Symbol" w:hint="default"/>
+      </w:rPr>
+    </w:lvl>
+    <w:lvl w:ilvl="7" w:tplc="10090003" w:tentative="1">
+      <w:start w:val="1"/>
+      <w:numFmt w:val="bullet"/>
+      <w:lvlText w:val="o"/>
+      <w:lvlJc w:val="left"/>
+      <w:pPr>
+        <w:ind w:left="6480" w:hanging="360"/>
+      </w:pPr>
+      <w:rPr>
+        <w:rFonts w:ascii="Courier New" w:hAnsi="Courier New" w:cs="Courier New" w:hint="default"/>
+      </w:rPr>
+    </w:lvl>
+    <w:lvl w:ilvl="8" w:tplc="10090005" w:tentative="1">
+      <w:start w:val="1"/>
+      <w:numFmt w:val="bullet"/>
+      <w:lvlText w:val=""/>
+      <w:lvlJc w:val="left"/>
+      <w:pPr>
+        <w:ind w:left="7200" w:hanging="360"/>
+      </w:pPr>
+      <w:rPr>
+        <w:rFonts w:ascii="Wingdings" w:hAnsi="Wingdings" w:hint="default"/>
+      </w:rPr>
+    </w:lvl>
+  </w:abstractNum>
+  <w:abstractNum w:abstractNumId="5" w15:restartNumberingAfterBreak="0">
     <w:nsid w:val="249F2707"/>
     <w:multiLevelType w:val="hybridMultilevel"/>
     <w:tmpl w:val="6A048F76"/>
@@ -2278,7 +2692,7 @@
       </w:pPr>
     </w:lvl>
   </w:abstractNum>
-  <w:abstractNum w:abstractNumId="5" w15:restartNumberingAfterBreak="0">
+  <w:abstractNum w:abstractNumId="6" w15:restartNumberingAfterBreak="0">
     <w:nsid w:val="24A80059"/>
     <w:multiLevelType w:val="hybridMultilevel"/>
     <w:tmpl w:val="11B24C7E"/>
@@ -2391,7 +2805,7 @@
       </w:rPr>
     </w:lvl>
   </w:abstractNum>
-  <w:abstractNum w:abstractNumId="6" w15:restartNumberingAfterBreak="0">
+  <w:abstractNum w:abstractNumId="7" w15:restartNumberingAfterBreak="0">
     <w:nsid w:val="29F30EFE"/>
     <w:multiLevelType w:val="hybridMultilevel"/>
     <w:tmpl w:val="8D849220"/>
@@ -2504,7 +2918,7 @@
       </w:rPr>
     </w:lvl>
   </w:abstractNum>
-  <w:abstractNum w:abstractNumId="7" w15:restartNumberingAfterBreak="0">
+  <w:abstractNum w:abstractNumId="8" w15:restartNumberingAfterBreak="0">
     <w:nsid w:val="307F4271"/>
     <w:multiLevelType w:val="hybridMultilevel"/>
     <w:tmpl w:val="6650950A"/>
@@ -2617,7 +3031,7 @@
       </w:rPr>
     </w:lvl>
   </w:abstractNum>
-  <w:abstractNum w:abstractNumId="8" w15:restartNumberingAfterBreak="0">
+  <w:abstractNum w:abstractNumId="9" w15:restartNumberingAfterBreak="0">
     <w:nsid w:val="3E4E7E1D"/>
     <w:multiLevelType w:val="hybridMultilevel"/>
     <w:tmpl w:val="C4183DF8"/>
@@ -2730,7 +3144,7 @@
       </w:rPr>
     </w:lvl>
   </w:abstractNum>
-  <w:abstractNum w:abstractNumId="9" w15:restartNumberingAfterBreak="0">
+  <w:abstractNum w:abstractNumId="10" w15:restartNumberingAfterBreak="0">
     <w:nsid w:val="3EC24676"/>
     <w:multiLevelType w:val="hybridMultilevel"/>
     <w:tmpl w:val="AD10C83C"/>
@@ -2816,7 +3230,7 @@
       </w:pPr>
     </w:lvl>
   </w:abstractNum>
-  <w:abstractNum w:abstractNumId="10" w15:restartNumberingAfterBreak="0">
+  <w:abstractNum w:abstractNumId="11" w15:restartNumberingAfterBreak="0">
     <w:nsid w:val="69010C8B"/>
     <w:multiLevelType w:val="hybridMultilevel"/>
     <w:tmpl w:val="AB9ACF8C"/>
@@ -2929,7 +3343,7 @@
       </w:rPr>
     </w:lvl>
   </w:abstractNum>
-  <w:abstractNum w:abstractNumId="11" w15:restartNumberingAfterBreak="0">
+  <w:abstractNum w:abstractNumId="12" w15:restartNumberingAfterBreak="0">
     <w:nsid w:val="72236AAD"/>
     <w:multiLevelType w:val="hybridMultilevel"/>
     <w:tmpl w:val="1FF8BAB6"/>
@@ -3042,7 +3456,7 @@
       </w:rPr>
     </w:lvl>
   </w:abstractNum>
-  <w:abstractNum w:abstractNumId="12" w15:restartNumberingAfterBreak="0">
+  <w:abstractNum w:abstractNumId="13" w15:restartNumberingAfterBreak="0">
     <w:nsid w:val="74CF7FBC"/>
     <w:multiLevelType w:val="hybridMultilevel"/>
     <w:tmpl w:val="454E1412"/>
@@ -3155,7 +3569,7 @@
       </w:rPr>
     </w:lvl>
   </w:abstractNum>
-  <w:abstractNum w:abstractNumId="13" w15:restartNumberingAfterBreak="0">
+  <w:abstractNum w:abstractNumId="14" w15:restartNumberingAfterBreak="0">
     <w:nsid w:val="754071D0"/>
     <w:multiLevelType w:val="hybridMultilevel"/>
     <w:tmpl w:val="3698CDEC"/>
@@ -3241,7 +3655,7 @@
       </w:pPr>
     </w:lvl>
   </w:abstractNum>
-  <w:abstractNum w:abstractNumId="14" w15:restartNumberingAfterBreak="0">
+  <w:abstractNum w:abstractNumId="15" w15:restartNumberingAfterBreak="0">
     <w:nsid w:val="7F6C1CAC"/>
     <w:multiLevelType w:val="hybridMultilevel"/>
     <w:tmpl w:val="4E3EFFE6"/>
@@ -3355,49 +3769,52 @@
     </w:lvl>
   </w:abstractNum>
   <w:num w:numId="1" w16cid:durableId="1200126119">
-    <w:abstractNumId w:val="11"/>
+    <w:abstractNumId w:val="12"/>
   </w:num>
   <w:num w:numId="2" w16cid:durableId="2142964796">
     <w:abstractNumId w:val="1"/>
   </w:num>
   <w:num w:numId="3" w16cid:durableId="1686126829">
-    <w:abstractNumId w:val="13"/>
+    <w:abstractNumId w:val="14"/>
   </w:num>
   <w:num w:numId="4" w16cid:durableId="9256738">
-    <w:abstractNumId w:val="9"/>
+    <w:abstractNumId w:val="10"/>
   </w:num>
   <w:num w:numId="5" w16cid:durableId="1929270298">
-    <w:abstractNumId w:val="5"/>
+    <w:abstractNumId w:val="6"/>
   </w:num>
   <w:num w:numId="6" w16cid:durableId="1283686131">
     <w:abstractNumId w:val="0"/>
   </w:num>
   <w:num w:numId="7" w16cid:durableId="1973510224">
-    <w:abstractNumId w:val="6"/>
+    <w:abstractNumId w:val="7"/>
   </w:num>
   <w:num w:numId="8" w16cid:durableId="1322386662">
     <w:abstractNumId w:val="2"/>
   </w:num>
   <w:num w:numId="9" w16cid:durableId="1623069594">
-    <w:abstractNumId w:val="8"/>
+    <w:abstractNumId w:val="9"/>
   </w:num>
   <w:num w:numId="10" w16cid:durableId="389547150">
-    <w:abstractNumId w:val="10"/>
+    <w:abstractNumId w:val="11"/>
   </w:num>
   <w:num w:numId="11" w16cid:durableId="258147424">
-    <w:abstractNumId w:val="14"/>
+    <w:abstractNumId w:val="15"/>
   </w:num>
   <w:num w:numId="12" w16cid:durableId="1740980150">
-    <w:abstractNumId w:val="12"/>
+    <w:abstractNumId w:val="13"/>
   </w:num>
   <w:num w:numId="13" w16cid:durableId="1889342876">
-    <w:abstractNumId w:val="4"/>
+    <w:abstractNumId w:val="5"/>
   </w:num>
   <w:num w:numId="14" w16cid:durableId="253057507">
     <w:abstractNumId w:val="3"/>
   </w:num>
   <w:num w:numId="15" w16cid:durableId="484205992">
-    <w:abstractNumId w:val="7"/>
+    <w:abstractNumId w:val="8"/>
+  </w:num>
+  <w:num w:numId="16" w16cid:durableId="791091195">
+    <w:abstractNumId w:val="4"/>
   </w:num>
 </w:numbering>
 </file>

</xml_diff>

<commit_message>
Solution of death path 1
</commit_message>
<xml_diff>
--- a/Public Talks/No 147/No 147.docx
+++ b/Public Talks/No 147/No 147.docx
@@ -3637,13 +3637,7 @@
         <w:rPr>
           <w:rFonts w:ascii="Segoe UI Light" w:hAnsi="Segoe UI Light" w:cs="Segoe UI Light"/>
         </w:rPr>
-        <w:t>That very night, he sent an angel who struck down 185,000 Assyrian soldiers</w:t>
-      </w:r>
-      <w:r>
-        <w:rPr>
-          <w:rFonts w:ascii="Segoe UI Light" w:hAnsi="Segoe UI Light" w:cs="Segoe UI Light"/>
-        </w:rPr>
-        <w:t>.</w:t>
+        <w:t>That very night, he sent an angel who struck down 185,000 Assyrian soldiers.</w:t>
       </w:r>
     </w:p>
     <w:p>
@@ -3946,7 +3940,19 @@
         <w:rPr>
           <w:rFonts w:ascii="Segoe UI Light" w:hAnsi="Segoe UI Light" w:cs="Segoe UI Light"/>
         </w:rPr>
-        <w:t>Where are Hezekiah and all the people who survived the Assyrian army?</w:t>
+        <w:t>Where are Hezekiah and all the people who survived the Assyrian army</w:t>
+      </w:r>
+      <w:r>
+        <w:rPr>
+          <w:rFonts w:ascii="Segoe UI Light" w:hAnsi="Segoe UI Light" w:cs="Segoe UI Light"/>
+        </w:rPr>
+        <w:t xml:space="preserve"> today</w:t>
+      </w:r>
+      <w:r>
+        <w:rPr>
+          <w:rFonts w:ascii="Segoe UI Light" w:hAnsi="Segoe UI Light" w:cs="Segoe UI Light"/>
+        </w:rPr>
+        <w:t>?</w:t>
       </w:r>
     </w:p>
     <w:p>
@@ -3960,19 +3966,69 @@
         <w:rPr>
           <w:rFonts w:ascii="Segoe UI Light" w:hAnsi="Segoe UI Light" w:cs="Segoe UI Light"/>
         </w:rPr>
-        <w:t>Is there any difference today them and the Assyrian</w:t>
-      </w:r>
-      <w:r>
-        <w:rPr>
-          <w:rFonts w:ascii="Segoe UI Light" w:hAnsi="Segoe UI Light" w:cs="Segoe UI Light"/>
-        </w:rPr>
-        <w:t>s destroyed by</w:t>
-      </w:r>
-      <w:r>
-        <w:rPr>
-          <w:rFonts w:ascii="Segoe UI Light" w:hAnsi="Segoe UI Light" w:cs="Segoe UI Light"/>
-        </w:rPr>
-        <w:t xml:space="preserve"> Jehovah in 732 B.C.E.?</w:t>
+        <w:t>Is there any difference</w:t>
+      </w:r>
+      <w:r>
+        <w:rPr>
+          <w:rFonts w:ascii="Segoe UI Light" w:hAnsi="Segoe UI Light" w:cs="Segoe UI Light"/>
+        </w:rPr>
+        <w:t xml:space="preserve"> between</w:t>
+      </w:r>
+      <w:r>
+        <w:rPr>
+          <w:rFonts w:ascii="Segoe UI Light" w:hAnsi="Segoe UI Light" w:cs="Segoe UI Light"/>
+        </w:rPr>
+        <w:t xml:space="preserve"> them and the Assyrian</w:t>
+      </w:r>
+      <w:r>
+        <w:rPr>
+          <w:rFonts w:ascii="Segoe UI Light" w:hAnsi="Segoe UI Light" w:cs="Segoe UI Light"/>
+        </w:rPr>
+        <w:t xml:space="preserve">s </w:t>
+      </w:r>
+      <w:r>
+        <w:rPr>
+          <w:rFonts w:ascii="Segoe UI Light" w:hAnsi="Segoe UI Light" w:cs="Segoe UI Light"/>
+        </w:rPr>
+        <w:t xml:space="preserve">whom </w:t>
+      </w:r>
+      <w:r>
+        <w:rPr>
+          <w:rFonts w:ascii="Segoe UI Light" w:hAnsi="Segoe UI Light" w:cs="Segoe UI Light"/>
+        </w:rPr>
+        <w:t>Jehovah</w:t>
+      </w:r>
+      <w:r>
+        <w:rPr>
+          <w:rFonts w:ascii="Segoe UI Light" w:hAnsi="Segoe UI Light" w:cs="Segoe UI Light"/>
+        </w:rPr>
+        <w:t xml:space="preserve"> </w:t>
+      </w:r>
+      <w:r>
+        <w:rPr>
+          <w:rFonts w:ascii="Segoe UI Light" w:hAnsi="Segoe UI Light" w:cs="Segoe UI Light"/>
+        </w:rPr>
+        <w:t>destroyed</w:t>
+      </w:r>
+      <w:r>
+        <w:rPr>
+          <w:rFonts w:ascii="Segoe UI Light" w:hAnsi="Segoe UI Light" w:cs="Segoe UI Light"/>
+        </w:rPr>
+        <w:t xml:space="preserve"> in 732 B.C.E.?</w:t>
+      </w:r>
+    </w:p>
+    <w:p>
+      <w:pPr>
+        <w:ind w:left="1440"/>
+        <w:rPr>
+          <w:rFonts w:ascii="Segoe UI Light" w:hAnsi="Segoe UI Light" w:cs="Segoe UI Light"/>
+        </w:rPr>
+      </w:pPr>
+      <w:r>
+        <w:rPr>
+          <w:rFonts w:ascii="Segoe UI Light" w:hAnsi="Segoe UI Light" w:cs="Segoe UI Light"/>
+        </w:rPr>
+        <w:t>Eventually, all of them died.</w:t>
       </w:r>
     </w:p>
     <w:p>
@@ -3986,8 +4042,910 @@
         <w:rPr>
           <w:rFonts w:ascii="Segoe UI Light" w:hAnsi="Segoe UI Light" w:cs="Segoe UI Light"/>
         </w:rPr>
-        <w:t>That bears the question: Is Jehovah, the God of salvation, able to save us from death itself?</w:t>
-      </w:r>
+        <w:t xml:space="preserve">That </w:t>
+      </w:r>
+      <w:r>
+        <w:rPr>
+          <w:rFonts w:ascii="Segoe UI Light" w:hAnsi="Segoe UI Light" w:cs="Segoe UI Light"/>
+        </w:rPr>
+        <w:t>raises</w:t>
+      </w:r>
+      <w:r>
+        <w:rPr>
+          <w:rFonts w:ascii="Segoe UI Light" w:hAnsi="Segoe UI Light" w:cs="Segoe UI Light"/>
+        </w:rPr>
+        <w:t xml:space="preserve"> the question: Is Jehovah, the God of salvation, able to save us from death itself?</w:t>
+      </w:r>
+    </w:p>
+    <w:p>
+      <w:pPr>
+        <w:rPr>
+          <w:rFonts w:ascii="Segoe UI Light" w:hAnsi="Segoe UI Light" w:cs="Segoe UI Light"/>
+          <w:color w:val="BF8F00" w:themeColor="accent4" w:themeShade="BF"/>
+        </w:rPr>
+      </w:pPr>
+      <w:r>
+        <w:rPr>
+          <w:rFonts w:ascii="Segoe UI Light" w:hAnsi="Segoe UI Light" w:cs="Segoe UI Light"/>
+        </w:rPr>
+        <w:t xml:space="preserve">Why do we die? </w:t>
+      </w:r>
+      <w:r>
+        <w:rPr>
+          <w:rFonts w:ascii="Segoe UI Light" w:hAnsi="Segoe UI Light" w:cs="Segoe UI Light"/>
+        </w:rPr>
+        <w:t xml:space="preserve">Do you think it is useful to understand the origin of a problem so as to be able to solve it? </w:t>
+      </w:r>
+      <w:r>
+        <w:rPr>
+          <w:rFonts w:ascii="Segoe UI Light" w:hAnsi="Segoe UI Light" w:cs="Segoe UI Light"/>
+          <w:b/>
+          <w:bCs/>
+          <w:color w:val="BF8F00" w:themeColor="accent4" w:themeShade="BF"/>
+        </w:rPr>
+        <w:t>What is the root cause of death?</w:t>
+      </w:r>
+    </w:p>
+    <w:p>
+      <w:pPr>
+        <w:ind w:left="720"/>
+        <w:rPr>
+          <w:rFonts w:ascii="Segoe UI Light" w:hAnsi="Segoe UI Light" w:cs="Segoe UI Light"/>
+        </w:rPr>
+      </w:pPr>
+      <w:r>
+        <w:rPr>
+          <w:rFonts w:ascii="Segoe UI Light" w:hAnsi="Segoe UI Light" w:cs="Segoe UI Light"/>
+          <w:b/>
+          <w:bCs/>
+        </w:rPr>
+        <w:t>John 8:44</w:t>
+      </w:r>
+      <w:r>
+        <w:rPr>
+          <w:rFonts w:ascii="Segoe UI Light" w:hAnsi="Segoe UI Light" w:cs="Segoe UI Light"/>
+        </w:rPr>
+        <w:t>:</w:t>
+      </w:r>
+    </w:p>
+    <w:p>
+      <w:pPr>
+        <w:pStyle w:val="ListParagraph"/>
+        <w:numPr>
+          <w:ilvl w:val="0"/>
+          <w:numId w:val="27"/>
+        </w:numPr>
+        <w:rPr>
+          <w:rFonts w:ascii="Segoe UI Light" w:hAnsi="Segoe UI Light" w:cs="Segoe UI Light"/>
+        </w:rPr>
+      </w:pPr>
+      <w:r>
+        <w:rPr>
+          <w:rFonts w:ascii="Segoe UI Light" w:hAnsi="Segoe UI Light" w:cs="Segoe UI Light"/>
+          <w:i/>
+          <w:iCs/>
+        </w:rPr>
+        <w:t>The father of the lie:</w:t>
+      </w:r>
+      <w:r>
+        <w:rPr>
+          <w:rFonts w:ascii="Segoe UI Light" w:hAnsi="Segoe UI Light" w:cs="Segoe UI Light"/>
+        </w:rPr>
+        <w:t xml:space="preserve"> “</w:t>
+      </w:r>
+      <w:r>
+        <w:rPr>
+          <w:rFonts w:ascii="Segoe UI Light" w:hAnsi="Segoe UI Light" w:cs="Segoe UI Light"/>
+        </w:rPr>
+        <w:t>You certainly will not die</w:t>
+      </w:r>
+      <w:r>
+        <w:rPr>
+          <w:rFonts w:ascii="Segoe UI Light" w:hAnsi="Segoe UI Light" w:cs="Segoe UI Light"/>
+        </w:rPr>
+        <w:t>”</w:t>
+      </w:r>
+      <w:r>
+        <w:rPr>
+          <w:rFonts w:ascii="Segoe UI Light" w:hAnsi="Segoe UI Light" w:cs="Segoe UI Light"/>
+        </w:rPr>
+        <w:t xml:space="preserve"> – the first lie originates with Satan.</w:t>
+      </w:r>
+    </w:p>
+    <w:p>
+      <w:pPr>
+        <w:pStyle w:val="ListParagraph"/>
+        <w:numPr>
+          <w:ilvl w:val="0"/>
+          <w:numId w:val="28"/>
+        </w:numPr>
+        <w:rPr>
+          <w:rFonts w:ascii="Segoe UI Light" w:hAnsi="Segoe UI Light" w:cs="Segoe UI Light"/>
+        </w:rPr>
+      </w:pPr>
+      <w:r>
+        <w:rPr>
+          <w:rFonts w:ascii="Segoe UI Light" w:hAnsi="Segoe UI Light" w:cs="Segoe UI Light"/>
+        </w:rPr>
+        <w:t>Lie</w:t>
+      </w:r>
+      <w:r>
+        <w:rPr>
+          <w:rFonts w:ascii="Segoe UI Light" w:hAnsi="Segoe UI Light" w:cs="Segoe UI Light"/>
+        </w:rPr>
+        <w:t>d</w:t>
+      </w:r>
+      <w:r>
+        <w:rPr>
+          <w:rFonts w:ascii="Segoe UI Light" w:hAnsi="Segoe UI Light" w:cs="Segoe UI Light"/>
+        </w:rPr>
+        <w:t xml:space="preserve"> about God</w:t>
+      </w:r>
+      <w:r>
+        <w:rPr>
+          <w:rFonts w:ascii="Segoe UI Light" w:hAnsi="Segoe UI Light" w:cs="Segoe UI Light"/>
+        </w:rPr>
+        <w:t>.</w:t>
+      </w:r>
+    </w:p>
+    <w:p>
+      <w:pPr>
+        <w:pStyle w:val="ListParagraph"/>
+        <w:numPr>
+          <w:ilvl w:val="0"/>
+          <w:numId w:val="28"/>
+        </w:numPr>
+        <w:rPr>
+          <w:rFonts w:ascii="Segoe UI Light" w:hAnsi="Segoe UI Light" w:cs="Segoe UI Light"/>
+        </w:rPr>
+      </w:pPr>
+      <w:r>
+        <w:rPr>
+          <w:rFonts w:ascii="Segoe UI Light" w:hAnsi="Segoe UI Light" w:cs="Segoe UI Light"/>
+        </w:rPr>
+        <w:t>Lie</w:t>
+      </w:r>
+      <w:r>
+        <w:rPr>
+          <w:rFonts w:ascii="Segoe UI Light" w:hAnsi="Segoe UI Light" w:cs="Segoe UI Light"/>
+        </w:rPr>
+        <w:t>d</w:t>
+      </w:r>
+      <w:r>
+        <w:rPr>
+          <w:rFonts w:ascii="Segoe UI Light" w:hAnsi="Segoe UI Light" w:cs="Segoe UI Light"/>
+        </w:rPr>
+        <w:t xml:space="preserve"> </w:t>
+      </w:r>
+      <w:r>
+        <w:rPr>
+          <w:rFonts w:ascii="Segoe UI Light" w:hAnsi="Segoe UI Light" w:cs="Segoe UI Light"/>
+        </w:rPr>
+        <w:t xml:space="preserve">to Eve about </w:t>
+      </w:r>
+      <w:r>
+        <w:rPr>
+          <w:rFonts w:ascii="Segoe UI Light" w:hAnsi="Segoe UI Light" w:cs="Segoe UI Light"/>
+        </w:rPr>
+        <w:t>the consequences of her disobedience to</w:t>
+      </w:r>
+      <w:r>
+        <w:rPr>
+          <w:rFonts w:ascii="Segoe UI Light" w:hAnsi="Segoe UI Light" w:cs="Segoe UI Light"/>
+        </w:rPr>
+        <w:t xml:space="preserve"> God.</w:t>
+      </w:r>
+    </w:p>
+    <w:p>
+      <w:pPr>
+        <w:pStyle w:val="ListParagraph"/>
+        <w:numPr>
+          <w:ilvl w:val="0"/>
+          <w:numId w:val="27"/>
+        </w:numPr>
+        <w:rPr>
+          <w:rFonts w:ascii="Segoe UI Light" w:hAnsi="Segoe UI Light" w:cs="Segoe UI Light"/>
+        </w:rPr>
+      </w:pPr>
+      <w:r>
+        <w:rPr>
+          <w:rFonts w:ascii="Segoe UI Light" w:hAnsi="Segoe UI Light" w:cs="Segoe UI Light"/>
+          <w:i/>
+          <w:iCs/>
+        </w:rPr>
+        <w:t>A murderer:</w:t>
+      </w:r>
+    </w:p>
+    <w:p>
+      <w:pPr>
+        <w:pStyle w:val="ListParagraph"/>
+        <w:numPr>
+          <w:ilvl w:val="0"/>
+          <w:numId w:val="29"/>
+        </w:numPr>
+        <w:rPr>
+          <w:rFonts w:ascii="Segoe UI Light" w:hAnsi="Segoe UI Light" w:cs="Segoe UI Light"/>
+        </w:rPr>
+      </w:pPr>
+      <w:r>
+        <w:rPr>
+          <w:rFonts w:ascii="Segoe UI Light" w:hAnsi="Segoe UI Light" w:cs="Segoe UI Light"/>
+        </w:rPr>
+        <w:lastRenderedPageBreak/>
+        <w:t>The devil knew Eve will die if she disobeys</w:t>
+      </w:r>
+    </w:p>
+    <w:p>
+      <w:pPr>
+        <w:pStyle w:val="ListParagraph"/>
+        <w:ind w:left="3237" w:hanging="720"/>
+        <w:rPr>
+          <w:rFonts w:ascii="Segoe UI Light" w:hAnsi="Segoe UI Light" w:cs="Segoe UI Light"/>
+        </w:rPr>
+      </w:pPr>
+      <w:r>
+        <w:rPr>
+          <w:rFonts w:ascii="Segoe UI Light" w:hAnsi="Segoe UI Light" w:cs="Segoe UI Light"/>
+          <w:b/>
+          <w:bCs/>
+        </w:rPr>
+        <w:t>Illustration</w:t>
+      </w:r>
+      <w:r>
+        <w:rPr>
+          <w:rFonts w:ascii="Segoe UI Light" w:hAnsi="Segoe UI Light" w:cs="Segoe UI Light"/>
+        </w:rPr>
+        <w:t xml:space="preserve">: </w:t>
+      </w:r>
+      <w:r>
+        <w:rPr>
+          <w:rFonts w:ascii="Segoe UI Light" w:hAnsi="Segoe UI Light" w:cs="Segoe UI Light"/>
+        </w:rPr>
+        <w:t xml:space="preserve">Imagine someone handing you a drink and praising its benefits, saying it will make you wiser and give you freedom. He knows it is poison that will slowly and surely kill you. </w:t>
+      </w:r>
+    </w:p>
+    <w:p>
+      <w:pPr>
+        <w:pStyle w:val="ListParagraph"/>
+        <w:ind w:left="3600" w:hanging="720"/>
+        <w:rPr>
+          <w:rFonts w:ascii="Segoe UI Light" w:hAnsi="Segoe UI Light" w:cs="Segoe UI Light"/>
+        </w:rPr>
+      </w:pPr>
+      <w:r>
+        <w:rPr>
+          <w:rFonts w:ascii="Segoe UI Light" w:hAnsi="Segoe UI Light" w:cs="Segoe UI Light"/>
+        </w:rPr>
+        <w:t xml:space="preserve">That is what Satan did when he offered Eve </w:t>
+      </w:r>
+      <w:r>
+        <w:rPr>
+          <w:rFonts w:ascii="Segoe UI Light" w:hAnsi="Segoe UI Light" w:cs="Segoe UI Light"/>
+        </w:rPr>
+        <w:t xml:space="preserve">to eat the fruit of </w:t>
+      </w:r>
+      <w:r>
+        <w:rPr>
+          <w:rFonts w:ascii="Segoe UI Light" w:hAnsi="Segoe UI Light" w:cs="Segoe UI Light"/>
+        </w:rPr>
+        <w:t>“the knowledge of good and bad.”</w:t>
+      </w:r>
+      <w:r>
+        <w:rPr>
+          <w:rFonts w:ascii="Segoe UI Light" w:hAnsi="Segoe UI Light" w:cs="Segoe UI Light"/>
+        </w:rPr>
+        <w:t xml:space="preserve"> And the reason why he is rightfully called a murderer</w:t>
+      </w:r>
+      <w:r>
+        <w:rPr>
+          <w:rFonts w:ascii="Segoe UI Light" w:hAnsi="Segoe UI Light" w:cs="Segoe UI Light"/>
+        </w:rPr>
+        <w:t xml:space="preserve">, or “the one having the means to cause death” – Hebrews </w:t>
+      </w:r>
+      <w:r>
+        <w:rPr>
+          <w:rFonts w:ascii="Segoe UI Light" w:hAnsi="Segoe UI Light" w:cs="Segoe UI Light"/>
+        </w:rPr>
+        <w:t>2</w:t>
+      </w:r>
+      <w:r>
+        <w:rPr>
+          <w:rFonts w:ascii="Segoe UI Light" w:hAnsi="Segoe UI Light" w:cs="Segoe UI Light"/>
+        </w:rPr>
+        <w:t>:14.</w:t>
+      </w:r>
+    </w:p>
+    <w:p>
+      <w:pPr>
+        <w:ind w:left="1440"/>
+        <w:rPr>
+          <w:rFonts w:ascii="Segoe UI Light" w:hAnsi="Segoe UI Light" w:cs="Segoe UI Light"/>
+          <w:b/>
+          <w:bCs/>
+          <w:color w:val="BF8F00" w:themeColor="accent4" w:themeShade="BF"/>
+        </w:rPr>
+      </w:pPr>
+      <w:r>
+        <w:rPr>
+          <w:rFonts w:ascii="Segoe UI Light" w:hAnsi="Segoe UI Light" w:cs="Segoe UI Light"/>
+          <w:b/>
+          <w:bCs/>
+          <w:color w:val="BF8F00" w:themeColor="accent4" w:themeShade="BF"/>
+        </w:rPr>
+        <w:t>The first root cause of death is Satan.</w:t>
+      </w:r>
+    </w:p>
+    <w:p>
+      <w:pPr>
+        <w:ind w:left="720"/>
+        <w:rPr>
+          <w:rFonts w:ascii="Segoe UI Light" w:hAnsi="Segoe UI Light" w:cs="Segoe UI Light"/>
+        </w:rPr>
+      </w:pPr>
+      <w:r>
+        <w:rPr>
+          <w:rFonts w:ascii="Segoe UI Light" w:hAnsi="Segoe UI Light" w:cs="Segoe UI Light"/>
+          <w:b/>
+          <w:bCs/>
+        </w:rPr>
+        <w:t>Romans 5:12:</w:t>
+      </w:r>
+    </w:p>
+    <w:p>
+      <w:pPr>
+        <w:pStyle w:val="ListParagraph"/>
+        <w:numPr>
+          <w:ilvl w:val="0"/>
+          <w:numId w:val="26"/>
+        </w:numPr>
+        <w:rPr>
+          <w:rFonts w:ascii="Segoe UI Light" w:hAnsi="Segoe UI Light" w:cs="Segoe UI Light"/>
+        </w:rPr>
+      </w:pPr>
+      <w:r>
+        <w:rPr>
+          <w:rFonts w:ascii="Segoe UI Light" w:hAnsi="Segoe UI Light" w:cs="Segoe UI Light"/>
+        </w:rPr>
+        <w:t>The “</w:t>
+      </w:r>
+      <w:r>
+        <w:rPr>
+          <w:rFonts w:ascii="Segoe UI Light" w:hAnsi="Segoe UI Light" w:cs="Segoe UI Light"/>
+          <w:i/>
+          <w:iCs/>
+        </w:rPr>
+        <w:t>o</w:t>
+      </w:r>
+      <w:r>
+        <w:rPr>
+          <w:rFonts w:ascii="Segoe UI Light" w:hAnsi="Segoe UI Light" w:cs="Segoe UI Light"/>
+          <w:i/>
+          <w:iCs/>
+        </w:rPr>
+        <w:t>ne man</w:t>
+      </w:r>
+      <w:r>
+        <w:rPr>
+          <w:rFonts w:ascii="Segoe UI Light" w:hAnsi="Segoe UI Light" w:cs="Segoe UI Light"/>
+        </w:rPr>
+        <w:t>”</w:t>
+      </w:r>
+      <w:r>
+        <w:rPr>
+          <w:rFonts w:ascii="Segoe UI Light" w:hAnsi="Segoe UI Light" w:cs="Segoe UI Light"/>
+        </w:rPr>
+        <w:t xml:space="preserve"> is Adam.</w:t>
+      </w:r>
+    </w:p>
+    <w:p>
+      <w:pPr>
+        <w:pStyle w:val="ListParagraph"/>
+        <w:numPr>
+          <w:ilvl w:val="0"/>
+          <w:numId w:val="26"/>
+        </w:numPr>
+        <w:rPr>
+          <w:rFonts w:ascii="Segoe UI Light" w:hAnsi="Segoe UI Light" w:cs="Segoe UI Light"/>
+        </w:rPr>
+      </w:pPr>
+      <w:r>
+        <w:rPr>
+          <w:rFonts w:ascii="Segoe UI Light" w:hAnsi="Segoe UI Light" w:cs="Segoe UI Light"/>
+        </w:rPr>
+        <w:t>“Sin entered into the world”: by disobeying, Adam became a sinner.</w:t>
+      </w:r>
+      <w:r>
+        <w:rPr>
+          <w:rFonts w:ascii="Segoe UI Light" w:hAnsi="Segoe UI Light" w:cs="Segoe UI Light"/>
+        </w:rPr>
+        <w:t xml:space="preserve"> Adam passed on </w:t>
+      </w:r>
+      <w:r>
+        <w:rPr>
+          <w:rFonts w:ascii="Segoe UI Light" w:hAnsi="Segoe UI Light" w:cs="Segoe UI Light"/>
+        </w:rPr>
+        <w:t>his</w:t>
+      </w:r>
+      <w:r>
+        <w:rPr>
+          <w:rFonts w:ascii="Segoe UI Light" w:hAnsi="Segoe UI Light" w:cs="Segoe UI Light"/>
+        </w:rPr>
+        <w:t xml:space="preserve"> sinful nature to his descendants.</w:t>
+      </w:r>
+    </w:p>
+    <w:p>
+      <w:pPr>
+        <w:pStyle w:val="ListParagraph"/>
+        <w:numPr>
+          <w:ilvl w:val="0"/>
+          <w:numId w:val="26"/>
+        </w:numPr>
+        <w:rPr>
+          <w:rFonts w:ascii="Segoe UI Light" w:hAnsi="Segoe UI Light" w:cs="Segoe UI Light"/>
+        </w:rPr>
+      </w:pPr>
+      <w:r>
+        <w:rPr>
+          <w:rFonts w:ascii="Segoe UI Light" w:hAnsi="Segoe UI Light" w:cs="Segoe UI Light"/>
+        </w:rPr>
+        <w:t xml:space="preserve">“Death through sin”: </w:t>
+      </w:r>
+      <w:r>
+        <w:rPr>
+          <w:rFonts w:ascii="Segoe UI Light" w:hAnsi="Segoe UI Light" w:cs="Segoe UI Light"/>
+        </w:rPr>
+        <w:t>The penalty was set by Jehovah’s own words. Sin</w:t>
+      </w:r>
+      <w:r>
+        <w:rPr>
+          <w:rFonts w:ascii="Segoe UI Light" w:hAnsi="Segoe UI Light" w:cs="Segoe UI Light"/>
+        </w:rPr>
+        <w:t xml:space="preserve"> [disobedience in this case]</w:t>
+      </w:r>
+      <w:r>
+        <w:rPr>
+          <w:rFonts w:ascii="Segoe UI Light" w:hAnsi="Segoe UI Light" w:cs="Segoe UI Light"/>
+        </w:rPr>
+        <w:t xml:space="preserve"> leads to death</w:t>
+      </w:r>
+      <w:r>
+        <w:rPr>
+          <w:rFonts w:ascii="Segoe UI Light" w:hAnsi="Segoe UI Light" w:cs="Segoe UI Light"/>
+        </w:rPr>
+        <w:t xml:space="preserve">. </w:t>
+      </w:r>
+      <w:r>
+        <w:rPr>
+          <w:rFonts w:ascii="Segoe UI Light" w:hAnsi="Segoe UI Light" w:cs="Segoe UI Light"/>
+        </w:rPr>
+        <w:t xml:space="preserve">That would have happened whether or not the devil had influenced </w:t>
+      </w:r>
+      <w:r>
+        <w:rPr>
+          <w:rFonts w:ascii="Segoe UI Light" w:hAnsi="Segoe UI Light" w:cs="Segoe UI Light"/>
+        </w:rPr>
+        <w:t>Adam</w:t>
+      </w:r>
+      <w:r>
+        <w:rPr>
+          <w:rFonts w:ascii="Segoe UI Light" w:hAnsi="Segoe UI Light" w:cs="Segoe UI Light"/>
+        </w:rPr>
+        <w:t>.</w:t>
+      </w:r>
+    </w:p>
+    <w:p>
+      <w:pPr>
+        <w:pStyle w:val="ListParagraph"/>
+        <w:ind w:left="1440"/>
+        <w:rPr>
+          <w:rFonts w:ascii="Segoe UI Light" w:hAnsi="Segoe UI Light" w:cs="Segoe UI Light"/>
+        </w:rPr>
+      </w:pPr>
+    </w:p>
+    <w:p>
+      <w:pPr>
+        <w:pStyle w:val="ListParagraph"/>
+        <w:ind w:left="1080"/>
+        <w:rPr>
+          <w:rFonts w:ascii="Segoe UI Light" w:hAnsi="Segoe UI Light" w:cs="Segoe UI Light"/>
+          <w:b/>
+          <w:bCs/>
+          <w:color w:val="BF8F00" w:themeColor="accent4" w:themeShade="BF"/>
+        </w:rPr>
+      </w:pPr>
+      <w:r>
+        <w:rPr>
+          <w:rFonts w:ascii="Segoe UI Light" w:hAnsi="Segoe UI Light" w:cs="Segoe UI Light"/>
+          <w:b/>
+          <w:bCs/>
+          <w:color w:val="BF8F00" w:themeColor="accent4" w:themeShade="BF"/>
+        </w:rPr>
+        <w:t>So</w:t>
+      </w:r>
+      <w:r>
+        <w:rPr>
+          <w:rFonts w:ascii="Segoe UI Light" w:hAnsi="Segoe UI Light" w:cs="Segoe UI Light"/>
+          <w:b/>
+          <w:bCs/>
+          <w:color w:val="BF8F00" w:themeColor="accent4" w:themeShade="BF"/>
+        </w:rPr>
+        <w:t>,</w:t>
+      </w:r>
+      <w:r>
+        <w:rPr>
+          <w:rFonts w:ascii="Segoe UI Light" w:hAnsi="Segoe UI Light" w:cs="Segoe UI Light"/>
+          <w:b/>
+          <w:bCs/>
+          <w:color w:val="BF8F00" w:themeColor="accent4" w:themeShade="BF"/>
+        </w:rPr>
+        <w:t xml:space="preserve"> the second root cause of death is sin.</w:t>
+      </w:r>
+    </w:p>
+    <w:p>
+      <w:pPr>
+        <w:ind w:left="720"/>
+        <w:rPr>
+          <w:rFonts w:ascii="Segoe UI Light" w:hAnsi="Segoe UI Light" w:cs="Segoe UI Light"/>
+        </w:rPr>
+      </w:pPr>
+      <w:r>
+        <w:rPr>
+          <w:rFonts w:ascii="Segoe UI Light" w:hAnsi="Segoe UI Light" w:cs="Segoe UI Light"/>
+        </w:rPr>
+        <w:t xml:space="preserve">We identified the origin and the direct cause </w:t>
+      </w:r>
+      <w:r>
+        <w:rPr>
+          <w:rFonts w:ascii="Segoe UI Light" w:hAnsi="Segoe UI Light" w:cs="Segoe UI Light"/>
+        </w:rPr>
+        <w:t xml:space="preserve">of death: Satan and sin. </w:t>
+      </w:r>
+    </w:p>
+    <w:p>
+      <w:pPr>
+        <w:spacing w:after="0"/>
+        <w:ind w:left="720" w:hanging="720"/>
+        <w:rPr>
+          <w:rFonts w:ascii="Segoe UI Light" w:hAnsi="Segoe UI Light" w:cs="Segoe UI Light"/>
+        </w:rPr>
+      </w:pPr>
+      <w:r>
+        <w:rPr>
+          <w:rFonts w:ascii="Segoe UI Light" w:hAnsi="Segoe UI Light" w:cs="Segoe UI Light"/>
+        </w:rPr>
+        <w:t>If</w:t>
+      </w:r>
+      <w:r>
+        <w:rPr>
+          <w:rFonts w:ascii="Segoe UI Light" w:hAnsi="Segoe UI Light" w:cs="Segoe UI Light"/>
+        </w:rPr>
+        <w:t xml:space="preserve"> death comes from Satan and sin, what would a real solution have to accomplish? </w:t>
+      </w:r>
+    </w:p>
+    <w:p>
+      <w:pPr>
+        <w:ind w:left="1440" w:hanging="720"/>
+        <w:rPr>
+          <w:rFonts w:ascii="Segoe UI Light" w:hAnsi="Segoe UI Light" w:cs="Segoe UI Light"/>
+        </w:rPr>
+      </w:pPr>
+      <w:r>
+        <w:rPr>
+          <w:rFonts w:ascii="Segoe UI Light" w:hAnsi="Segoe UI Light" w:cs="Segoe UI Light"/>
+          <w:b/>
+          <w:bCs/>
+          <w:color w:val="C00000"/>
+        </w:rPr>
+        <w:t>[</w:t>
+      </w:r>
+      <w:r>
+        <w:rPr>
+          <w:rFonts w:ascii="Segoe UI Light" w:hAnsi="Segoe UI Light" w:cs="Segoe UI Light"/>
+          <w:b/>
+          <w:bCs/>
+          <w:color w:val="C00000"/>
+        </w:rPr>
+        <w:t>P</w:t>
+      </w:r>
+      <w:r>
+        <w:rPr>
+          <w:rFonts w:ascii="Segoe UI Light" w:hAnsi="Segoe UI Light" w:cs="Segoe UI Light"/>
+          <w:b/>
+          <w:bCs/>
+          <w:color w:val="C00000"/>
+        </w:rPr>
+        <w:t>aus</w:t>
+      </w:r>
+      <w:r>
+        <w:rPr>
+          <w:rFonts w:ascii="Segoe UI Light" w:hAnsi="Segoe UI Light" w:cs="Segoe UI Light"/>
+          <w:b/>
+          <w:bCs/>
+          <w:color w:val="C00000"/>
+        </w:rPr>
+        <w:t>e</w:t>
+      </w:r>
+      <w:r>
+        <w:rPr>
+          <w:rFonts w:ascii="Segoe UI Light" w:hAnsi="Segoe UI Light" w:cs="Segoe UI Light"/>
+          <w:b/>
+          <w:bCs/>
+          <w:color w:val="C00000"/>
+        </w:rPr>
+        <w:t>]</w:t>
+      </w:r>
+      <w:r>
+        <w:rPr>
+          <w:rFonts w:ascii="Segoe UI Light" w:hAnsi="Segoe UI Light" w:cs="Segoe UI Light"/>
+        </w:rPr>
+        <w:t xml:space="preserve"> </w:t>
+      </w:r>
+      <w:r>
+        <w:rPr>
+          <w:rFonts w:ascii="Segoe UI Light" w:hAnsi="Segoe UI Light" w:cs="Segoe UI Light"/>
+        </w:rPr>
+        <w:t>What provision has Jehovah already made for</w:t>
+      </w:r>
+      <w:r>
+        <w:rPr>
+          <w:rFonts w:ascii="Segoe UI Light" w:hAnsi="Segoe UI Light" w:cs="Segoe UI Light"/>
+        </w:rPr>
+        <w:t xml:space="preserve"> </w:t>
+      </w:r>
+      <w:r>
+        <w:rPr>
+          <w:rFonts w:ascii="Segoe UI Light" w:hAnsi="Segoe UI Light" w:cs="Segoe UI Light"/>
+        </w:rPr>
+        <w:t>that?</w:t>
+      </w:r>
+    </w:p>
+    <w:p>
+      <w:pPr>
+        <w:pStyle w:val="ListParagraph"/>
+        <w:numPr>
+          <w:ilvl w:val="1"/>
+          <w:numId w:val="27"/>
+        </w:numPr>
+        <w:rPr>
+          <w:rFonts w:ascii="Segoe UI Light" w:hAnsi="Segoe UI Light" w:cs="Segoe UI Light"/>
+          <w:color w:val="000000" w:themeColor="text1"/>
+        </w:rPr>
+      </w:pPr>
+      <w:r>
+        <w:rPr>
+          <w:rFonts w:ascii="Segoe UI Light" w:hAnsi="Segoe UI Light" w:cs="Segoe UI Light"/>
+          <w:b/>
+          <w:bCs/>
+          <w:color w:val="000000" w:themeColor="text1"/>
+        </w:rPr>
+        <w:t>[Provision #1] Genesis 3:15 – the sentence on the Serpent</w:t>
+      </w:r>
+      <w:r>
+        <w:rPr>
+          <w:rFonts w:ascii="Segoe UI Light" w:hAnsi="Segoe UI Light" w:cs="Segoe UI Light"/>
+          <w:color w:val="000000" w:themeColor="text1"/>
+        </w:rPr>
+        <w:t>.</w:t>
+      </w:r>
+    </w:p>
+    <w:p>
+      <w:pPr>
+        <w:pStyle w:val="ListParagraph"/>
+        <w:numPr>
+          <w:ilvl w:val="2"/>
+          <w:numId w:val="27"/>
+        </w:numPr>
+        <w:rPr>
+          <w:rFonts w:ascii="Segoe UI Light" w:hAnsi="Segoe UI Light" w:cs="Segoe UI Light"/>
+          <w:color w:val="000000" w:themeColor="text1"/>
+        </w:rPr>
+      </w:pPr>
+      <w:r>
+        <w:rPr>
+          <w:rFonts w:ascii="Segoe UI Light" w:hAnsi="Segoe UI Light" w:cs="Segoe UI Light"/>
+          <w:color w:val="000000" w:themeColor="text1"/>
+        </w:rPr>
+        <w:t xml:space="preserve">The </w:t>
+      </w:r>
+      <w:r>
+        <w:rPr>
+          <w:rFonts w:ascii="Segoe UI Light" w:hAnsi="Segoe UI Light" w:cs="Segoe UI Light"/>
+          <w:i/>
+          <w:iCs/>
+          <w:color w:val="000000" w:themeColor="text1"/>
+        </w:rPr>
+        <w:t>Serpent</w:t>
+      </w:r>
+      <w:r>
+        <w:rPr>
+          <w:rFonts w:ascii="Segoe UI Light" w:hAnsi="Segoe UI Light" w:cs="Segoe UI Light"/>
+          <w:color w:val="000000" w:themeColor="text1"/>
+        </w:rPr>
+        <w:t xml:space="preserve"> – Satan</w:t>
+      </w:r>
+    </w:p>
+    <w:p>
+      <w:pPr>
+        <w:pStyle w:val="ListParagraph"/>
+        <w:numPr>
+          <w:ilvl w:val="2"/>
+          <w:numId w:val="27"/>
+        </w:numPr>
+        <w:rPr>
+          <w:rFonts w:ascii="Segoe UI Light" w:hAnsi="Segoe UI Light" w:cs="Segoe UI Light"/>
+          <w:color w:val="000000" w:themeColor="text1"/>
+        </w:rPr>
+      </w:pPr>
+      <w:r>
+        <w:rPr>
+          <w:rFonts w:ascii="Segoe UI Light" w:hAnsi="Segoe UI Light" w:cs="Segoe UI Light"/>
+          <w:color w:val="000000" w:themeColor="text1"/>
+        </w:rPr>
+        <w:t xml:space="preserve">The </w:t>
+      </w:r>
+      <w:r>
+        <w:rPr>
+          <w:rFonts w:ascii="Segoe UI Light" w:hAnsi="Segoe UI Light" w:cs="Segoe UI Light"/>
+          <w:i/>
+          <w:iCs/>
+          <w:color w:val="000000" w:themeColor="text1"/>
+        </w:rPr>
+        <w:t>woman</w:t>
+      </w:r>
+      <w:r>
+        <w:rPr>
+          <w:rFonts w:ascii="Segoe UI Light" w:hAnsi="Segoe UI Light" w:cs="Segoe UI Light"/>
+          <w:color w:val="000000" w:themeColor="text1"/>
+        </w:rPr>
+        <w:t xml:space="preserve"> – God heavenly organization made of faithful spirit creatures</w:t>
+      </w:r>
+    </w:p>
+    <w:p>
+      <w:pPr>
+        <w:pStyle w:val="ListParagraph"/>
+        <w:numPr>
+          <w:ilvl w:val="2"/>
+          <w:numId w:val="27"/>
+        </w:numPr>
+        <w:rPr>
+          <w:rFonts w:ascii="Segoe UI Light" w:hAnsi="Segoe UI Light" w:cs="Segoe UI Light"/>
+          <w:color w:val="000000" w:themeColor="text1"/>
+        </w:rPr>
+      </w:pPr>
+      <w:r>
+        <w:rPr>
+          <w:rFonts w:ascii="Segoe UI Light" w:hAnsi="Segoe UI Light" w:cs="Segoe UI Light"/>
+          <w:color w:val="000000" w:themeColor="text1"/>
+        </w:rPr>
+        <w:t xml:space="preserve">The </w:t>
+      </w:r>
+      <w:r>
+        <w:rPr>
+          <w:rFonts w:ascii="Segoe UI Light" w:hAnsi="Segoe UI Light" w:cs="Segoe UI Light"/>
+          <w:i/>
+          <w:iCs/>
+          <w:color w:val="000000" w:themeColor="text1"/>
+        </w:rPr>
+        <w:t>serpent’s offspring</w:t>
+      </w:r>
+      <w:r>
+        <w:rPr>
+          <w:rFonts w:ascii="Segoe UI Light" w:hAnsi="Segoe UI Light" w:cs="Segoe UI Light"/>
+          <w:color w:val="000000" w:themeColor="text1"/>
+        </w:rPr>
+        <w:t xml:space="preserve"> – all those who follow Satan rebellion</w:t>
+      </w:r>
+    </w:p>
+    <w:p>
+      <w:pPr>
+        <w:pStyle w:val="ListParagraph"/>
+        <w:numPr>
+          <w:ilvl w:val="2"/>
+          <w:numId w:val="27"/>
+        </w:numPr>
+        <w:rPr>
+          <w:rFonts w:ascii="Segoe UI Light" w:hAnsi="Segoe UI Light" w:cs="Segoe UI Light"/>
+          <w:color w:val="000000" w:themeColor="text1"/>
+        </w:rPr>
+      </w:pPr>
+      <w:r>
+        <w:rPr>
+          <w:rFonts w:ascii="Segoe UI Light" w:hAnsi="Segoe UI Light" w:cs="Segoe UI Light"/>
+          <w:color w:val="000000" w:themeColor="text1"/>
+        </w:rPr>
+        <w:t xml:space="preserve">The </w:t>
+      </w:r>
+      <w:r>
+        <w:rPr>
+          <w:rFonts w:ascii="Segoe UI Light" w:hAnsi="Segoe UI Light" w:cs="Segoe UI Light"/>
+          <w:i/>
+          <w:iCs/>
+          <w:color w:val="000000" w:themeColor="text1"/>
+        </w:rPr>
+        <w:t>woman’s offspring</w:t>
+      </w:r>
+      <w:r>
+        <w:rPr>
+          <w:rFonts w:ascii="Segoe UI Light" w:hAnsi="Segoe UI Light" w:cs="Segoe UI Light"/>
+          <w:color w:val="000000" w:themeColor="text1"/>
+        </w:rPr>
+        <w:t xml:space="preserve"> – Jesus Christ</w:t>
+      </w:r>
+      <w:r>
+        <w:rPr>
+          <w:rFonts w:ascii="Segoe UI Light" w:hAnsi="Segoe UI Light" w:cs="Segoe UI Light"/>
+          <w:color w:val="000000" w:themeColor="text1"/>
+        </w:rPr>
+        <w:t>.</w:t>
+      </w:r>
+    </w:p>
+    <w:p>
+      <w:pPr>
+        <w:pStyle w:val="ListParagraph"/>
+        <w:numPr>
+          <w:ilvl w:val="3"/>
+          <w:numId w:val="27"/>
+        </w:numPr>
+        <w:rPr>
+          <w:rFonts w:ascii="Segoe UI Light" w:hAnsi="Segoe UI Light" w:cs="Segoe UI Light"/>
+          <w:color w:val="000000" w:themeColor="text1"/>
+        </w:rPr>
+      </w:pPr>
+      <w:r>
+        <w:rPr>
+          <w:rFonts w:ascii="Segoe UI Light" w:hAnsi="Segoe UI Light" w:cs="Segoe UI Light"/>
+          <w:color w:val="000000" w:themeColor="text1"/>
+        </w:rPr>
+        <w:t>Did you know? The name Jesus was directly picked by Jehovah.</w:t>
+      </w:r>
+    </w:p>
+    <w:p>
+      <w:pPr>
+        <w:pStyle w:val="ListParagraph"/>
+        <w:numPr>
+          <w:ilvl w:val="3"/>
+          <w:numId w:val="27"/>
+        </w:numPr>
+        <w:rPr>
+          <w:rFonts w:ascii="Segoe UI Light" w:hAnsi="Segoe UI Light" w:cs="Segoe UI Light"/>
+          <w:color w:val="000000" w:themeColor="text1"/>
+        </w:rPr>
+      </w:pPr>
+      <w:r>
+        <w:rPr>
+          <w:rFonts w:ascii="Segoe UI Light" w:hAnsi="Segoe UI Light" w:cs="Segoe UI Light"/>
+          <w:color w:val="000000" w:themeColor="text1"/>
+        </w:rPr>
+        <w:t xml:space="preserve">It was a prophetic name – Jesus means </w:t>
+      </w:r>
+      <w:r>
+        <w:rPr>
+          <w:rFonts w:ascii="Segoe UI Light" w:hAnsi="Segoe UI Light" w:cs="Segoe UI Light"/>
+          <w:color w:val="000000" w:themeColor="text1"/>
+        </w:rPr>
+        <w:t>Jehovah is Salvation</w:t>
+      </w:r>
+      <w:r>
+        <w:rPr>
+          <w:rFonts w:ascii="Segoe UI Light" w:hAnsi="Segoe UI Light" w:cs="Segoe UI Light"/>
+          <w:color w:val="000000" w:themeColor="text1"/>
+        </w:rPr>
+        <w:t>.</w:t>
+      </w:r>
+    </w:p>
+    <w:p>
+      <w:pPr>
+        <w:rPr>
+          <w:rFonts w:ascii="Segoe UI Light" w:hAnsi="Segoe UI Light" w:cs="Segoe UI Light"/>
+        </w:rPr>
+      </w:pPr>
+    </w:p>
+    <w:p>
+      <w:pPr>
+        <w:rPr>
+          <w:rFonts w:ascii="Segoe UI Light" w:hAnsi="Segoe UI Light" w:cs="Segoe UI Light"/>
+        </w:rPr>
+      </w:pPr>
     </w:p>
     <w:p>
       <w:pPr>
@@ -5900,6 +6858,116 @@
     </w:lvl>
   </w:abstractNum>
   <w:abstractNum w:abstractNumId="16" w15:restartNumberingAfterBreak="0">
+    <w:nsid w:val="32F46B80"/>
+    <w:multiLevelType w:val="hybridMultilevel"/>
+    <w:tmpl w:val="9D381AD8"/>
+    <w:lvl w:ilvl="0" w:tplc="10090001">
+      <w:start w:val="1"/>
+      <w:numFmt w:val="bullet"/>
+      <w:lvlText w:val=""/>
+      <w:lvlJc w:val="left"/>
+      <w:pPr>
+        <w:ind w:left="1440" w:hanging="360"/>
+      </w:pPr>
+      <w:rPr>
+        <w:rFonts w:ascii="Symbol" w:hAnsi="Symbol" w:hint="default"/>
+      </w:rPr>
+    </w:lvl>
+    <w:lvl w:ilvl="1" w:tplc="1009000F">
+      <w:start w:val="1"/>
+      <w:numFmt w:val="decimal"/>
+      <w:lvlText w:val="%2."/>
+      <w:lvlJc w:val="left"/>
+      <w:pPr>
+        <w:ind w:left="720" w:hanging="360"/>
+      </w:pPr>
+    </w:lvl>
+    <w:lvl w:ilvl="2" w:tplc="10090001">
+      <w:start w:val="1"/>
+      <w:numFmt w:val="bullet"/>
+      <w:lvlText w:val=""/>
+      <w:lvlJc w:val="left"/>
+      <w:pPr>
+        <w:ind w:left="1440" w:hanging="360"/>
+      </w:pPr>
+      <w:rPr>
+        <w:rFonts w:ascii="Symbol" w:hAnsi="Symbol" w:hint="default"/>
+      </w:rPr>
+    </w:lvl>
+    <w:lvl w:ilvl="3" w:tplc="10090003">
+      <w:start w:val="1"/>
+      <w:numFmt w:val="bullet"/>
+      <w:lvlText w:val="o"/>
+      <w:lvlJc w:val="left"/>
+      <w:pPr>
+        <w:ind w:left="2160" w:hanging="360"/>
+      </w:pPr>
+      <w:rPr>
+        <w:rFonts w:ascii="Courier New" w:hAnsi="Courier New" w:cs="Courier New" w:hint="default"/>
+      </w:rPr>
+    </w:lvl>
+    <w:lvl w:ilvl="4" w:tplc="10090003" w:tentative="1">
+      <w:start w:val="1"/>
+      <w:numFmt w:val="bullet"/>
+      <w:lvlText w:val="o"/>
+      <w:lvlJc w:val="left"/>
+      <w:pPr>
+        <w:ind w:left="4320" w:hanging="360"/>
+      </w:pPr>
+      <w:rPr>
+        <w:rFonts w:ascii="Courier New" w:hAnsi="Courier New" w:cs="Courier New" w:hint="default"/>
+      </w:rPr>
+    </w:lvl>
+    <w:lvl w:ilvl="5" w:tplc="10090005" w:tentative="1">
+      <w:start w:val="1"/>
+      <w:numFmt w:val="bullet"/>
+      <w:lvlText w:val=""/>
+      <w:lvlJc w:val="left"/>
+      <w:pPr>
+        <w:ind w:left="5040" w:hanging="360"/>
+      </w:pPr>
+      <w:rPr>
+        <w:rFonts w:ascii="Wingdings" w:hAnsi="Wingdings" w:hint="default"/>
+      </w:rPr>
+    </w:lvl>
+    <w:lvl w:ilvl="6" w:tplc="10090001" w:tentative="1">
+      <w:start w:val="1"/>
+      <w:numFmt w:val="bullet"/>
+      <w:lvlText w:val=""/>
+      <w:lvlJc w:val="left"/>
+      <w:pPr>
+        <w:ind w:left="5760" w:hanging="360"/>
+      </w:pPr>
+      <w:rPr>
+        <w:rFonts w:ascii="Symbol" w:hAnsi="Symbol" w:hint="default"/>
+      </w:rPr>
+    </w:lvl>
+    <w:lvl w:ilvl="7" w:tplc="10090003" w:tentative="1">
+      <w:start w:val="1"/>
+      <w:numFmt w:val="bullet"/>
+      <w:lvlText w:val="o"/>
+      <w:lvlJc w:val="left"/>
+      <w:pPr>
+        <w:ind w:left="6480" w:hanging="360"/>
+      </w:pPr>
+      <w:rPr>
+        <w:rFonts w:ascii="Courier New" w:hAnsi="Courier New" w:cs="Courier New" w:hint="default"/>
+      </w:rPr>
+    </w:lvl>
+    <w:lvl w:ilvl="8" w:tplc="10090005" w:tentative="1">
+      <w:start w:val="1"/>
+      <w:numFmt w:val="bullet"/>
+      <w:lvlText w:val=""/>
+      <w:lvlJc w:val="left"/>
+      <w:pPr>
+        <w:ind w:left="7200" w:hanging="360"/>
+      </w:pPr>
+      <w:rPr>
+        <w:rFonts w:ascii="Wingdings" w:hAnsi="Wingdings" w:hint="default"/>
+      </w:rPr>
+    </w:lvl>
+  </w:abstractNum>
+  <w:abstractNum w:abstractNumId="17" w15:restartNumberingAfterBreak="0">
     <w:nsid w:val="3E4E7E1D"/>
     <w:multiLevelType w:val="hybridMultilevel"/>
     <w:tmpl w:val="C4183DF8"/>
@@ -6012,7 +7080,7 @@
       </w:rPr>
     </w:lvl>
   </w:abstractNum>
-  <w:abstractNum w:abstractNumId="17" w15:restartNumberingAfterBreak="0">
+  <w:abstractNum w:abstractNumId="18" w15:restartNumberingAfterBreak="0">
     <w:nsid w:val="3EC24676"/>
     <w:multiLevelType w:val="hybridMultilevel"/>
     <w:tmpl w:val="AD10C83C"/>
@@ -6098,7 +7166,7 @@
       </w:pPr>
     </w:lvl>
   </w:abstractNum>
-  <w:abstractNum w:abstractNumId="18" w15:restartNumberingAfterBreak="0">
+  <w:abstractNum w:abstractNumId="19" w15:restartNumberingAfterBreak="0">
     <w:nsid w:val="62A116E7"/>
     <w:multiLevelType w:val="hybridMultilevel"/>
     <w:tmpl w:val="AFD28870"/>
@@ -6211,7 +7279,96 @@
       </w:rPr>
     </w:lvl>
   </w:abstractNum>
-  <w:abstractNum w:abstractNumId="19" w15:restartNumberingAfterBreak="0">
+  <w:abstractNum w:abstractNumId="20" w15:restartNumberingAfterBreak="0">
+    <w:nsid w:val="68C51740"/>
+    <w:multiLevelType w:val="hybridMultilevel"/>
+    <w:tmpl w:val="B614CEA8"/>
+    <w:lvl w:ilvl="0" w:tplc="B41E551E">
+      <w:start w:val="1"/>
+      <w:numFmt w:val="decimal"/>
+      <w:lvlText w:val="(%1)"/>
+      <w:lvlJc w:val="left"/>
+      <w:pPr>
+        <w:ind w:left="2520" w:hanging="360"/>
+      </w:pPr>
+      <w:rPr>
+        <w:rFonts w:hint="default"/>
+      </w:rPr>
+    </w:lvl>
+    <w:lvl w:ilvl="1" w:tplc="10090019" w:tentative="1">
+      <w:start w:val="1"/>
+      <w:numFmt w:val="lowerLetter"/>
+      <w:lvlText w:val="%2."/>
+      <w:lvlJc w:val="left"/>
+      <w:pPr>
+        <w:ind w:left="3240" w:hanging="360"/>
+      </w:pPr>
+    </w:lvl>
+    <w:lvl w:ilvl="2" w:tplc="1009001B" w:tentative="1">
+      <w:start w:val="1"/>
+      <w:numFmt w:val="lowerRoman"/>
+      <w:lvlText w:val="%3."/>
+      <w:lvlJc w:val="right"/>
+      <w:pPr>
+        <w:ind w:left="3960" w:hanging="180"/>
+      </w:pPr>
+    </w:lvl>
+    <w:lvl w:ilvl="3" w:tplc="1009000F" w:tentative="1">
+      <w:start w:val="1"/>
+      <w:numFmt w:val="decimal"/>
+      <w:lvlText w:val="%4."/>
+      <w:lvlJc w:val="left"/>
+      <w:pPr>
+        <w:ind w:left="4680" w:hanging="360"/>
+      </w:pPr>
+    </w:lvl>
+    <w:lvl w:ilvl="4" w:tplc="10090019" w:tentative="1">
+      <w:start w:val="1"/>
+      <w:numFmt w:val="lowerLetter"/>
+      <w:lvlText w:val="%5."/>
+      <w:lvlJc w:val="left"/>
+      <w:pPr>
+        <w:ind w:left="5400" w:hanging="360"/>
+      </w:pPr>
+    </w:lvl>
+    <w:lvl w:ilvl="5" w:tplc="1009001B" w:tentative="1">
+      <w:start w:val="1"/>
+      <w:numFmt w:val="lowerRoman"/>
+      <w:lvlText w:val="%6."/>
+      <w:lvlJc w:val="right"/>
+      <w:pPr>
+        <w:ind w:left="6120" w:hanging="180"/>
+      </w:pPr>
+    </w:lvl>
+    <w:lvl w:ilvl="6" w:tplc="1009000F" w:tentative="1">
+      <w:start w:val="1"/>
+      <w:numFmt w:val="decimal"/>
+      <w:lvlText w:val="%7."/>
+      <w:lvlJc w:val="left"/>
+      <w:pPr>
+        <w:ind w:left="6840" w:hanging="360"/>
+      </w:pPr>
+    </w:lvl>
+    <w:lvl w:ilvl="7" w:tplc="10090019" w:tentative="1">
+      <w:start w:val="1"/>
+      <w:numFmt w:val="lowerLetter"/>
+      <w:lvlText w:val="%8."/>
+      <w:lvlJc w:val="left"/>
+      <w:pPr>
+        <w:ind w:left="7560" w:hanging="360"/>
+      </w:pPr>
+    </w:lvl>
+    <w:lvl w:ilvl="8" w:tplc="1009001B" w:tentative="1">
+      <w:start w:val="1"/>
+      <w:numFmt w:val="lowerRoman"/>
+      <w:lvlText w:val="%9."/>
+      <w:lvlJc w:val="right"/>
+      <w:pPr>
+        <w:ind w:left="8280" w:hanging="180"/>
+      </w:pPr>
+    </w:lvl>
+  </w:abstractNum>
+  <w:abstractNum w:abstractNumId="21" w15:restartNumberingAfterBreak="0">
     <w:nsid w:val="69010C8B"/>
     <w:multiLevelType w:val="hybridMultilevel"/>
     <w:tmpl w:val="AB9ACF8C"/>
@@ -6324,7 +7481,120 @@
       </w:rPr>
     </w:lvl>
   </w:abstractNum>
-  <w:abstractNum w:abstractNumId="20" w15:restartNumberingAfterBreak="0">
+  <w:abstractNum w:abstractNumId="22" w15:restartNumberingAfterBreak="0">
+    <w:nsid w:val="6A2C7A5A"/>
+    <w:multiLevelType w:val="hybridMultilevel"/>
+    <w:tmpl w:val="2FB0BC5E"/>
+    <w:lvl w:ilvl="0" w:tplc="10090001">
+      <w:start w:val="1"/>
+      <w:numFmt w:val="bullet"/>
+      <w:lvlText w:val=""/>
+      <w:lvlJc w:val="left"/>
+      <w:pPr>
+        <w:ind w:left="1440" w:hanging="360"/>
+      </w:pPr>
+      <w:rPr>
+        <w:rFonts w:ascii="Symbol" w:hAnsi="Symbol" w:hint="default"/>
+      </w:rPr>
+    </w:lvl>
+    <w:lvl w:ilvl="1" w:tplc="10090003">
+      <w:start w:val="1"/>
+      <w:numFmt w:val="bullet"/>
+      <w:lvlText w:val="o"/>
+      <w:lvlJc w:val="left"/>
+      <w:pPr>
+        <w:ind w:left="2160" w:hanging="360"/>
+      </w:pPr>
+      <w:rPr>
+        <w:rFonts w:ascii="Courier New" w:hAnsi="Courier New" w:cs="Courier New" w:hint="default"/>
+      </w:rPr>
+    </w:lvl>
+    <w:lvl w:ilvl="2" w:tplc="10090005" w:tentative="1">
+      <w:start w:val="1"/>
+      <w:numFmt w:val="bullet"/>
+      <w:lvlText w:val=""/>
+      <w:lvlJc w:val="left"/>
+      <w:pPr>
+        <w:ind w:left="2880" w:hanging="360"/>
+      </w:pPr>
+      <w:rPr>
+        <w:rFonts w:ascii="Wingdings" w:hAnsi="Wingdings" w:hint="default"/>
+      </w:rPr>
+    </w:lvl>
+    <w:lvl w:ilvl="3" w:tplc="10090001" w:tentative="1">
+      <w:start w:val="1"/>
+      <w:numFmt w:val="bullet"/>
+      <w:lvlText w:val=""/>
+      <w:lvlJc w:val="left"/>
+      <w:pPr>
+        <w:ind w:left="3600" w:hanging="360"/>
+      </w:pPr>
+      <w:rPr>
+        <w:rFonts w:ascii="Symbol" w:hAnsi="Symbol" w:hint="default"/>
+      </w:rPr>
+    </w:lvl>
+    <w:lvl w:ilvl="4" w:tplc="10090003" w:tentative="1">
+      <w:start w:val="1"/>
+      <w:numFmt w:val="bullet"/>
+      <w:lvlText w:val="o"/>
+      <w:lvlJc w:val="left"/>
+      <w:pPr>
+        <w:ind w:left="4320" w:hanging="360"/>
+      </w:pPr>
+      <w:rPr>
+        <w:rFonts w:ascii="Courier New" w:hAnsi="Courier New" w:cs="Courier New" w:hint="default"/>
+      </w:rPr>
+    </w:lvl>
+    <w:lvl w:ilvl="5" w:tplc="10090005" w:tentative="1">
+      <w:start w:val="1"/>
+      <w:numFmt w:val="bullet"/>
+      <w:lvlText w:val=""/>
+      <w:lvlJc w:val="left"/>
+      <w:pPr>
+        <w:ind w:left="5040" w:hanging="360"/>
+      </w:pPr>
+      <w:rPr>
+        <w:rFonts w:ascii="Wingdings" w:hAnsi="Wingdings" w:hint="default"/>
+      </w:rPr>
+    </w:lvl>
+    <w:lvl w:ilvl="6" w:tplc="10090001" w:tentative="1">
+      <w:start w:val="1"/>
+      <w:numFmt w:val="bullet"/>
+      <w:lvlText w:val=""/>
+      <w:lvlJc w:val="left"/>
+      <w:pPr>
+        <w:ind w:left="5760" w:hanging="360"/>
+      </w:pPr>
+      <w:rPr>
+        <w:rFonts w:ascii="Symbol" w:hAnsi="Symbol" w:hint="default"/>
+      </w:rPr>
+    </w:lvl>
+    <w:lvl w:ilvl="7" w:tplc="10090003" w:tentative="1">
+      <w:start w:val="1"/>
+      <w:numFmt w:val="bullet"/>
+      <w:lvlText w:val="o"/>
+      <w:lvlJc w:val="left"/>
+      <w:pPr>
+        <w:ind w:left="6480" w:hanging="360"/>
+      </w:pPr>
+      <w:rPr>
+        <w:rFonts w:ascii="Courier New" w:hAnsi="Courier New" w:cs="Courier New" w:hint="default"/>
+      </w:rPr>
+    </w:lvl>
+    <w:lvl w:ilvl="8" w:tplc="10090005" w:tentative="1">
+      <w:start w:val="1"/>
+      <w:numFmt w:val="bullet"/>
+      <w:lvlText w:val=""/>
+      <w:lvlJc w:val="left"/>
+      <w:pPr>
+        <w:ind w:left="7200" w:hanging="360"/>
+      </w:pPr>
+      <w:rPr>
+        <w:rFonts w:ascii="Wingdings" w:hAnsi="Wingdings" w:hint="default"/>
+      </w:rPr>
+    </w:lvl>
+  </w:abstractNum>
+  <w:abstractNum w:abstractNumId="23" w15:restartNumberingAfterBreak="0">
     <w:nsid w:val="72236AAD"/>
     <w:multiLevelType w:val="hybridMultilevel"/>
     <w:tmpl w:val="1FF8BAB6"/>
@@ -6437,7 +7707,7 @@
       </w:rPr>
     </w:lvl>
   </w:abstractNum>
-  <w:abstractNum w:abstractNumId="21" w15:restartNumberingAfterBreak="0">
+  <w:abstractNum w:abstractNumId="24" w15:restartNumberingAfterBreak="0">
     <w:nsid w:val="74CF7FBC"/>
     <w:multiLevelType w:val="hybridMultilevel"/>
     <w:tmpl w:val="454E1412"/>
@@ -6550,7 +7820,7 @@
       </w:rPr>
     </w:lvl>
   </w:abstractNum>
-  <w:abstractNum w:abstractNumId="22" w15:restartNumberingAfterBreak="0">
+  <w:abstractNum w:abstractNumId="25" w15:restartNumberingAfterBreak="0">
     <w:nsid w:val="754071D0"/>
     <w:multiLevelType w:val="hybridMultilevel"/>
     <w:tmpl w:val="3698CDEC"/>
@@ -6636,7 +7906,96 @@
       </w:pPr>
     </w:lvl>
   </w:abstractNum>
-  <w:abstractNum w:abstractNumId="23" w15:restartNumberingAfterBreak="0">
+  <w:abstractNum w:abstractNumId="26" w15:restartNumberingAfterBreak="0">
+    <w:nsid w:val="798F4444"/>
+    <w:multiLevelType w:val="hybridMultilevel"/>
+    <w:tmpl w:val="07767454"/>
+    <w:lvl w:ilvl="0" w:tplc="154A2294">
+      <w:start w:val="1"/>
+      <w:numFmt w:val="decimal"/>
+      <w:lvlText w:val="(%1)"/>
+      <w:lvlJc w:val="left"/>
+      <w:pPr>
+        <w:ind w:left="2520" w:hanging="360"/>
+      </w:pPr>
+      <w:rPr>
+        <w:rFonts w:hint="default"/>
+      </w:rPr>
+    </w:lvl>
+    <w:lvl w:ilvl="1" w:tplc="10090019" w:tentative="1">
+      <w:start w:val="1"/>
+      <w:numFmt w:val="lowerLetter"/>
+      <w:lvlText w:val="%2."/>
+      <w:lvlJc w:val="left"/>
+      <w:pPr>
+        <w:ind w:left="3240" w:hanging="360"/>
+      </w:pPr>
+    </w:lvl>
+    <w:lvl w:ilvl="2" w:tplc="1009001B" w:tentative="1">
+      <w:start w:val="1"/>
+      <w:numFmt w:val="lowerRoman"/>
+      <w:lvlText w:val="%3."/>
+      <w:lvlJc w:val="right"/>
+      <w:pPr>
+        <w:ind w:left="3960" w:hanging="180"/>
+      </w:pPr>
+    </w:lvl>
+    <w:lvl w:ilvl="3" w:tplc="1009000F" w:tentative="1">
+      <w:start w:val="1"/>
+      <w:numFmt w:val="decimal"/>
+      <w:lvlText w:val="%4."/>
+      <w:lvlJc w:val="left"/>
+      <w:pPr>
+        <w:ind w:left="4680" w:hanging="360"/>
+      </w:pPr>
+    </w:lvl>
+    <w:lvl w:ilvl="4" w:tplc="10090019" w:tentative="1">
+      <w:start w:val="1"/>
+      <w:numFmt w:val="lowerLetter"/>
+      <w:lvlText w:val="%5."/>
+      <w:lvlJc w:val="left"/>
+      <w:pPr>
+        <w:ind w:left="5400" w:hanging="360"/>
+      </w:pPr>
+    </w:lvl>
+    <w:lvl w:ilvl="5" w:tplc="1009001B" w:tentative="1">
+      <w:start w:val="1"/>
+      <w:numFmt w:val="lowerRoman"/>
+      <w:lvlText w:val="%6."/>
+      <w:lvlJc w:val="right"/>
+      <w:pPr>
+        <w:ind w:left="6120" w:hanging="180"/>
+      </w:pPr>
+    </w:lvl>
+    <w:lvl w:ilvl="6" w:tplc="1009000F" w:tentative="1">
+      <w:start w:val="1"/>
+      <w:numFmt w:val="decimal"/>
+      <w:lvlText w:val="%7."/>
+      <w:lvlJc w:val="left"/>
+      <w:pPr>
+        <w:ind w:left="6840" w:hanging="360"/>
+      </w:pPr>
+    </w:lvl>
+    <w:lvl w:ilvl="7" w:tplc="10090019" w:tentative="1">
+      <w:start w:val="1"/>
+      <w:numFmt w:val="lowerLetter"/>
+      <w:lvlText w:val="%8."/>
+      <w:lvlJc w:val="left"/>
+      <w:pPr>
+        <w:ind w:left="7560" w:hanging="360"/>
+      </w:pPr>
+    </w:lvl>
+    <w:lvl w:ilvl="8" w:tplc="1009001B" w:tentative="1">
+      <w:start w:val="1"/>
+      <w:numFmt w:val="lowerRoman"/>
+      <w:lvlText w:val="%9."/>
+      <w:lvlJc w:val="right"/>
+      <w:pPr>
+        <w:ind w:left="8280" w:hanging="180"/>
+      </w:pPr>
+    </w:lvl>
+  </w:abstractNum>
+  <w:abstractNum w:abstractNumId="27" w15:restartNumberingAfterBreak="0">
     <w:nsid w:val="7C935A79"/>
     <w:multiLevelType w:val="hybridMultilevel"/>
     <w:tmpl w:val="56686326"/>
@@ -6749,7 +8108,7 @@
       </w:rPr>
     </w:lvl>
   </w:abstractNum>
-  <w:abstractNum w:abstractNumId="24" w15:restartNumberingAfterBreak="0">
+  <w:abstractNum w:abstractNumId="28" w15:restartNumberingAfterBreak="0">
     <w:nsid w:val="7F6C1CAC"/>
     <w:multiLevelType w:val="hybridMultilevel"/>
     <w:tmpl w:val="4E3EFFE6"/>
@@ -6863,16 +8222,16 @@
     </w:lvl>
   </w:abstractNum>
   <w:num w:numId="1" w16cid:durableId="1200126119">
-    <w:abstractNumId w:val="20"/>
+    <w:abstractNumId w:val="23"/>
   </w:num>
   <w:num w:numId="2" w16cid:durableId="2142964796">
     <w:abstractNumId w:val="3"/>
   </w:num>
   <w:num w:numId="3" w16cid:durableId="1686126829">
-    <w:abstractNumId w:val="22"/>
+    <w:abstractNumId w:val="25"/>
   </w:num>
   <w:num w:numId="4" w16cid:durableId="9256738">
-    <w:abstractNumId w:val="17"/>
+    <w:abstractNumId w:val="18"/>
   </w:num>
   <w:num w:numId="5" w16cid:durableId="1929270298">
     <w:abstractNumId w:val="9"/>
@@ -6887,16 +8246,16 @@
     <w:abstractNumId w:val="4"/>
   </w:num>
   <w:num w:numId="9" w16cid:durableId="1623069594">
-    <w:abstractNumId w:val="16"/>
+    <w:abstractNumId w:val="17"/>
   </w:num>
   <w:num w:numId="10" w16cid:durableId="389547150">
-    <w:abstractNumId w:val="19"/>
+    <w:abstractNumId w:val="21"/>
   </w:num>
   <w:num w:numId="11" w16cid:durableId="258147424">
-    <w:abstractNumId w:val="24"/>
+    <w:abstractNumId w:val="28"/>
   </w:num>
   <w:num w:numId="12" w16cid:durableId="1740980150">
-    <w:abstractNumId w:val="21"/>
+    <w:abstractNumId w:val="24"/>
   </w:num>
   <w:num w:numId="13" w16cid:durableId="1889342876">
     <w:abstractNumId w:val="8"/>
@@ -6914,10 +8273,10 @@
     <w:abstractNumId w:val="12"/>
   </w:num>
   <w:num w:numId="18" w16cid:durableId="190342337">
-    <w:abstractNumId w:val="23"/>
+    <w:abstractNumId w:val="27"/>
   </w:num>
   <w:num w:numId="19" w16cid:durableId="1952785505">
-    <w:abstractNumId w:val="18"/>
+    <w:abstractNumId w:val="19"/>
   </w:num>
   <w:num w:numId="20" w16cid:durableId="1591154696">
     <w:abstractNumId w:val="15"/>
@@ -6936,6 +8295,18 @@
   </w:num>
   <w:num w:numId="25" w16cid:durableId="10112469">
     <w:abstractNumId w:val="11"/>
+  </w:num>
+  <w:num w:numId="26" w16cid:durableId="566114269">
+    <w:abstractNumId w:val="22"/>
+  </w:num>
+  <w:num w:numId="27" w16cid:durableId="732119972">
+    <w:abstractNumId w:val="16"/>
+  </w:num>
+  <w:num w:numId="28" w16cid:durableId="528493660">
+    <w:abstractNumId w:val="26"/>
+  </w:num>
+  <w:num w:numId="29" w16cid:durableId="2097246878">
+    <w:abstractNumId w:val="20"/>
   </w:num>
 </w:numbering>
 </file>
@@ -7934,6 +9305,74 @@
       <w14:ligatures w14:val="none"/>
     </w:rPr>
   </w:style>
+  <w:style w:type="character" w:styleId="CommentReference">
+    <w:name w:val="annotation reference"/>
+    <w:basedOn w:val="DefaultParagraphFont"/>
+    <w:uiPriority w:val="99"/>
+    <w:semiHidden/>
+    <w:unhideWhenUsed/>
+    <w:rsid w:val="00FD6F2A"/>
+    <w:rPr>
+      <w:sz w:val="16"/>
+      <w:szCs w:val="16"/>
+    </w:rPr>
+  </w:style>
+  <w:style w:type="paragraph" w:styleId="CommentText">
+    <w:name w:val="annotation text"/>
+    <w:basedOn w:val="Normal"/>
+    <w:link w:val="CommentTextChar"/>
+    <w:uiPriority w:val="99"/>
+    <w:semiHidden/>
+    <w:unhideWhenUsed/>
+    <w:rsid w:val="00FD6F2A"/>
+    <w:pPr>
+      <w:spacing w:line="240" w:lineRule="auto"/>
+    </w:pPr>
+    <w:rPr>
+      <w:sz w:val="20"/>
+      <w:szCs w:val="20"/>
+    </w:rPr>
+  </w:style>
+  <w:style w:type="character" w:customStyle="1" w:styleId="CommentTextChar">
+    <w:name w:val="Comment Text Char"/>
+    <w:basedOn w:val="DefaultParagraphFont"/>
+    <w:link w:val="CommentText"/>
+    <w:uiPriority w:val="99"/>
+    <w:semiHidden/>
+    <w:rsid w:val="00FD6F2A"/>
+    <w:rPr>
+      <w:sz w:val="20"/>
+      <w:szCs w:val="20"/>
+    </w:rPr>
+  </w:style>
+  <w:style w:type="paragraph" w:styleId="CommentSubject">
+    <w:name w:val="annotation subject"/>
+    <w:basedOn w:val="CommentText"/>
+    <w:next w:val="CommentText"/>
+    <w:link w:val="CommentSubjectChar"/>
+    <w:uiPriority w:val="99"/>
+    <w:semiHidden/>
+    <w:unhideWhenUsed/>
+    <w:rsid w:val="00FD6F2A"/>
+    <w:rPr>
+      <w:b/>
+      <w:bCs/>
+    </w:rPr>
+  </w:style>
+  <w:style w:type="character" w:customStyle="1" w:styleId="CommentSubjectChar">
+    <w:name w:val="Comment Subject Char"/>
+    <w:basedOn w:val="CommentTextChar"/>
+    <w:link w:val="CommentSubject"/>
+    <w:uiPriority w:val="99"/>
+    <w:semiHidden/>
+    <w:rsid w:val="00FD6F2A"/>
+    <w:rPr>
+      <w:b/>
+      <w:bCs/>
+      <w:sz w:val="20"/>
+      <w:szCs w:val="20"/>
+    </w:rPr>
+  </w:style>
 </w:styles>
 </file>
 

</xml_diff>

<commit_message>
section 4th part 2 started
</commit_message>
<xml_diff>
--- a/Public Talks/No 147/No 147.docx
+++ b/Public Talks/No 147/No 147.docx
@@ -5863,7 +5863,23 @@
           <w:b/>
           <w:bCs/>
         </w:rPr>
-        <w:t>HOW JEHOVAH PROTECT HIS PEOPLE TODAY</w:t>
+        <w:t>HOW JEHOVAH PROTECT</w:t>
+      </w:r>
+      <w:r>
+        <w:rPr>
+          <w:rFonts w:ascii="Segoe UI Light" w:hAnsi="Segoe UI Light" w:cs="Segoe UI Light"/>
+          <w:b/>
+          <w:bCs/>
+        </w:rPr>
+        <w:t>S</w:t>
+      </w:r>
+      <w:r>
+        <w:rPr>
+          <w:rFonts w:ascii="Segoe UI Light" w:hAnsi="Segoe UI Light" w:cs="Segoe UI Light"/>
+          <w:b/>
+          <w:bCs/>
+        </w:rPr>
+        <w:t xml:space="preserve"> HIS PEOPLE TODAY</w:t>
       </w:r>
     </w:p>
     <w:p>
@@ -6512,7 +6528,19 @@
         <w:rPr>
           <w:rFonts w:ascii="Segoe UI Light" w:hAnsi="Segoe UI Light" w:cs="Segoe UI Light"/>
         </w:rPr>
-        <w:t xml:space="preserve"> we should not expect Jehovah to miraculously save us from all arm.</w:t>
+        <w:t xml:space="preserve"> we should not expect Jehovah to miraculously save us from all </w:t>
+      </w:r>
+      <w:r>
+        <w:rPr>
+          <w:rFonts w:ascii="Segoe UI Light" w:hAnsi="Segoe UI Light" w:cs="Segoe UI Light"/>
+        </w:rPr>
+        <w:t>h</w:t>
+      </w:r>
+      <w:r>
+        <w:rPr>
+          <w:rFonts w:ascii="Segoe UI Light" w:hAnsi="Segoe UI Light" w:cs="Segoe UI Light"/>
+        </w:rPr>
+        <w:t>arm.</w:t>
       </w:r>
     </w:p>
     <w:p>
@@ -6538,6 +6566,448 @@
           <w:rFonts w:ascii="Segoe UI Light" w:hAnsi="Segoe UI Light" w:cs="Segoe UI Light"/>
         </w:rPr>
         <w:t>.</w:t>
+      </w:r>
+    </w:p>
+    <w:p>
+      <w:pPr>
+        <w:ind w:left="1440" w:hanging="720"/>
+        <w:rPr>
+          <w:rFonts w:ascii="Segoe UI Light" w:hAnsi="Segoe UI Light" w:cs="Segoe UI Light"/>
+        </w:rPr>
+      </w:pPr>
+      <w:r>
+        <w:rPr>
+          <w:rFonts w:ascii="Segoe UI Light" w:hAnsi="Segoe UI Light" w:cs="Segoe UI Light"/>
+        </w:rPr>
+        <w:t xml:space="preserve">Why can we say that? </w:t>
+      </w:r>
+      <w:r>
+        <w:rPr>
+          <w:rFonts w:ascii="Segoe UI Light" w:hAnsi="Segoe UI Light" w:cs="Segoe UI Light"/>
+        </w:rPr>
+        <w:t>A</w:t>
+      </w:r>
+      <w:r>
+        <w:rPr>
+          <w:rFonts w:ascii="Segoe UI Light" w:hAnsi="Segoe UI Light" w:cs="Segoe UI Light"/>
+        </w:rPr>
+        <w:t>nd what should we do to receive protection against anything that can harm how relationship with him?</w:t>
+      </w:r>
+    </w:p>
+    <w:p>
+      <w:pPr>
+        <w:ind w:left="2160" w:hanging="720"/>
+        <w:rPr>
+          <w:rFonts w:ascii="Segoe UI Light" w:hAnsi="Segoe UI Light" w:cs="Segoe UI Light"/>
+        </w:rPr>
+      </w:pPr>
+      <w:r>
+        <w:rPr>
+          <w:rFonts w:ascii="Segoe UI Light" w:hAnsi="Segoe UI Light" w:cs="Segoe UI Light"/>
+          <w:b/>
+          <w:bCs/>
+        </w:rPr>
+        <w:t>Psalm 62:7,8</w:t>
+      </w:r>
+      <w:r>
+        <w:rPr>
+          <w:rFonts w:ascii="Segoe UI Light" w:hAnsi="Segoe UI Light" w:cs="Segoe UI Light"/>
+        </w:rPr>
+        <w:t>.</w:t>
+      </w:r>
+    </w:p>
+    <w:p>
+      <w:pPr>
+        <w:ind w:left="2520" w:hanging="720"/>
+        <w:rPr>
+          <w:rFonts w:ascii="Segoe UI Light" w:hAnsi="Segoe UI Light" w:cs="Segoe UI Light"/>
+        </w:rPr>
+      </w:pPr>
+      <w:r>
+        <w:rPr>
+          <w:rFonts w:ascii="Segoe UI Light" w:hAnsi="Segoe UI Light" w:cs="Segoe UI Light"/>
+          <w:b/>
+          <w:bCs/>
+        </w:rPr>
+        <w:t>Verse 7:</w:t>
+      </w:r>
+    </w:p>
+    <w:p>
+      <w:pPr>
+        <w:pStyle w:val="ListParagraph"/>
+        <w:numPr>
+          <w:ilvl w:val="0"/>
+          <w:numId w:val="40"/>
+        </w:numPr>
+        <w:rPr>
+          <w:rFonts w:ascii="Segoe UI Light" w:hAnsi="Segoe UI Light" w:cs="Segoe UI Light"/>
+        </w:rPr>
+      </w:pPr>
+      <w:r>
+        <w:rPr>
+          <w:rFonts w:ascii="Segoe UI Light" w:hAnsi="Segoe UI Light" w:cs="Segoe UI Light"/>
+          <w:i/>
+          <w:iCs/>
+        </w:rPr>
+        <w:t>Refuge</w:t>
+      </w:r>
+      <w:r>
+        <w:rPr>
+          <w:rFonts w:ascii="Segoe UI Light" w:hAnsi="Segoe UI Light" w:cs="Segoe UI Light"/>
+        </w:rPr>
+        <w:t xml:space="preserve">: </w:t>
+      </w:r>
+      <w:r>
+        <w:rPr>
+          <w:rFonts w:ascii="Segoe UI Light" w:hAnsi="Segoe UI Light" w:cs="Segoe UI Light"/>
+        </w:rPr>
+        <w:t>a physical place, person, or thing that provides protection</w:t>
+      </w:r>
+      <w:r>
+        <w:rPr>
+          <w:rFonts w:ascii="Segoe UI Light" w:hAnsi="Segoe UI Light" w:cs="Segoe UI Light"/>
+        </w:rPr>
+        <w:t xml:space="preserve"> [Merriam-Webster]</w:t>
+      </w:r>
+    </w:p>
+    <w:p>
+      <w:pPr>
+        <w:pStyle w:val="ListParagraph"/>
+        <w:numPr>
+          <w:ilvl w:val="1"/>
+          <w:numId w:val="40"/>
+        </w:numPr>
+        <w:rPr>
+          <w:rFonts w:ascii="Segoe UI Light" w:hAnsi="Segoe UI Light" w:cs="Segoe UI Light"/>
+        </w:rPr>
+      </w:pPr>
+      <w:r>
+        <w:rPr>
+          <w:rFonts w:ascii="Segoe UI Light" w:hAnsi="Segoe UI Light" w:cs="Segoe UI Light"/>
+        </w:rPr>
+        <w:lastRenderedPageBreak/>
+        <w:t>Jehovah can prove to be our refuge if we turn to him for advice and counsel, for comfort</w:t>
+      </w:r>
+      <w:r>
+        <w:rPr>
+          <w:rFonts w:ascii="Segoe UI Light" w:hAnsi="Segoe UI Light" w:cs="Segoe UI Light"/>
+        </w:rPr>
+        <w:t xml:space="preserve"> or consolation.</w:t>
+      </w:r>
+    </w:p>
+    <w:p>
+      <w:pPr>
+        <w:pStyle w:val="ListParagraph"/>
+        <w:numPr>
+          <w:ilvl w:val="2"/>
+          <w:numId w:val="40"/>
+        </w:numPr>
+        <w:rPr>
+          <w:rFonts w:ascii="Segoe UI Light" w:hAnsi="Segoe UI Light" w:cs="Segoe UI Light"/>
+        </w:rPr>
+      </w:pPr>
+      <w:r>
+        <w:rPr>
+          <w:rFonts w:ascii="Segoe UI Light" w:hAnsi="Segoe UI Light" w:cs="Segoe UI Light"/>
+        </w:rPr>
+        <w:t>Whenever we face any trials</w:t>
+      </w:r>
+      <w:r>
+        <w:rPr>
+          <w:rFonts w:ascii="Segoe UI Light" w:hAnsi="Segoe UI Light" w:cs="Segoe UI Light"/>
+        </w:rPr>
+        <w:t xml:space="preserve"> such as:</w:t>
+      </w:r>
+    </w:p>
+    <w:p>
+      <w:pPr>
+        <w:pStyle w:val="ListParagraph"/>
+        <w:numPr>
+          <w:ilvl w:val="3"/>
+          <w:numId w:val="40"/>
+        </w:numPr>
+        <w:rPr>
+          <w:rFonts w:ascii="Segoe UI Light" w:hAnsi="Segoe UI Light" w:cs="Segoe UI Light"/>
+        </w:rPr>
+      </w:pPr>
+      <w:r>
+        <w:rPr>
+          <w:rFonts w:ascii="Segoe UI Light" w:hAnsi="Segoe UI Light" w:cs="Segoe UI Light"/>
+        </w:rPr>
+        <w:t xml:space="preserve">persecution or opposition, </w:t>
+      </w:r>
+    </w:p>
+    <w:p>
+      <w:pPr>
+        <w:pStyle w:val="ListParagraph"/>
+        <w:numPr>
+          <w:ilvl w:val="3"/>
+          <w:numId w:val="40"/>
+        </w:numPr>
+        <w:rPr>
+          <w:rFonts w:ascii="Segoe UI Light" w:hAnsi="Segoe UI Light" w:cs="Segoe UI Light"/>
+        </w:rPr>
+      </w:pPr>
+      <w:r>
+        <w:rPr>
+          <w:rFonts w:ascii="Segoe UI Light" w:hAnsi="Segoe UI Light" w:cs="Segoe UI Light"/>
+        </w:rPr>
+        <w:t xml:space="preserve">the pressure to compromise, </w:t>
+      </w:r>
+    </w:p>
+    <w:p>
+      <w:pPr>
+        <w:pStyle w:val="ListParagraph"/>
+        <w:numPr>
+          <w:ilvl w:val="3"/>
+          <w:numId w:val="40"/>
+        </w:numPr>
+        <w:rPr>
+          <w:rFonts w:ascii="Segoe UI Light" w:hAnsi="Segoe UI Light" w:cs="Segoe UI Light"/>
+        </w:rPr>
+      </w:pPr>
+      <w:r>
+        <w:rPr>
+          <w:rFonts w:ascii="Segoe UI Light" w:hAnsi="Segoe UI Light" w:cs="Segoe UI Light"/>
+        </w:rPr>
+        <w:t>the temptation to do something we know is wrong</w:t>
+      </w:r>
+    </w:p>
+    <w:p>
+      <w:pPr>
+        <w:pStyle w:val="ListParagraph"/>
+        <w:ind w:left="4320"/>
+        <w:rPr>
+          <w:rFonts w:ascii="Segoe UI Light" w:hAnsi="Segoe UI Light" w:cs="Segoe UI Light"/>
+        </w:rPr>
+      </w:pPr>
+      <w:r>
+        <w:rPr>
+          <w:rFonts w:ascii="Segoe UI Light" w:hAnsi="Segoe UI Light" w:cs="Segoe UI Light"/>
+        </w:rPr>
+        <w:t>Let’s make Jehovah our refuge</w:t>
+      </w:r>
+    </w:p>
+    <w:p>
+      <w:pPr>
+        <w:pStyle w:val="ListParagraph"/>
+        <w:numPr>
+          <w:ilvl w:val="0"/>
+          <w:numId w:val="41"/>
+        </w:numPr>
+        <w:rPr>
+          <w:rFonts w:ascii="Segoe UI Light" w:hAnsi="Segoe UI Light" w:cs="Segoe UI Light"/>
+        </w:rPr>
+      </w:pPr>
+      <w:r>
+        <w:rPr>
+          <w:rFonts w:ascii="Segoe UI Light" w:hAnsi="Segoe UI Light" w:cs="Segoe UI Light"/>
+        </w:rPr>
+        <w:t xml:space="preserve">whenever we feel </w:t>
+      </w:r>
+    </w:p>
+    <w:p>
+      <w:pPr>
+        <w:pStyle w:val="ListParagraph"/>
+        <w:numPr>
+          <w:ilvl w:val="1"/>
+          <w:numId w:val="41"/>
+        </w:numPr>
+        <w:rPr>
+          <w:rFonts w:ascii="Segoe UI Light" w:hAnsi="Segoe UI Light" w:cs="Segoe UI Light"/>
+        </w:rPr>
+      </w:pPr>
+      <w:r>
+        <w:rPr>
+          <w:rFonts w:ascii="Segoe UI Light" w:hAnsi="Segoe UI Light" w:cs="Segoe UI Light"/>
+        </w:rPr>
+        <w:t>Discouraged</w:t>
+      </w:r>
+    </w:p>
+    <w:p>
+      <w:pPr>
+        <w:pStyle w:val="ListParagraph"/>
+        <w:numPr>
+          <w:ilvl w:val="1"/>
+          <w:numId w:val="41"/>
+        </w:numPr>
+        <w:rPr>
+          <w:rFonts w:ascii="Segoe UI Light" w:hAnsi="Segoe UI Light" w:cs="Segoe UI Light"/>
+        </w:rPr>
+      </w:pPr>
+      <w:r>
+        <w:rPr>
+          <w:rFonts w:ascii="Segoe UI Light" w:hAnsi="Segoe UI Light" w:cs="Segoe UI Light"/>
+        </w:rPr>
+        <w:t>Hurt or disappointed by others’ actions</w:t>
+      </w:r>
+    </w:p>
+    <w:p>
+      <w:pPr>
+        <w:pStyle w:val="ListParagraph"/>
+        <w:numPr>
+          <w:ilvl w:val="1"/>
+          <w:numId w:val="41"/>
+        </w:numPr>
+        <w:rPr>
+          <w:rFonts w:ascii="Segoe UI Light" w:hAnsi="Segoe UI Light" w:cs="Segoe UI Light"/>
+        </w:rPr>
+      </w:pPr>
+      <w:r>
+        <w:rPr>
+          <w:rFonts w:ascii="Segoe UI Light" w:hAnsi="Segoe UI Light" w:cs="Segoe UI Light"/>
+        </w:rPr>
+        <w:t>Saddened by our own failures</w:t>
+      </w:r>
+    </w:p>
+    <w:p>
+      <w:pPr>
+        <w:pStyle w:val="ListParagraph"/>
+        <w:numPr>
+          <w:ilvl w:val="1"/>
+          <w:numId w:val="41"/>
+        </w:numPr>
+        <w:rPr>
+          <w:rFonts w:ascii="Segoe UI Light" w:hAnsi="Segoe UI Light" w:cs="Segoe UI Light"/>
+        </w:rPr>
+      </w:pPr>
+      <w:r>
+        <w:rPr>
+          <w:rFonts w:ascii="Segoe UI Light" w:hAnsi="Segoe UI Light" w:cs="Segoe UI Light"/>
+        </w:rPr>
+        <w:t>or unable to bear the pressure of this life any longer</w:t>
+      </w:r>
+      <w:r>
+        <w:rPr>
+          <w:rFonts w:ascii="Segoe UI Light" w:hAnsi="Segoe UI Light" w:cs="Segoe UI Light"/>
+        </w:rPr>
+        <w:t>.</w:t>
+      </w:r>
+    </w:p>
+    <w:p>
+      <w:pPr>
+        <w:pStyle w:val="ListParagraph"/>
+        <w:ind w:left="4320"/>
+        <w:rPr>
+          <w:rFonts w:ascii="Segoe UI Light" w:hAnsi="Segoe UI Light" w:cs="Segoe UI Light"/>
+        </w:rPr>
+      </w:pPr>
+      <w:r>
+        <w:rPr>
+          <w:rFonts w:ascii="Segoe UI Light" w:hAnsi="Segoe UI Light" w:cs="Segoe UI Light"/>
+        </w:rPr>
+        <w:t>Let’s make Jehovah our refuge.</w:t>
+      </w:r>
+    </w:p>
+    <w:p>
+      <w:pPr>
+        <w:ind w:left="3600"/>
+        <w:rPr>
+          <w:rFonts w:ascii="Segoe UI Light" w:hAnsi="Segoe UI Light" w:cs="Segoe UI Light"/>
+        </w:rPr>
+      </w:pPr>
+      <w:r>
+        <w:rPr>
+          <w:rFonts w:ascii="Segoe UI Light" w:hAnsi="Segoe UI Light" w:cs="Segoe UI Light"/>
+        </w:rPr>
+        <w:t>But h</w:t>
+      </w:r>
+      <w:r>
+        <w:rPr>
+          <w:rFonts w:ascii="Segoe UI Light" w:hAnsi="Segoe UI Light" w:cs="Segoe UI Light"/>
+        </w:rPr>
+        <w:t>ow do we do make Jehovah our refuge?</w:t>
+      </w:r>
+    </w:p>
+    <w:p>
+      <w:pPr>
+        <w:ind w:left="2160"/>
+        <w:rPr>
+          <w:rFonts w:ascii="Segoe UI Light" w:hAnsi="Segoe UI Light" w:cs="Segoe UI Light"/>
+        </w:rPr>
+      </w:pPr>
+      <w:r>
+        <w:rPr>
+          <w:rFonts w:ascii="Segoe UI Light" w:hAnsi="Segoe UI Light" w:cs="Segoe UI Light"/>
+          <w:b/>
+          <w:bCs/>
+        </w:rPr>
+        <w:t>Verse 8</w:t>
+      </w:r>
+      <w:r>
+        <w:rPr>
+          <w:rFonts w:ascii="Segoe UI Light" w:hAnsi="Segoe UI Light" w:cs="Segoe UI Light"/>
+        </w:rPr>
+        <w:t>:</w:t>
+      </w:r>
+    </w:p>
+    <w:p>
+      <w:pPr>
+        <w:pStyle w:val="ListParagraph"/>
+        <w:numPr>
+          <w:ilvl w:val="0"/>
+          <w:numId w:val="42"/>
+        </w:numPr>
+        <w:rPr>
+          <w:rFonts w:ascii="Segoe UI Light" w:hAnsi="Segoe UI Light" w:cs="Segoe UI Light"/>
+        </w:rPr>
+      </w:pPr>
+      <w:r>
+        <w:rPr>
+          <w:rFonts w:ascii="Segoe UI Light" w:hAnsi="Segoe UI Light" w:cs="Segoe UI Light"/>
+          <w:i/>
+          <w:iCs/>
+        </w:rPr>
+        <w:t>Trust in him at all times</w:t>
+      </w:r>
+    </w:p>
+    <w:p>
+      <w:pPr>
+        <w:pStyle w:val="ListParagraph"/>
+        <w:ind w:left="3600"/>
+        <w:rPr>
+          <w:rFonts w:ascii="Segoe UI Light" w:hAnsi="Segoe UI Light" w:cs="Segoe UI Light"/>
+        </w:rPr>
+      </w:pPr>
+      <w:r>
+        <w:rPr>
+          <w:rFonts w:ascii="Segoe UI Light" w:hAnsi="Segoe UI Light" w:cs="Segoe UI Light"/>
+        </w:rPr>
+        <w:t xml:space="preserve">What does this mean? </w:t>
+      </w:r>
+    </w:p>
+    <w:p>
+      <w:pPr>
+        <w:pStyle w:val="ListParagraph"/>
+        <w:numPr>
+          <w:ilvl w:val="0"/>
+          <w:numId w:val="42"/>
+        </w:numPr>
+        <w:rPr>
+          <w:rFonts w:ascii="Segoe UI Light" w:hAnsi="Segoe UI Light" w:cs="Segoe UI Light"/>
+        </w:rPr>
+      </w:pPr>
+      <w:r>
+        <w:rPr>
+          <w:rFonts w:ascii="Segoe UI Light" w:hAnsi="Segoe UI Light" w:cs="Segoe UI Light"/>
+          <w:i/>
+          <w:iCs/>
+        </w:rPr>
+        <w:t>Pour out your heart before him</w:t>
+      </w:r>
+    </w:p>
+    <w:p>
+      <w:pPr>
+        <w:ind w:left="3600"/>
+        <w:rPr>
+          <w:rFonts w:ascii="Segoe UI Light" w:hAnsi="Segoe UI Light" w:cs="Segoe UI Light"/>
+        </w:rPr>
+      </w:pPr>
+      <w:r>
+        <w:rPr>
+          <w:rFonts w:ascii="Segoe UI Light" w:hAnsi="Segoe UI Light" w:cs="Segoe UI Light"/>
+        </w:rPr>
+        <w:t>How do we do it?</w:t>
       </w:r>
     </w:p>
     <w:p>
@@ -7038,6 +7508,119 @@
     </w:lvl>
   </w:abstractNum>
   <w:abstractNum w:abstractNumId="3" w15:restartNumberingAfterBreak="0">
+    <w:nsid w:val="073B16BA"/>
+    <w:multiLevelType w:val="hybridMultilevel"/>
+    <w:tmpl w:val="34A62C2A"/>
+    <w:lvl w:ilvl="0" w:tplc="10090005">
+      <w:start w:val="1"/>
+      <w:numFmt w:val="bullet"/>
+      <w:lvlText w:val=""/>
+      <w:lvlJc w:val="left"/>
+      <w:pPr>
+        <w:ind w:left="3960" w:hanging="360"/>
+      </w:pPr>
+      <w:rPr>
+        <w:rFonts w:ascii="Wingdings" w:hAnsi="Wingdings" w:hint="default"/>
+      </w:rPr>
+    </w:lvl>
+    <w:lvl w:ilvl="1" w:tplc="10090003">
+      <w:start w:val="1"/>
+      <w:numFmt w:val="bullet"/>
+      <w:lvlText w:val="o"/>
+      <w:lvlJc w:val="left"/>
+      <w:pPr>
+        <w:ind w:left="4680" w:hanging="360"/>
+      </w:pPr>
+      <w:rPr>
+        <w:rFonts w:ascii="Courier New" w:hAnsi="Courier New" w:cs="Courier New" w:hint="default"/>
+      </w:rPr>
+    </w:lvl>
+    <w:lvl w:ilvl="2" w:tplc="10090005">
+      <w:start w:val="1"/>
+      <w:numFmt w:val="bullet"/>
+      <w:lvlText w:val=""/>
+      <w:lvlJc w:val="left"/>
+      <w:pPr>
+        <w:ind w:left="5400" w:hanging="360"/>
+      </w:pPr>
+      <w:rPr>
+        <w:rFonts w:ascii="Wingdings" w:hAnsi="Wingdings" w:hint="default"/>
+      </w:rPr>
+    </w:lvl>
+    <w:lvl w:ilvl="3" w:tplc="10090001" w:tentative="1">
+      <w:start w:val="1"/>
+      <w:numFmt w:val="bullet"/>
+      <w:lvlText w:val=""/>
+      <w:lvlJc w:val="left"/>
+      <w:pPr>
+        <w:ind w:left="6120" w:hanging="360"/>
+      </w:pPr>
+      <w:rPr>
+        <w:rFonts w:ascii="Symbol" w:hAnsi="Symbol" w:hint="default"/>
+      </w:rPr>
+    </w:lvl>
+    <w:lvl w:ilvl="4" w:tplc="10090003" w:tentative="1">
+      <w:start w:val="1"/>
+      <w:numFmt w:val="bullet"/>
+      <w:lvlText w:val="o"/>
+      <w:lvlJc w:val="left"/>
+      <w:pPr>
+        <w:ind w:left="6840" w:hanging="360"/>
+      </w:pPr>
+      <w:rPr>
+        <w:rFonts w:ascii="Courier New" w:hAnsi="Courier New" w:cs="Courier New" w:hint="default"/>
+      </w:rPr>
+    </w:lvl>
+    <w:lvl w:ilvl="5" w:tplc="10090005" w:tentative="1">
+      <w:start w:val="1"/>
+      <w:numFmt w:val="bullet"/>
+      <w:lvlText w:val=""/>
+      <w:lvlJc w:val="left"/>
+      <w:pPr>
+        <w:ind w:left="7560" w:hanging="360"/>
+      </w:pPr>
+      <w:rPr>
+        <w:rFonts w:ascii="Wingdings" w:hAnsi="Wingdings" w:hint="default"/>
+      </w:rPr>
+    </w:lvl>
+    <w:lvl w:ilvl="6" w:tplc="10090001" w:tentative="1">
+      <w:start w:val="1"/>
+      <w:numFmt w:val="bullet"/>
+      <w:lvlText w:val=""/>
+      <w:lvlJc w:val="left"/>
+      <w:pPr>
+        <w:ind w:left="8280" w:hanging="360"/>
+      </w:pPr>
+      <w:rPr>
+        <w:rFonts w:ascii="Symbol" w:hAnsi="Symbol" w:hint="default"/>
+      </w:rPr>
+    </w:lvl>
+    <w:lvl w:ilvl="7" w:tplc="10090003" w:tentative="1">
+      <w:start w:val="1"/>
+      <w:numFmt w:val="bullet"/>
+      <w:lvlText w:val="o"/>
+      <w:lvlJc w:val="left"/>
+      <w:pPr>
+        <w:ind w:left="9000" w:hanging="360"/>
+      </w:pPr>
+      <w:rPr>
+        <w:rFonts w:ascii="Courier New" w:hAnsi="Courier New" w:cs="Courier New" w:hint="default"/>
+      </w:rPr>
+    </w:lvl>
+    <w:lvl w:ilvl="8" w:tplc="10090005" w:tentative="1">
+      <w:start w:val="1"/>
+      <w:numFmt w:val="bullet"/>
+      <w:lvlText w:val=""/>
+      <w:lvlJc w:val="left"/>
+      <w:pPr>
+        <w:ind w:left="9720" w:hanging="360"/>
+      </w:pPr>
+      <w:rPr>
+        <w:rFonts w:ascii="Wingdings" w:hAnsi="Wingdings" w:hint="default"/>
+      </w:rPr>
+    </w:lvl>
+  </w:abstractNum>
+  <w:abstractNum w:abstractNumId="4" w15:restartNumberingAfterBreak="0">
     <w:nsid w:val="09BF140C"/>
     <w:multiLevelType w:val="hybridMultilevel"/>
     <w:tmpl w:val="6DBADE54"/>
@@ -7150,7 +7733,7 @@
       </w:rPr>
     </w:lvl>
   </w:abstractNum>
-  <w:abstractNum w:abstractNumId="4" w15:restartNumberingAfterBreak="0">
+  <w:abstractNum w:abstractNumId="5" w15:restartNumberingAfterBreak="0">
     <w:nsid w:val="0E312654"/>
     <w:multiLevelType w:val="hybridMultilevel"/>
     <w:tmpl w:val="4FB6774A"/>
@@ -7263,7 +7846,7 @@
       </w:rPr>
     </w:lvl>
   </w:abstractNum>
-  <w:abstractNum w:abstractNumId="5" w15:restartNumberingAfterBreak="0">
+  <w:abstractNum w:abstractNumId="6" w15:restartNumberingAfterBreak="0">
     <w:nsid w:val="11B0495E"/>
     <w:multiLevelType w:val="hybridMultilevel"/>
     <w:tmpl w:val="A80C8858"/>
@@ -7376,7 +7959,7 @@
       </w:rPr>
     </w:lvl>
   </w:abstractNum>
-  <w:abstractNum w:abstractNumId="6" w15:restartNumberingAfterBreak="0">
+  <w:abstractNum w:abstractNumId="7" w15:restartNumberingAfterBreak="0">
     <w:nsid w:val="121262AC"/>
     <w:multiLevelType w:val="hybridMultilevel"/>
     <w:tmpl w:val="B90482E0"/>
@@ -7462,7 +8045,7 @@
       </w:pPr>
     </w:lvl>
   </w:abstractNum>
-  <w:abstractNum w:abstractNumId="7" w15:restartNumberingAfterBreak="0">
+  <w:abstractNum w:abstractNumId="8" w15:restartNumberingAfterBreak="0">
     <w:nsid w:val="13B25458"/>
     <w:multiLevelType w:val="hybridMultilevel"/>
     <w:tmpl w:val="0038E46C"/>
@@ -7576,7 +8159,7 @@
       </w:rPr>
     </w:lvl>
   </w:abstractNum>
-  <w:abstractNum w:abstractNumId="8" w15:restartNumberingAfterBreak="0">
+  <w:abstractNum w:abstractNumId="9" w15:restartNumberingAfterBreak="0">
     <w:nsid w:val="152013AB"/>
     <w:multiLevelType w:val="hybridMultilevel"/>
     <w:tmpl w:val="64D83B20"/>
@@ -7689,7 +8272,7 @@
       </w:rPr>
     </w:lvl>
   </w:abstractNum>
-  <w:abstractNum w:abstractNumId="9" w15:restartNumberingAfterBreak="0">
+  <w:abstractNum w:abstractNumId="10" w15:restartNumberingAfterBreak="0">
     <w:nsid w:val="1A072BA4"/>
     <w:multiLevelType w:val="hybridMultilevel"/>
     <w:tmpl w:val="E4702894"/>
@@ -7803,7 +8386,7 @@
       </w:rPr>
     </w:lvl>
   </w:abstractNum>
-  <w:abstractNum w:abstractNumId="10" w15:restartNumberingAfterBreak="0">
+  <w:abstractNum w:abstractNumId="11" w15:restartNumberingAfterBreak="0">
     <w:nsid w:val="1A94446B"/>
     <w:multiLevelType w:val="hybridMultilevel"/>
     <w:tmpl w:val="71C8A8F8"/>
@@ -7916,7 +8499,7 @@
       </w:rPr>
     </w:lvl>
   </w:abstractNum>
-  <w:abstractNum w:abstractNumId="11" w15:restartNumberingAfterBreak="0">
+  <w:abstractNum w:abstractNumId="12" w15:restartNumberingAfterBreak="0">
     <w:nsid w:val="1C535D0B"/>
     <w:multiLevelType w:val="hybridMultilevel"/>
     <w:tmpl w:val="8A64A996"/>
@@ -8029,7 +8612,7 @@
       </w:rPr>
     </w:lvl>
   </w:abstractNum>
-  <w:abstractNum w:abstractNumId="12" w15:restartNumberingAfterBreak="0">
+  <w:abstractNum w:abstractNumId="13" w15:restartNumberingAfterBreak="0">
     <w:nsid w:val="1CEC314D"/>
     <w:multiLevelType w:val="hybridMultilevel"/>
     <w:tmpl w:val="070E12AC"/>
@@ -8142,7 +8725,7 @@
       </w:rPr>
     </w:lvl>
   </w:abstractNum>
-  <w:abstractNum w:abstractNumId="13" w15:restartNumberingAfterBreak="0">
+  <w:abstractNum w:abstractNumId="14" w15:restartNumberingAfterBreak="0">
     <w:nsid w:val="249F2707"/>
     <w:multiLevelType w:val="hybridMultilevel"/>
     <w:tmpl w:val="6A048F76"/>
@@ -8231,7 +8814,7 @@
       </w:pPr>
     </w:lvl>
   </w:abstractNum>
-  <w:abstractNum w:abstractNumId="14" w15:restartNumberingAfterBreak="0">
+  <w:abstractNum w:abstractNumId="15" w15:restartNumberingAfterBreak="0">
     <w:nsid w:val="24A80059"/>
     <w:multiLevelType w:val="hybridMultilevel"/>
     <w:tmpl w:val="11B24C7E"/>
@@ -8344,7 +8927,7 @@
       </w:rPr>
     </w:lvl>
   </w:abstractNum>
-  <w:abstractNum w:abstractNumId="15" w15:restartNumberingAfterBreak="0">
+  <w:abstractNum w:abstractNumId="16" w15:restartNumberingAfterBreak="0">
     <w:nsid w:val="27CF6E96"/>
     <w:multiLevelType w:val="hybridMultilevel"/>
     <w:tmpl w:val="8D86F246"/>
@@ -8437,7 +9020,7 @@
       </w:pPr>
     </w:lvl>
   </w:abstractNum>
-  <w:abstractNum w:abstractNumId="16" w15:restartNumberingAfterBreak="0">
+  <w:abstractNum w:abstractNumId="17" w15:restartNumberingAfterBreak="0">
     <w:nsid w:val="29F30EFE"/>
     <w:multiLevelType w:val="hybridMultilevel"/>
     <w:tmpl w:val="8D849220"/>
@@ -8550,7 +9133,7 @@
       </w:rPr>
     </w:lvl>
   </w:abstractNum>
-  <w:abstractNum w:abstractNumId="17" w15:restartNumberingAfterBreak="0">
+  <w:abstractNum w:abstractNumId="18" w15:restartNumberingAfterBreak="0">
     <w:nsid w:val="2BE93405"/>
     <w:multiLevelType w:val="hybridMultilevel"/>
     <w:tmpl w:val="ACB8863E"/>
@@ -8636,7 +9219,7 @@
       </w:pPr>
     </w:lvl>
   </w:abstractNum>
-  <w:abstractNum w:abstractNumId="18" w15:restartNumberingAfterBreak="0">
+  <w:abstractNum w:abstractNumId="19" w15:restartNumberingAfterBreak="0">
     <w:nsid w:val="2F201800"/>
     <w:multiLevelType w:val="hybridMultilevel"/>
     <w:tmpl w:val="83526C60"/>
@@ -8749,7 +9332,7 @@
       </w:rPr>
     </w:lvl>
   </w:abstractNum>
-  <w:abstractNum w:abstractNumId="19" w15:restartNumberingAfterBreak="0">
+  <w:abstractNum w:abstractNumId="20" w15:restartNumberingAfterBreak="0">
     <w:nsid w:val="2F4B1B10"/>
     <w:multiLevelType w:val="hybridMultilevel"/>
     <w:tmpl w:val="FC12F644"/>
@@ -8862,7 +9445,7 @@
       </w:rPr>
     </w:lvl>
   </w:abstractNum>
-  <w:abstractNum w:abstractNumId="20" w15:restartNumberingAfterBreak="0">
+  <w:abstractNum w:abstractNumId="21" w15:restartNumberingAfterBreak="0">
     <w:nsid w:val="307F4271"/>
     <w:multiLevelType w:val="hybridMultilevel"/>
     <w:tmpl w:val="6650950A"/>
@@ -8975,7 +9558,7 @@
       </w:rPr>
     </w:lvl>
   </w:abstractNum>
-  <w:abstractNum w:abstractNumId="21" w15:restartNumberingAfterBreak="0">
+  <w:abstractNum w:abstractNumId="22" w15:restartNumberingAfterBreak="0">
     <w:nsid w:val="308D3CBF"/>
     <w:multiLevelType w:val="hybridMultilevel"/>
     <w:tmpl w:val="6C4ABE3C"/>
@@ -9088,7 +9671,7 @@
       </w:rPr>
     </w:lvl>
   </w:abstractNum>
-  <w:abstractNum w:abstractNumId="22" w15:restartNumberingAfterBreak="0">
+  <w:abstractNum w:abstractNumId="23" w15:restartNumberingAfterBreak="0">
     <w:nsid w:val="32F46B80"/>
     <w:multiLevelType w:val="hybridMultilevel"/>
     <w:tmpl w:val="D6EEF02A"/>
@@ -9198,7 +9781,233 @@
       </w:rPr>
     </w:lvl>
   </w:abstractNum>
-  <w:abstractNum w:abstractNumId="23" w15:restartNumberingAfterBreak="0">
+  <w:abstractNum w:abstractNumId="24" w15:restartNumberingAfterBreak="0">
+    <w:nsid w:val="36B04573"/>
+    <w:multiLevelType w:val="hybridMultilevel"/>
+    <w:tmpl w:val="F90CE41A"/>
+    <w:lvl w:ilvl="0" w:tplc="10090001">
+      <w:start w:val="1"/>
+      <w:numFmt w:val="bullet"/>
+      <w:lvlText w:val=""/>
+      <w:lvlJc w:val="left"/>
+      <w:pPr>
+        <w:ind w:left="2520" w:hanging="360"/>
+      </w:pPr>
+      <w:rPr>
+        <w:rFonts w:ascii="Symbol" w:hAnsi="Symbol" w:hint="default"/>
+      </w:rPr>
+    </w:lvl>
+    <w:lvl w:ilvl="1" w:tplc="10090003">
+      <w:start w:val="1"/>
+      <w:numFmt w:val="bullet"/>
+      <w:lvlText w:val="o"/>
+      <w:lvlJc w:val="left"/>
+      <w:pPr>
+        <w:ind w:left="3240" w:hanging="360"/>
+      </w:pPr>
+      <w:rPr>
+        <w:rFonts w:ascii="Courier New" w:hAnsi="Courier New" w:cs="Courier New" w:hint="default"/>
+      </w:rPr>
+    </w:lvl>
+    <w:lvl w:ilvl="2" w:tplc="10090005">
+      <w:start w:val="1"/>
+      <w:numFmt w:val="bullet"/>
+      <w:lvlText w:val=""/>
+      <w:lvlJc w:val="left"/>
+      <w:pPr>
+        <w:ind w:left="3960" w:hanging="360"/>
+      </w:pPr>
+      <w:rPr>
+        <w:rFonts w:ascii="Wingdings" w:hAnsi="Wingdings" w:hint="default"/>
+      </w:rPr>
+    </w:lvl>
+    <w:lvl w:ilvl="3" w:tplc="10090003">
+      <w:start w:val="1"/>
+      <w:numFmt w:val="bullet"/>
+      <w:lvlText w:val="o"/>
+      <w:lvlJc w:val="left"/>
+      <w:pPr>
+        <w:ind w:left="4680" w:hanging="360"/>
+      </w:pPr>
+      <w:rPr>
+        <w:rFonts w:ascii="Courier New" w:hAnsi="Courier New" w:cs="Courier New" w:hint="default"/>
+      </w:rPr>
+    </w:lvl>
+    <w:lvl w:ilvl="4" w:tplc="10090003" w:tentative="1">
+      <w:start w:val="1"/>
+      <w:numFmt w:val="bullet"/>
+      <w:lvlText w:val="o"/>
+      <w:lvlJc w:val="left"/>
+      <w:pPr>
+        <w:ind w:left="5400" w:hanging="360"/>
+      </w:pPr>
+      <w:rPr>
+        <w:rFonts w:ascii="Courier New" w:hAnsi="Courier New" w:cs="Courier New" w:hint="default"/>
+      </w:rPr>
+    </w:lvl>
+    <w:lvl w:ilvl="5" w:tplc="10090005" w:tentative="1">
+      <w:start w:val="1"/>
+      <w:numFmt w:val="bullet"/>
+      <w:lvlText w:val=""/>
+      <w:lvlJc w:val="left"/>
+      <w:pPr>
+        <w:ind w:left="6120" w:hanging="360"/>
+      </w:pPr>
+      <w:rPr>
+        <w:rFonts w:ascii="Wingdings" w:hAnsi="Wingdings" w:hint="default"/>
+      </w:rPr>
+    </w:lvl>
+    <w:lvl w:ilvl="6" w:tplc="10090001" w:tentative="1">
+      <w:start w:val="1"/>
+      <w:numFmt w:val="bullet"/>
+      <w:lvlText w:val=""/>
+      <w:lvlJc w:val="left"/>
+      <w:pPr>
+        <w:ind w:left="6840" w:hanging="360"/>
+      </w:pPr>
+      <w:rPr>
+        <w:rFonts w:ascii="Symbol" w:hAnsi="Symbol" w:hint="default"/>
+      </w:rPr>
+    </w:lvl>
+    <w:lvl w:ilvl="7" w:tplc="10090003" w:tentative="1">
+      <w:start w:val="1"/>
+      <w:numFmt w:val="bullet"/>
+      <w:lvlText w:val="o"/>
+      <w:lvlJc w:val="left"/>
+      <w:pPr>
+        <w:ind w:left="7560" w:hanging="360"/>
+      </w:pPr>
+      <w:rPr>
+        <w:rFonts w:ascii="Courier New" w:hAnsi="Courier New" w:cs="Courier New" w:hint="default"/>
+      </w:rPr>
+    </w:lvl>
+    <w:lvl w:ilvl="8" w:tplc="10090005" w:tentative="1">
+      <w:start w:val="1"/>
+      <w:numFmt w:val="bullet"/>
+      <w:lvlText w:val=""/>
+      <w:lvlJc w:val="left"/>
+      <w:pPr>
+        <w:ind w:left="8280" w:hanging="360"/>
+      </w:pPr>
+      <w:rPr>
+        <w:rFonts w:ascii="Wingdings" w:hAnsi="Wingdings" w:hint="default"/>
+      </w:rPr>
+    </w:lvl>
+  </w:abstractNum>
+  <w:abstractNum w:abstractNumId="25" w15:restartNumberingAfterBreak="0">
+    <w:nsid w:val="3CBF39D7"/>
+    <w:multiLevelType w:val="hybridMultilevel"/>
+    <w:tmpl w:val="744ABA04"/>
+    <w:lvl w:ilvl="0" w:tplc="10090001">
+      <w:start w:val="1"/>
+      <w:numFmt w:val="bullet"/>
+      <w:lvlText w:val=""/>
+      <w:lvlJc w:val="left"/>
+      <w:pPr>
+        <w:ind w:left="2880" w:hanging="360"/>
+      </w:pPr>
+      <w:rPr>
+        <w:rFonts w:ascii="Symbol" w:hAnsi="Symbol" w:hint="default"/>
+      </w:rPr>
+    </w:lvl>
+    <w:lvl w:ilvl="1" w:tplc="10090003" w:tentative="1">
+      <w:start w:val="1"/>
+      <w:numFmt w:val="bullet"/>
+      <w:lvlText w:val="o"/>
+      <w:lvlJc w:val="left"/>
+      <w:pPr>
+        <w:ind w:left="3600" w:hanging="360"/>
+      </w:pPr>
+      <w:rPr>
+        <w:rFonts w:ascii="Courier New" w:hAnsi="Courier New" w:cs="Courier New" w:hint="default"/>
+      </w:rPr>
+    </w:lvl>
+    <w:lvl w:ilvl="2" w:tplc="10090005" w:tentative="1">
+      <w:start w:val="1"/>
+      <w:numFmt w:val="bullet"/>
+      <w:lvlText w:val=""/>
+      <w:lvlJc w:val="left"/>
+      <w:pPr>
+        <w:ind w:left="4320" w:hanging="360"/>
+      </w:pPr>
+      <w:rPr>
+        <w:rFonts w:ascii="Wingdings" w:hAnsi="Wingdings" w:hint="default"/>
+      </w:rPr>
+    </w:lvl>
+    <w:lvl w:ilvl="3" w:tplc="10090001" w:tentative="1">
+      <w:start w:val="1"/>
+      <w:numFmt w:val="bullet"/>
+      <w:lvlText w:val=""/>
+      <w:lvlJc w:val="left"/>
+      <w:pPr>
+        <w:ind w:left="5040" w:hanging="360"/>
+      </w:pPr>
+      <w:rPr>
+        <w:rFonts w:ascii="Symbol" w:hAnsi="Symbol" w:hint="default"/>
+      </w:rPr>
+    </w:lvl>
+    <w:lvl w:ilvl="4" w:tplc="10090003" w:tentative="1">
+      <w:start w:val="1"/>
+      <w:numFmt w:val="bullet"/>
+      <w:lvlText w:val="o"/>
+      <w:lvlJc w:val="left"/>
+      <w:pPr>
+        <w:ind w:left="5760" w:hanging="360"/>
+      </w:pPr>
+      <w:rPr>
+        <w:rFonts w:ascii="Courier New" w:hAnsi="Courier New" w:cs="Courier New" w:hint="default"/>
+      </w:rPr>
+    </w:lvl>
+    <w:lvl w:ilvl="5" w:tplc="10090005" w:tentative="1">
+      <w:start w:val="1"/>
+      <w:numFmt w:val="bullet"/>
+      <w:lvlText w:val=""/>
+      <w:lvlJc w:val="left"/>
+      <w:pPr>
+        <w:ind w:left="6480" w:hanging="360"/>
+      </w:pPr>
+      <w:rPr>
+        <w:rFonts w:ascii="Wingdings" w:hAnsi="Wingdings" w:hint="default"/>
+      </w:rPr>
+    </w:lvl>
+    <w:lvl w:ilvl="6" w:tplc="10090001" w:tentative="1">
+      <w:start w:val="1"/>
+      <w:numFmt w:val="bullet"/>
+      <w:lvlText w:val=""/>
+      <w:lvlJc w:val="left"/>
+      <w:pPr>
+        <w:ind w:left="7200" w:hanging="360"/>
+      </w:pPr>
+      <w:rPr>
+        <w:rFonts w:ascii="Symbol" w:hAnsi="Symbol" w:hint="default"/>
+      </w:rPr>
+    </w:lvl>
+    <w:lvl w:ilvl="7" w:tplc="10090003" w:tentative="1">
+      <w:start w:val="1"/>
+      <w:numFmt w:val="bullet"/>
+      <w:lvlText w:val="o"/>
+      <w:lvlJc w:val="left"/>
+      <w:pPr>
+        <w:ind w:left="7920" w:hanging="360"/>
+      </w:pPr>
+      <w:rPr>
+        <w:rFonts w:ascii="Courier New" w:hAnsi="Courier New" w:cs="Courier New" w:hint="default"/>
+      </w:rPr>
+    </w:lvl>
+    <w:lvl w:ilvl="8" w:tplc="10090005" w:tentative="1">
+      <w:start w:val="1"/>
+      <w:numFmt w:val="bullet"/>
+      <w:lvlText w:val=""/>
+      <w:lvlJc w:val="left"/>
+      <w:pPr>
+        <w:ind w:left="8640" w:hanging="360"/>
+      </w:pPr>
+      <w:rPr>
+        <w:rFonts w:ascii="Wingdings" w:hAnsi="Wingdings" w:hint="default"/>
+      </w:rPr>
+    </w:lvl>
+  </w:abstractNum>
+  <w:abstractNum w:abstractNumId="26" w15:restartNumberingAfterBreak="0">
     <w:nsid w:val="3E4E7E1D"/>
     <w:multiLevelType w:val="hybridMultilevel"/>
     <w:tmpl w:val="C4183DF8"/>
@@ -9311,7 +10120,7 @@
       </w:rPr>
     </w:lvl>
   </w:abstractNum>
-  <w:abstractNum w:abstractNumId="24" w15:restartNumberingAfterBreak="0">
+  <w:abstractNum w:abstractNumId="27" w15:restartNumberingAfterBreak="0">
     <w:nsid w:val="3EC24676"/>
     <w:multiLevelType w:val="hybridMultilevel"/>
     <w:tmpl w:val="AD10C83C"/>
@@ -9397,7 +10206,7 @@
       </w:pPr>
     </w:lvl>
   </w:abstractNum>
-  <w:abstractNum w:abstractNumId="25" w15:restartNumberingAfterBreak="0">
+  <w:abstractNum w:abstractNumId="28" w15:restartNumberingAfterBreak="0">
     <w:nsid w:val="5E800D5C"/>
     <w:multiLevelType w:val="hybridMultilevel"/>
     <w:tmpl w:val="481006D8"/>
@@ -9510,7 +10319,7 @@
       </w:rPr>
     </w:lvl>
   </w:abstractNum>
-  <w:abstractNum w:abstractNumId="26" w15:restartNumberingAfterBreak="0">
+  <w:abstractNum w:abstractNumId="29" w15:restartNumberingAfterBreak="0">
     <w:nsid w:val="62A116E7"/>
     <w:multiLevelType w:val="hybridMultilevel"/>
     <w:tmpl w:val="AFD28870"/>
@@ -9623,7 +10432,7 @@
       </w:rPr>
     </w:lvl>
   </w:abstractNum>
-  <w:abstractNum w:abstractNumId="27" w15:restartNumberingAfterBreak="0">
+  <w:abstractNum w:abstractNumId="30" w15:restartNumberingAfterBreak="0">
     <w:nsid w:val="68C51740"/>
     <w:multiLevelType w:val="hybridMultilevel"/>
     <w:tmpl w:val="B614CEA8"/>
@@ -9712,7 +10521,7 @@
       </w:pPr>
     </w:lvl>
   </w:abstractNum>
-  <w:abstractNum w:abstractNumId="28" w15:restartNumberingAfterBreak="0">
+  <w:abstractNum w:abstractNumId="31" w15:restartNumberingAfterBreak="0">
     <w:nsid w:val="69010C8B"/>
     <w:multiLevelType w:val="hybridMultilevel"/>
     <w:tmpl w:val="AB9ACF8C"/>
@@ -9825,7 +10634,7 @@
       </w:rPr>
     </w:lvl>
   </w:abstractNum>
-  <w:abstractNum w:abstractNumId="29" w15:restartNumberingAfterBreak="0">
+  <w:abstractNum w:abstractNumId="32" w15:restartNumberingAfterBreak="0">
     <w:nsid w:val="697A3CAE"/>
     <w:multiLevelType w:val="hybridMultilevel"/>
     <w:tmpl w:val="23829878"/>
@@ -9938,7 +10747,7 @@
       </w:rPr>
     </w:lvl>
   </w:abstractNum>
-  <w:abstractNum w:abstractNumId="30" w15:restartNumberingAfterBreak="0">
+  <w:abstractNum w:abstractNumId="33" w15:restartNumberingAfterBreak="0">
     <w:nsid w:val="6A2C7A5A"/>
     <w:multiLevelType w:val="hybridMultilevel"/>
     <w:tmpl w:val="2FB0BC5E"/>
@@ -10051,7 +10860,7 @@
       </w:rPr>
     </w:lvl>
   </w:abstractNum>
-  <w:abstractNum w:abstractNumId="31" w15:restartNumberingAfterBreak="0">
+  <w:abstractNum w:abstractNumId="34" w15:restartNumberingAfterBreak="0">
     <w:nsid w:val="72236AAD"/>
     <w:multiLevelType w:val="hybridMultilevel"/>
     <w:tmpl w:val="1FF8BAB6"/>
@@ -10164,7 +10973,7 @@
       </w:rPr>
     </w:lvl>
   </w:abstractNum>
-  <w:abstractNum w:abstractNumId="32" w15:restartNumberingAfterBreak="0">
+  <w:abstractNum w:abstractNumId="35" w15:restartNumberingAfterBreak="0">
     <w:nsid w:val="74CF7FBC"/>
     <w:multiLevelType w:val="hybridMultilevel"/>
     <w:tmpl w:val="454E1412"/>
@@ -10277,7 +11086,7 @@
       </w:rPr>
     </w:lvl>
   </w:abstractNum>
-  <w:abstractNum w:abstractNumId="33" w15:restartNumberingAfterBreak="0">
+  <w:abstractNum w:abstractNumId="36" w15:restartNumberingAfterBreak="0">
     <w:nsid w:val="754071D0"/>
     <w:multiLevelType w:val="hybridMultilevel"/>
     <w:tmpl w:val="3698CDEC"/>
@@ -10363,7 +11172,7 @@
       </w:pPr>
     </w:lvl>
   </w:abstractNum>
-  <w:abstractNum w:abstractNumId="34" w15:restartNumberingAfterBreak="0">
+  <w:abstractNum w:abstractNumId="37" w15:restartNumberingAfterBreak="0">
     <w:nsid w:val="798F4444"/>
     <w:multiLevelType w:val="hybridMultilevel"/>
     <w:tmpl w:val="07767454"/>
@@ -10452,7 +11261,7 @@
       </w:pPr>
     </w:lvl>
   </w:abstractNum>
-  <w:abstractNum w:abstractNumId="35" w15:restartNumberingAfterBreak="0">
+  <w:abstractNum w:abstractNumId="38" w15:restartNumberingAfterBreak="0">
     <w:nsid w:val="7ABB3642"/>
     <w:multiLevelType w:val="hybridMultilevel"/>
     <w:tmpl w:val="5EA43876"/>
@@ -10565,7 +11374,7 @@
       </w:rPr>
     </w:lvl>
   </w:abstractNum>
-  <w:abstractNum w:abstractNumId="36" w15:restartNumberingAfterBreak="0">
+  <w:abstractNum w:abstractNumId="39" w15:restartNumberingAfterBreak="0">
     <w:nsid w:val="7C935A79"/>
     <w:multiLevelType w:val="hybridMultilevel"/>
     <w:tmpl w:val="56686326"/>
@@ -10678,7 +11487,7 @@
       </w:rPr>
     </w:lvl>
   </w:abstractNum>
-  <w:abstractNum w:abstractNumId="37" w15:restartNumberingAfterBreak="0">
+  <w:abstractNum w:abstractNumId="40" w15:restartNumberingAfterBreak="0">
     <w:nsid w:val="7F6C1CAC"/>
     <w:multiLevelType w:val="hybridMultilevel"/>
     <w:tmpl w:val="4E3EFFE6"/>
@@ -10791,7 +11600,7 @@
       </w:rPr>
     </w:lvl>
   </w:abstractNum>
-  <w:abstractNum w:abstractNumId="38" w15:restartNumberingAfterBreak="0">
+  <w:abstractNum w:abstractNumId="41" w15:restartNumberingAfterBreak="0">
     <w:nsid w:val="7FF10D2F"/>
     <w:multiLevelType w:val="hybridMultilevel"/>
     <w:tmpl w:val="D3F272D4"/>
@@ -10878,121 +11687,130 @@
     </w:lvl>
   </w:abstractNum>
   <w:num w:numId="1" w16cid:durableId="1200126119">
+    <w:abstractNumId w:val="34"/>
+  </w:num>
+  <w:num w:numId="2" w16cid:durableId="2142964796">
+    <w:abstractNumId w:val="7"/>
+  </w:num>
+  <w:num w:numId="3" w16cid:durableId="1686126829">
+    <w:abstractNumId w:val="36"/>
+  </w:num>
+  <w:num w:numId="4" w16cid:durableId="9256738">
+    <w:abstractNumId w:val="27"/>
+  </w:num>
+  <w:num w:numId="5" w16cid:durableId="1929270298">
+    <w:abstractNumId w:val="15"/>
+  </w:num>
+  <w:num w:numId="6" w16cid:durableId="1283686131">
+    <w:abstractNumId w:val="5"/>
+  </w:num>
+  <w:num w:numId="7" w16cid:durableId="1973510224">
+    <w:abstractNumId w:val="17"/>
+  </w:num>
+  <w:num w:numId="8" w16cid:durableId="1322386662">
+    <w:abstractNumId w:val="9"/>
+  </w:num>
+  <w:num w:numId="9" w16cid:durableId="1623069594">
+    <w:abstractNumId w:val="26"/>
+  </w:num>
+  <w:num w:numId="10" w16cid:durableId="389547150">
     <w:abstractNumId w:val="31"/>
   </w:num>
-  <w:num w:numId="2" w16cid:durableId="2142964796">
-    <w:abstractNumId w:val="6"/>
+  <w:num w:numId="11" w16cid:durableId="258147424">
+    <w:abstractNumId w:val="40"/>
   </w:num>
-  <w:num w:numId="3" w16cid:durableId="1686126829">
-    <w:abstractNumId w:val="33"/>
+  <w:num w:numId="12" w16cid:durableId="1740980150">
+    <w:abstractNumId w:val="35"/>
   </w:num>
-  <w:num w:numId="4" w16cid:durableId="9256738">
-    <w:abstractNumId w:val="24"/>
-  </w:num>
-  <w:num w:numId="5" w16cid:durableId="1929270298">
+  <w:num w:numId="13" w16cid:durableId="1889342876">
     <w:abstractNumId w:val="14"/>
   </w:num>
-  <w:num w:numId="6" w16cid:durableId="1283686131">
-    <w:abstractNumId w:val="4"/>
+  <w:num w:numId="14" w16cid:durableId="253057507">
+    <w:abstractNumId w:val="12"/>
   </w:num>
-  <w:num w:numId="7" w16cid:durableId="1973510224">
-    <w:abstractNumId w:val="16"/>
+  <w:num w:numId="15" w16cid:durableId="484205992">
+    <w:abstractNumId w:val="21"/>
   </w:num>
-  <w:num w:numId="8" w16cid:durableId="1322386662">
-    <w:abstractNumId w:val="8"/>
-  </w:num>
-  <w:num w:numId="9" w16cid:durableId="1623069594">
-    <w:abstractNumId w:val="23"/>
-  </w:num>
-  <w:num w:numId="10" w16cid:durableId="389547150">
-    <w:abstractNumId w:val="28"/>
-  </w:num>
-  <w:num w:numId="11" w16cid:durableId="258147424">
-    <w:abstractNumId w:val="37"/>
-  </w:num>
-  <w:num w:numId="12" w16cid:durableId="1740980150">
-    <w:abstractNumId w:val="32"/>
-  </w:num>
-  <w:num w:numId="13" w16cid:durableId="1889342876">
+  <w:num w:numId="16" w16cid:durableId="791091195">
     <w:abstractNumId w:val="13"/>
   </w:num>
-  <w:num w:numId="14" w16cid:durableId="253057507">
-    <w:abstractNumId w:val="11"/>
-  </w:num>
-  <w:num w:numId="15" w16cid:durableId="484205992">
-    <w:abstractNumId w:val="20"/>
-  </w:num>
-  <w:num w:numId="16" w16cid:durableId="791091195">
-    <w:abstractNumId w:val="12"/>
-  </w:num>
   <w:num w:numId="17" w16cid:durableId="657925824">
-    <w:abstractNumId w:val="18"/>
+    <w:abstractNumId w:val="19"/>
   </w:num>
   <w:num w:numId="18" w16cid:durableId="190342337">
-    <w:abstractNumId w:val="36"/>
+    <w:abstractNumId w:val="39"/>
   </w:num>
   <w:num w:numId="19" w16cid:durableId="1952785505">
-    <w:abstractNumId w:val="26"/>
+    <w:abstractNumId w:val="29"/>
   </w:num>
   <w:num w:numId="20" w16cid:durableId="1591154696">
-    <w:abstractNumId w:val="21"/>
+    <w:abstractNumId w:val="22"/>
   </w:num>
   <w:num w:numId="21" w16cid:durableId="1000231668">
-    <w:abstractNumId w:val="5"/>
+    <w:abstractNumId w:val="6"/>
   </w:num>
   <w:num w:numId="22" w16cid:durableId="1793480916">
     <w:abstractNumId w:val="2"/>
   </w:num>
   <w:num w:numId="23" w16cid:durableId="449859590">
-    <w:abstractNumId w:val="19"/>
+    <w:abstractNumId w:val="20"/>
   </w:num>
   <w:num w:numId="24" w16cid:durableId="1859462550">
-    <w:abstractNumId w:val="10"/>
+    <w:abstractNumId w:val="11"/>
   </w:num>
   <w:num w:numId="25" w16cid:durableId="10112469">
-    <w:abstractNumId w:val="17"/>
+    <w:abstractNumId w:val="18"/>
   </w:num>
   <w:num w:numId="26" w16cid:durableId="566114269">
-    <w:abstractNumId w:val="30"/>
+    <w:abstractNumId w:val="33"/>
   </w:num>
   <w:num w:numId="27" w16cid:durableId="732119972">
-    <w:abstractNumId w:val="22"/>
+    <w:abstractNumId w:val="23"/>
   </w:num>
   <w:num w:numId="28" w16cid:durableId="528493660">
-    <w:abstractNumId w:val="34"/>
+    <w:abstractNumId w:val="37"/>
   </w:num>
   <w:num w:numId="29" w16cid:durableId="2097246878">
-    <w:abstractNumId w:val="27"/>
+    <w:abstractNumId w:val="30"/>
   </w:num>
   <w:num w:numId="30" w16cid:durableId="1222912462">
     <w:abstractNumId w:val="0"/>
   </w:num>
   <w:num w:numId="31" w16cid:durableId="1487279755">
-    <w:abstractNumId w:val="35"/>
+    <w:abstractNumId w:val="38"/>
   </w:num>
   <w:num w:numId="32" w16cid:durableId="883833939">
     <w:abstractNumId w:val="1"/>
   </w:num>
   <w:num w:numId="33" w16cid:durableId="1152331654">
-    <w:abstractNumId w:val="25"/>
+    <w:abstractNumId w:val="28"/>
   </w:num>
   <w:num w:numId="34" w16cid:durableId="332343992">
+    <w:abstractNumId w:val="4"/>
+  </w:num>
+  <w:num w:numId="35" w16cid:durableId="1809936711">
+    <w:abstractNumId w:val="41"/>
+  </w:num>
+  <w:num w:numId="36" w16cid:durableId="599412453">
+    <w:abstractNumId w:val="32"/>
+  </w:num>
+  <w:num w:numId="37" w16cid:durableId="1371028658">
+    <w:abstractNumId w:val="16"/>
+  </w:num>
+  <w:num w:numId="38" w16cid:durableId="781799529">
+    <w:abstractNumId w:val="8"/>
+  </w:num>
+  <w:num w:numId="39" w16cid:durableId="1640184082">
+    <w:abstractNumId w:val="10"/>
+  </w:num>
+  <w:num w:numId="40" w16cid:durableId="671949270">
+    <w:abstractNumId w:val="24"/>
+  </w:num>
+  <w:num w:numId="41" w16cid:durableId="243495873">
     <w:abstractNumId w:val="3"/>
   </w:num>
-  <w:num w:numId="35" w16cid:durableId="1809936711">
-    <w:abstractNumId w:val="38"/>
-  </w:num>
-  <w:num w:numId="36" w16cid:durableId="599412453">
-    <w:abstractNumId w:val="29"/>
-  </w:num>
-  <w:num w:numId="37" w16cid:durableId="1371028658">
-    <w:abstractNumId w:val="15"/>
-  </w:num>
-  <w:num w:numId="38" w16cid:durableId="781799529">
-    <w:abstractNumId w:val="7"/>
-  </w:num>
-  <w:num w:numId="39" w16cid:durableId="1640184082">
-    <w:abstractNumId w:val="9"/>
+  <w:num w:numId="42" w16cid:durableId="616251690">
+    <w:abstractNumId w:val="25"/>
   </w:num>
 </w:numbering>
 </file>
@@ -11601,6 +12419,7 @@
   <w:style w:type="character" w:default="1" w:styleId="DefaultParagraphFont">
     <w:name w:val="Default Paragraph Font"/>
     <w:uiPriority w:val="1"/>
+    <w:semiHidden/>
     <w:unhideWhenUsed/>
   </w:style>
   <w:style w:type="table" w:default="1" w:styleId="TableNormal">

</xml_diff>

<commit_message>
Almost done the 4th part. Refinement needed
</commit_message>
<xml_diff>
--- a/Public Talks/No 147/No 147.docx
+++ b/Public Talks/No 147/No 147.docx
@@ -6964,21 +6964,6 @@
     <w:p>
       <w:pPr>
         <w:pStyle w:val="ListParagraph"/>
-        <w:ind w:left="3600"/>
-        <w:rPr>
-          <w:rFonts w:ascii="Segoe UI Light" w:hAnsi="Segoe UI Light" w:cs="Segoe UI Light"/>
-        </w:rPr>
-      </w:pPr>
-      <w:r>
-        <w:rPr>
-          <w:rFonts w:ascii="Segoe UI Light" w:hAnsi="Segoe UI Light" w:cs="Segoe UI Light"/>
-        </w:rPr>
-        <w:t xml:space="preserve">What does this mean? </w:t>
-      </w:r>
-    </w:p>
-    <w:p>
-      <w:pPr>
-        <w:pStyle w:val="ListParagraph"/>
         <w:numPr>
           <w:ilvl w:val="0"/>
           <w:numId w:val="42"/>
@@ -6998,6 +6983,7 @@
     </w:p>
     <w:p>
       <w:pPr>
+        <w:pStyle w:val="ListParagraph"/>
         <w:ind w:left="3600"/>
         <w:rPr>
           <w:rFonts w:ascii="Segoe UI Light" w:hAnsi="Segoe UI Light" w:cs="Segoe UI Light"/>
@@ -7009,6 +6995,402 @@
         </w:rPr>
         <w:t>How do we do it?</w:t>
       </w:r>
+      <w:r>
+        <w:rPr>
+          <w:rFonts w:ascii="Segoe UI Light" w:hAnsi="Segoe UI Light" w:cs="Segoe UI Light"/>
+        </w:rPr>
+        <w:t xml:space="preserve"> </w:t>
+      </w:r>
+    </w:p>
+    <w:p>
+      <w:pPr>
+        <w:pStyle w:val="ListParagraph"/>
+        <w:ind w:left="3600"/>
+        <w:rPr>
+          <w:rFonts w:ascii="Segoe UI Light" w:hAnsi="Segoe UI Light" w:cs="Segoe UI Light"/>
+        </w:rPr>
+      </w:pPr>
+      <w:r>
+        <w:rPr>
+          <w:rFonts w:ascii="Segoe UI Light" w:hAnsi="Segoe UI Light" w:cs="Segoe UI Light"/>
+        </w:rPr>
+        <w:t>Like Hezekiah</w:t>
+      </w:r>
+      <w:r>
+        <w:rPr>
+          <w:rFonts w:ascii="Segoe UI Light" w:hAnsi="Segoe UI Light" w:cs="Segoe UI Light"/>
+        </w:rPr>
+        <w:t xml:space="preserve"> </w:t>
+      </w:r>
+      <w:r>
+        <w:rPr>
+          <w:rFonts w:ascii="Segoe UI Light" w:hAnsi="Segoe UI Light" w:cs="Segoe UI Light"/>
+        </w:rPr>
+        <w:t>let’s open our heart to Jehovah</w:t>
+      </w:r>
+      <w:r>
+        <w:rPr>
+          <w:rFonts w:ascii="Segoe UI Light" w:hAnsi="Segoe UI Light" w:cs="Segoe UI Light"/>
+        </w:rPr>
+        <w:t xml:space="preserve"> in prayer</w:t>
+      </w:r>
+      <w:r>
+        <w:rPr>
+          <w:rFonts w:ascii="Segoe UI Light" w:hAnsi="Segoe UI Light" w:cs="Segoe UI Light"/>
+        </w:rPr>
+        <w:t>:</w:t>
+      </w:r>
+    </w:p>
+    <w:p>
+      <w:pPr>
+        <w:pStyle w:val="ListParagraph"/>
+        <w:numPr>
+          <w:ilvl w:val="2"/>
+          <w:numId w:val="42"/>
+        </w:numPr>
+        <w:rPr>
+          <w:rFonts w:ascii="Segoe UI Light" w:hAnsi="Segoe UI Light" w:cs="Segoe UI Light"/>
+        </w:rPr>
+      </w:pPr>
+      <w:r>
+        <w:rPr>
+          <w:rFonts w:ascii="Segoe UI Light" w:hAnsi="Segoe UI Light" w:cs="Segoe UI Light"/>
+        </w:rPr>
+        <w:t>Give him praise for the magnificent God he is</w:t>
+      </w:r>
+    </w:p>
+    <w:p>
+      <w:pPr>
+        <w:pStyle w:val="ListParagraph"/>
+        <w:numPr>
+          <w:ilvl w:val="2"/>
+          <w:numId w:val="42"/>
+        </w:numPr>
+        <w:rPr>
+          <w:rFonts w:ascii="Segoe UI Light" w:hAnsi="Segoe UI Light" w:cs="Segoe UI Light"/>
+        </w:rPr>
+      </w:pPr>
+      <w:r>
+        <w:rPr>
+          <w:rFonts w:ascii="Segoe UI Light" w:hAnsi="Segoe UI Light" w:cs="Segoe UI Light"/>
+        </w:rPr>
+        <w:t>Offer thanksgiving for the blessings we received</w:t>
+      </w:r>
+    </w:p>
+    <w:p>
+      <w:pPr>
+        <w:pStyle w:val="ListParagraph"/>
+        <w:numPr>
+          <w:ilvl w:val="2"/>
+          <w:numId w:val="42"/>
+        </w:numPr>
+        <w:rPr>
+          <w:rFonts w:ascii="Segoe UI Light" w:hAnsi="Segoe UI Light" w:cs="Segoe UI Light"/>
+        </w:rPr>
+      </w:pPr>
+      <w:r>
+        <w:rPr>
+          <w:rFonts w:ascii="Segoe UI Light" w:hAnsi="Segoe UI Light" w:cs="Segoe UI Light"/>
+        </w:rPr>
+        <w:t xml:space="preserve">Freely </w:t>
+      </w:r>
+      <w:r>
+        <w:rPr>
+          <w:rFonts w:ascii="Segoe UI Light" w:hAnsi="Segoe UI Light" w:cs="Segoe UI Light"/>
+        </w:rPr>
+        <w:t>petition and supplicate</w:t>
+      </w:r>
+      <w:r>
+        <w:rPr>
+          <w:rFonts w:ascii="Segoe UI Light" w:hAnsi="Segoe UI Light" w:cs="Segoe UI Light"/>
+        </w:rPr>
+        <w:t xml:space="preserve"> </w:t>
+      </w:r>
+      <w:r>
+        <w:rPr>
+          <w:rFonts w:ascii="Segoe UI Light" w:hAnsi="Segoe UI Light" w:cs="Segoe UI Light"/>
+        </w:rPr>
+        <w:t>about</w:t>
+      </w:r>
+      <w:r>
+        <w:rPr>
+          <w:rFonts w:ascii="Segoe UI Light" w:hAnsi="Segoe UI Light" w:cs="Segoe UI Light"/>
+        </w:rPr>
+        <w:t xml:space="preserve"> him our worries, our concerns and how we feel</w:t>
+      </w:r>
+      <w:r>
+        <w:rPr>
+          <w:rFonts w:ascii="Segoe UI Light" w:hAnsi="Segoe UI Light" w:cs="Segoe UI Light"/>
+        </w:rPr>
+        <w:t>.</w:t>
+      </w:r>
+    </w:p>
+    <w:p>
+      <w:pPr>
+        <w:pStyle w:val="ListParagraph"/>
+        <w:ind w:left="2160"/>
+        <w:rPr>
+          <w:rFonts w:ascii="Segoe UI Light" w:hAnsi="Segoe UI Light" w:cs="Segoe UI Light"/>
+        </w:rPr>
+      </w:pPr>
+      <w:r>
+        <w:rPr>
+          <w:rFonts w:ascii="Segoe UI Light" w:hAnsi="Segoe UI Light" w:cs="Segoe UI Light"/>
+        </w:rPr>
+        <w:t>How will Jehovah respond to our request?</w:t>
+      </w:r>
+    </w:p>
+    <w:p>
+      <w:pPr>
+        <w:pStyle w:val="ListParagraph"/>
+        <w:numPr>
+          <w:ilvl w:val="0"/>
+          <w:numId w:val="43"/>
+        </w:numPr>
+        <w:rPr>
+          <w:rFonts w:ascii="Segoe UI Light" w:hAnsi="Segoe UI Light" w:cs="Segoe UI Light"/>
+        </w:rPr>
+      </w:pPr>
+      <w:r>
+        <w:rPr>
+          <w:rFonts w:ascii="Segoe UI Light" w:hAnsi="Segoe UI Light" w:cs="Segoe UI Light"/>
+        </w:rPr>
+        <w:t>He gives us peace when we are fearful or anxious</w:t>
+      </w:r>
+      <w:r>
+        <w:rPr>
+          <w:rFonts w:ascii="Segoe UI Light" w:hAnsi="Segoe UI Light" w:cs="Segoe UI Light"/>
+        </w:rPr>
+        <w:t>.</w:t>
+      </w:r>
+    </w:p>
+    <w:p>
+      <w:pPr>
+        <w:pStyle w:val="ListParagraph"/>
+        <w:numPr>
+          <w:ilvl w:val="0"/>
+          <w:numId w:val="43"/>
+        </w:numPr>
+        <w:rPr>
+          <w:rFonts w:ascii="Segoe UI Light" w:hAnsi="Segoe UI Light" w:cs="Segoe UI Light"/>
+        </w:rPr>
+      </w:pPr>
+      <w:r>
+        <w:rPr>
+          <w:rFonts w:ascii="Segoe UI Light" w:hAnsi="Segoe UI Light" w:cs="Segoe UI Light"/>
+        </w:rPr>
+        <w:t>He will give us the strength needed to endure trials.</w:t>
+      </w:r>
+    </w:p>
+    <w:p>
+      <w:pPr>
+        <w:pStyle w:val="ListParagraph"/>
+        <w:numPr>
+          <w:ilvl w:val="0"/>
+          <w:numId w:val="43"/>
+        </w:numPr>
+        <w:rPr>
+          <w:rFonts w:ascii="Segoe UI Light" w:hAnsi="Segoe UI Light" w:cs="Segoe UI Light"/>
+        </w:rPr>
+      </w:pPr>
+      <w:r>
+        <w:rPr>
+          <w:rFonts w:ascii="Segoe UI Light" w:hAnsi="Segoe UI Light" w:cs="Segoe UI Light"/>
+        </w:rPr>
+        <w:t>He gives us guidance and wisdom so that we can make wise decisions</w:t>
+      </w:r>
+      <w:r>
+        <w:rPr>
+          <w:rFonts w:ascii="Segoe UI Light" w:hAnsi="Segoe UI Light" w:cs="Segoe UI Light"/>
+        </w:rPr>
+        <w:t>.</w:t>
+      </w:r>
+    </w:p>
+    <w:p>
+      <w:pPr>
+        <w:pStyle w:val="ListParagraph"/>
+        <w:ind w:left="3240"/>
+        <w:rPr>
+          <w:rFonts w:ascii="Segoe UI Light" w:hAnsi="Segoe UI Light" w:cs="Segoe UI Light"/>
+        </w:rPr>
+      </w:pPr>
+      <w:r>
+        <w:rPr>
+          <w:rFonts w:ascii="Segoe UI Light" w:hAnsi="Segoe UI Light" w:cs="Segoe UI Light"/>
+        </w:rPr>
+        <w:t>This guidance and wisdom can be obtained through:</w:t>
+      </w:r>
+    </w:p>
+    <w:p>
+      <w:pPr>
+        <w:pStyle w:val="ListParagraph"/>
+        <w:numPr>
+          <w:ilvl w:val="0"/>
+          <w:numId w:val="44"/>
+        </w:numPr>
+        <w:rPr>
+          <w:rFonts w:ascii="Segoe UI Light" w:hAnsi="Segoe UI Light" w:cs="Segoe UI Light"/>
+        </w:rPr>
+      </w:pPr>
+      <w:r>
+        <w:rPr>
+          <w:rFonts w:ascii="Segoe UI Light" w:hAnsi="Segoe UI Light" w:cs="Segoe UI Light"/>
+        </w:rPr>
+        <w:t>Personal Bible study</w:t>
+      </w:r>
+    </w:p>
+    <w:p>
+      <w:pPr>
+        <w:pStyle w:val="ListParagraph"/>
+        <w:numPr>
+          <w:ilvl w:val="0"/>
+          <w:numId w:val="44"/>
+        </w:numPr>
+        <w:rPr>
+          <w:rFonts w:ascii="Segoe UI Light" w:hAnsi="Segoe UI Light" w:cs="Segoe UI Light"/>
+        </w:rPr>
+      </w:pPr>
+      <w:r>
+        <w:rPr>
+          <w:rFonts w:ascii="Segoe UI Light" w:hAnsi="Segoe UI Light" w:cs="Segoe UI Light"/>
+        </w:rPr>
+        <w:t>Shepherding visit by the elders</w:t>
+      </w:r>
+    </w:p>
+    <w:p>
+      <w:pPr>
+        <w:pStyle w:val="ListParagraph"/>
+        <w:numPr>
+          <w:ilvl w:val="0"/>
+          <w:numId w:val="44"/>
+        </w:numPr>
+        <w:rPr>
+          <w:rFonts w:ascii="Segoe UI Light" w:hAnsi="Segoe UI Light" w:cs="Segoe UI Light"/>
+        </w:rPr>
+      </w:pPr>
+      <w:r>
+        <w:rPr>
+          <w:rFonts w:ascii="Segoe UI Light" w:hAnsi="Segoe UI Light" w:cs="Segoe UI Light"/>
+        </w:rPr>
+        <w:t>Our congregation meetings and assemblies</w:t>
+      </w:r>
+    </w:p>
+    <w:p>
+      <w:pPr>
+        <w:pStyle w:val="ListParagraph"/>
+        <w:numPr>
+          <w:ilvl w:val="0"/>
+          <w:numId w:val="44"/>
+        </w:numPr>
+        <w:rPr>
+          <w:rFonts w:ascii="Segoe UI Light" w:hAnsi="Segoe UI Light" w:cs="Segoe UI Light"/>
+        </w:rPr>
+      </w:pPr>
+      <w:r>
+        <w:rPr>
+          <w:rFonts w:ascii="Segoe UI Light" w:hAnsi="Segoe UI Light" w:cs="Segoe UI Light"/>
+        </w:rPr>
+        <w:t>JW broadcasting.</w:t>
+      </w:r>
+    </w:p>
+    <w:p>
+      <w:pPr>
+        <w:ind w:left="3600" w:hanging="720"/>
+        <w:rPr>
+          <w:rFonts w:ascii="Segoe UI Light" w:hAnsi="Segoe UI Light" w:cs="Segoe UI Light"/>
+        </w:rPr>
+      </w:pPr>
+      <w:r>
+        <w:rPr>
+          <w:rFonts w:ascii="Segoe UI Light" w:hAnsi="Segoe UI Light" w:cs="Segoe UI Light"/>
+        </w:rPr>
+        <w:t>Just as Jehovah sent a word to Hezekiah through Isaiah the prophet, Jehovah will send a strengthening word for us.</w:t>
+      </w:r>
+    </w:p>
+    <w:p>
+      <w:pPr>
+        <w:pStyle w:val="ListParagraph"/>
+        <w:numPr>
+          <w:ilvl w:val="0"/>
+          <w:numId w:val="45"/>
+        </w:numPr>
+        <w:rPr>
+          <w:rFonts w:ascii="Segoe UI Light" w:hAnsi="Segoe UI Light" w:cs="Segoe UI Light"/>
+        </w:rPr>
+      </w:pPr>
+      <w:r>
+        <w:rPr>
+          <w:rFonts w:ascii="Segoe UI Light" w:hAnsi="Segoe UI Light" w:cs="Segoe UI Light"/>
+        </w:rPr>
+        <w:t>Who will Isaiah the prophet for me today?</w:t>
+      </w:r>
+    </w:p>
+    <w:p>
+      <w:pPr>
+        <w:pStyle w:val="ListParagraph"/>
+        <w:numPr>
+          <w:ilvl w:val="0"/>
+          <w:numId w:val="45"/>
+        </w:numPr>
+        <w:rPr>
+          <w:rFonts w:ascii="Segoe UI Light" w:hAnsi="Segoe UI Light" w:cs="Segoe UI Light"/>
+        </w:rPr>
+      </w:pPr>
+      <w:r>
+        <w:rPr>
+          <w:rFonts w:ascii="Segoe UI Light" w:hAnsi="Segoe UI Light" w:cs="Segoe UI Light"/>
+        </w:rPr>
+        <w:lastRenderedPageBreak/>
+        <w:t>What will be the word of Jehovah for me today?</w:t>
+      </w:r>
+    </w:p>
+    <w:p>
+      <w:pPr>
+        <w:pStyle w:val="ListParagraph"/>
+        <w:ind w:left="4320"/>
+        <w:rPr>
+          <w:rFonts w:ascii="Segoe UI Light" w:hAnsi="Segoe UI Light" w:cs="Segoe UI Light"/>
+        </w:rPr>
+      </w:pPr>
+      <w:r>
+        <w:rPr>
+          <w:rFonts w:ascii="Segoe UI Light" w:hAnsi="Segoe UI Light" w:cs="Segoe UI Light"/>
+        </w:rPr>
+        <w:t>Be on the lookout.</w:t>
+      </w:r>
+    </w:p>
+    <w:p>
+      <w:pPr>
+        <w:pStyle w:val="ListParagraph"/>
+        <w:ind w:left="4320"/>
+        <w:rPr>
+          <w:rFonts w:ascii="Segoe UI Light" w:hAnsi="Segoe UI Light" w:cs="Segoe UI Light"/>
+        </w:rPr>
+      </w:pPr>
+      <w:r>
+        <w:rPr>
+          <w:rFonts w:ascii="Segoe UI Light" w:hAnsi="Segoe UI Light" w:cs="Segoe UI Light"/>
+        </w:rPr>
+        <w:t>Once you hear that strengthening comment from a fellow Christian, cherish it,  rejoice over it just as the people ion Jerusalem did.</w:t>
+      </w:r>
+    </w:p>
+    <w:p>
+      <w:pPr>
+        <w:pStyle w:val="ListParagraph"/>
+        <w:ind w:left="2880"/>
+        <w:rPr>
+          <w:rFonts w:ascii="Segoe UI Light" w:hAnsi="Segoe UI Light" w:cs="Segoe UI Light"/>
+        </w:rPr>
+      </w:pPr>
+    </w:p>
+    <w:p>
+      <w:pPr>
+        <w:pStyle w:val="ListParagraph"/>
+        <w:ind w:left="4320"/>
+        <w:rPr>
+          <w:rFonts w:ascii="Segoe UI Light" w:hAnsi="Segoe UI Light" w:cs="Segoe UI Light"/>
+        </w:rPr>
+      </w:pPr>
     </w:p>
     <w:p>
       <w:pPr>
@@ -8726,6 +9108,119 @@
     </w:lvl>
   </w:abstractNum>
   <w:abstractNum w:abstractNumId="14" w15:restartNumberingAfterBreak="0">
+    <w:nsid w:val="22D2064D"/>
+    <w:multiLevelType w:val="hybridMultilevel"/>
+    <w:tmpl w:val="D78A7CFE"/>
+    <w:lvl w:ilvl="0" w:tplc="1009000D">
+      <w:start w:val="1"/>
+      <w:numFmt w:val="bullet"/>
+      <w:lvlText w:val=""/>
+      <w:lvlJc w:val="left"/>
+      <w:pPr>
+        <w:ind w:left="4320" w:hanging="360"/>
+      </w:pPr>
+      <w:rPr>
+        <w:rFonts w:ascii="Wingdings" w:hAnsi="Wingdings" w:hint="default"/>
+      </w:rPr>
+    </w:lvl>
+    <w:lvl w:ilvl="1" w:tplc="10090003" w:tentative="1">
+      <w:start w:val="1"/>
+      <w:numFmt w:val="bullet"/>
+      <w:lvlText w:val="o"/>
+      <w:lvlJc w:val="left"/>
+      <w:pPr>
+        <w:ind w:left="5040" w:hanging="360"/>
+      </w:pPr>
+      <w:rPr>
+        <w:rFonts w:ascii="Courier New" w:hAnsi="Courier New" w:cs="Courier New" w:hint="default"/>
+      </w:rPr>
+    </w:lvl>
+    <w:lvl w:ilvl="2" w:tplc="10090005" w:tentative="1">
+      <w:start w:val="1"/>
+      <w:numFmt w:val="bullet"/>
+      <w:lvlText w:val=""/>
+      <w:lvlJc w:val="left"/>
+      <w:pPr>
+        <w:ind w:left="5760" w:hanging="360"/>
+      </w:pPr>
+      <w:rPr>
+        <w:rFonts w:ascii="Wingdings" w:hAnsi="Wingdings" w:hint="default"/>
+      </w:rPr>
+    </w:lvl>
+    <w:lvl w:ilvl="3" w:tplc="10090001" w:tentative="1">
+      <w:start w:val="1"/>
+      <w:numFmt w:val="bullet"/>
+      <w:lvlText w:val=""/>
+      <w:lvlJc w:val="left"/>
+      <w:pPr>
+        <w:ind w:left="6480" w:hanging="360"/>
+      </w:pPr>
+      <w:rPr>
+        <w:rFonts w:ascii="Symbol" w:hAnsi="Symbol" w:hint="default"/>
+      </w:rPr>
+    </w:lvl>
+    <w:lvl w:ilvl="4" w:tplc="10090003" w:tentative="1">
+      <w:start w:val="1"/>
+      <w:numFmt w:val="bullet"/>
+      <w:lvlText w:val="o"/>
+      <w:lvlJc w:val="left"/>
+      <w:pPr>
+        <w:ind w:left="7200" w:hanging="360"/>
+      </w:pPr>
+      <w:rPr>
+        <w:rFonts w:ascii="Courier New" w:hAnsi="Courier New" w:cs="Courier New" w:hint="default"/>
+      </w:rPr>
+    </w:lvl>
+    <w:lvl w:ilvl="5" w:tplc="10090005" w:tentative="1">
+      <w:start w:val="1"/>
+      <w:numFmt w:val="bullet"/>
+      <w:lvlText w:val=""/>
+      <w:lvlJc w:val="left"/>
+      <w:pPr>
+        <w:ind w:left="7920" w:hanging="360"/>
+      </w:pPr>
+      <w:rPr>
+        <w:rFonts w:ascii="Wingdings" w:hAnsi="Wingdings" w:hint="default"/>
+      </w:rPr>
+    </w:lvl>
+    <w:lvl w:ilvl="6" w:tplc="10090001" w:tentative="1">
+      <w:start w:val="1"/>
+      <w:numFmt w:val="bullet"/>
+      <w:lvlText w:val=""/>
+      <w:lvlJc w:val="left"/>
+      <w:pPr>
+        <w:ind w:left="8640" w:hanging="360"/>
+      </w:pPr>
+      <w:rPr>
+        <w:rFonts w:ascii="Symbol" w:hAnsi="Symbol" w:hint="default"/>
+      </w:rPr>
+    </w:lvl>
+    <w:lvl w:ilvl="7" w:tplc="10090003" w:tentative="1">
+      <w:start w:val="1"/>
+      <w:numFmt w:val="bullet"/>
+      <w:lvlText w:val="o"/>
+      <w:lvlJc w:val="left"/>
+      <w:pPr>
+        <w:ind w:left="9360" w:hanging="360"/>
+      </w:pPr>
+      <w:rPr>
+        <w:rFonts w:ascii="Courier New" w:hAnsi="Courier New" w:cs="Courier New" w:hint="default"/>
+      </w:rPr>
+    </w:lvl>
+    <w:lvl w:ilvl="8" w:tplc="10090005" w:tentative="1">
+      <w:start w:val="1"/>
+      <w:numFmt w:val="bullet"/>
+      <w:lvlText w:val=""/>
+      <w:lvlJc w:val="left"/>
+      <w:pPr>
+        <w:ind w:left="10080" w:hanging="360"/>
+      </w:pPr>
+      <w:rPr>
+        <w:rFonts w:ascii="Wingdings" w:hAnsi="Wingdings" w:hint="default"/>
+      </w:rPr>
+    </w:lvl>
+  </w:abstractNum>
+  <w:abstractNum w:abstractNumId="15" w15:restartNumberingAfterBreak="0">
     <w:nsid w:val="249F2707"/>
     <w:multiLevelType w:val="hybridMultilevel"/>
     <w:tmpl w:val="6A048F76"/>
@@ -8814,7 +9309,7 @@
       </w:pPr>
     </w:lvl>
   </w:abstractNum>
-  <w:abstractNum w:abstractNumId="15" w15:restartNumberingAfterBreak="0">
+  <w:abstractNum w:abstractNumId="16" w15:restartNumberingAfterBreak="0">
     <w:nsid w:val="24A80059"/>
     <w:multiLevelType w:val="hybridMultilevel"/>
     <w:tmpl w:val="11B24C7E"/>
@@ -8927,7 +9422,7 @@
       </w:rPr>
     </w:lvl>
   </w:abstractNum>
-  <w:abstractNum w:abstractNumId="16" w15:restartNumberingAfterBreak="0">
+  <w:abstractNum w:abstractNumId="17" w15:restartNumberingAfterBreak="0">
     <w:nsid w:val="27CF6E96"/>
     <w:multiLevelType w:val="hybridMultilevel"/>
     <w:tmpl w:val="8D86F246"/>
@@ -9020,7 +9515,7 @@
       </w:pPr>
     </w:lvl>
   </w:abstractNum>
-  <w:abstractNum w:abstractNumId="17" w15:restartNumberingAfterBreak="0">
+  <w:abstractNum w:abstractNumId="18" w15:restartNumberingAfterBreak="0">
     <w:nsid w:val="29F30EFE"/>
     <w:multiLevelType w:val="hybridMultilevel"/>
     <w:tmpl w:val="8D849220"/>
@@ -9133,7 +9628,7 @@
       </w:rPr>
     </w:lvl>
   </w:abstractNum>
-  <w:abstractNum w:abstractNumId="18" w15:restartNumberingAfterBreak="0">
+  <w:abstractNum w:abstractNumId="19" w15:restartNumberingAfterBreak="0">
     <w:nsid w:val="2BE93405"/>
     <w:multiLevelType w:val="hybridMultilevel"/>
     <w:tmpl w:val="ACB8863E"/>
@@ -9219,7 +9714,7 @@
       </w:pPr>
     </w:lvl>
   </w:abstractNum>
-  <w:abstractNum w:abstractNumId="19" w15:restartNumberingAfterBreak="0">
+  <w:abstractNum w:abstractNumId="20" w15:restartNumberingAfterBreak="0">
     <w:nsid w:val="2F201800"/>
     <w:multiLevelType w:val="hybridMultilevel"/>
     <w:tmpl w:val="83526C60"/>
@@ -9332,7 +9827,7 @@
       </w:rPr>
     </w:lvl>
   </w:abstractNum>
-  <w:abstractNum w:abstractNumId="20" w15:restartNumberingAfterBreak="0">
+  <w:abstractNum w:abstractNumId="21" w15:restartNumberingAfterBreak="0">
     <w:nsid w:val="2F4B1B10"/>
     <w:multiLevelType w:val="hybridMultilevel"/>
     <w:tmpl w:val="FC12F644"/>
@@ -9445,7 +9940,7 @@
       </w:rPr>
     </w:lvl>
   </w:abstractNum>
-  <w:abstractNum w:abstractNumId="21" w15:restartNumberingAfterBreak="0">
+  <w:abstractNum w:abstractNumId="22" w15:restartNumberingAfterBreak="0">
     <w:nsid w:val="307F4271"/>
     <w:multiLevelType w:val="hybridMultilevel"/>
     <w:tmpl w:val="6650950A"/>
@@ -9558,7 +10053,7 @@
       </w:rPr>
     </w:lvl>
   </w:abstractNum>
-  <w:abstractNum w:abstractNumId="22" w15:restartNumberingAfterBreak="0">
+  <w:abstractNum w:abstractNumId="23" w15:restartNumberingAfterBreak="0">
     <w:nsid w:val="308D3CBF"/>
     <w:multiLevelType w:val="hybridMultilevel"/>
     <w:tmpl w:val="6C4ABE3C"/>
@@ -9671,7 +10166,7 @@
       </w:rPr>
     </w:lvl>
   </w:abstractNum>
-  <w:abstractNum w:abstractNumId="23" w15:restartNumberingAfterBreak="0">
+  <w:abstractNum w:abstractNumId="24" w15:restartNumberingAfterBreak="0">
     <w:nsid w:val="32F46B80"/>
     <w:multiLevelType w:val="hybridMultilevel"/>
     <w:tmpl w:val="D6EEF02A"/>
@@ -9781,7 +10276,7 @@
       </w:rPr>
     </w:lvl>
   </w:abstractNum>
-  <w:abstractNum w:abstractNumId="24" w15:restartNumberingAfterBreak="0">
+  <w:abstractNum w:abstractNumId="25" w15:restartNumberingAfterBreak="0">
     <w:nsid w:val="36B04573"/>
     <w:multiLevelType w:val="hybridMultilevel"/>
     <w:tmpl w:val="F90CE41A"/>
@@ -9894,10 +10389,10 @@
       </w:rPr>
     </w:lvl>
   </w:abstractNum>
-  <w:abstractNum w:abstractNumId="25" w15:restartNumberingAfterBreak="0">
+  <w:abstractNum w:abstractNumId="26" w15:restartNumberingAfterBreak="0">
     <w:nsid w:val="3CBF39D7"/>
     <w:multiLevelType w:val="hybridMultilevel"/>
-    <w:tmpl w:val="744ABA04"/>
+    <w:tmpl w:val="C40823F6"/>
     <w:lvl w:ilvl="0" w:tplc="10090001">
       <w:start w:val="1"/>
       <w:numFmt w:val="bullet"/>
@@ -9910,7 +10405,7 @@
         <w:rFonts w:ascii="Symbol" w:hAnsi="Symbol" w:hint="default"/>
       </w:rPr>
     </w:lvl>
-    <w:lvl w:ilvl="1" w:tplc="10090003" w:tentative="1">
+    <w:lvl w:ilvl="1" w:tplc="10090003">
       <w:start w:val="1"/>
       <w:numFmt w:val="bullet"/>
       <w:lvlText w:val="o"/>
@@ -9922,7 +10417,7 @@
         <w:rFonts w:ascii="Courier New" w:hAnsi="Courier New" w:cs="Courier New" w:hint="default"/>
       </w:rPr>
     </w:lvl>
-    <w:lvl w:ilvl="2" w:tplc="10090005" w:tentative="1">
+    <w:lvl w:ilvl="2" w:tplc="10090005">
       <w:start w:val="1"/>
       <w:numFmt w:val="bullet"/>
       <w:lvlText w:val=""/>
@@ -10007,7 +10502,7 @@
       </w:rPr>
     </w:lvl>
   </w:abstractNum>
-  <w:abstractNum w:abstractNumId="26" w15:restartNumberingAfterBreak="0">
+  <w:abstractNum w:abstractNumId="27" w15:restartNumberingAfterBreak="0">
     <w:nsid w:val="3E4E7E1D"/>
     <w:multiLevelType w:val="hybridMultilevel"/>
     <w:tmpl w:val="C4183DF8"/>
@@ -10120,7 +10615,7 @@
       </w:rPr>
     </w:lvl>
   </w:abstractNum>
-  <w:abstractNum w:abstractNumId="27" w15:restartNumberingAfterBreak="0">
+  <w:abstractNum w:abstractNumId="28" w15:restartNumberingAfterBreak="0">
     <w:nsid w:val="3EC24676"/>
     <w:multiLevelType w:val="hybridMultilevel"/>
     <w:tmpl w:val="AD10C83C"/>
@@ -10206,7 +10701,206 @@
       </w:pPr>
     </w:lvl>
   </w:abstractNum>
-  <w:abstractNum w:abstractNumId="28" w15:restartNumberingAfterBreak="0">
+  <w:abstractNum w:abstractNumId="29" w15:restartNumberingAfterBreak="0">
+    <w:nsid w:val="5C2550B2"/>
+    <w:multiLevelType w:val="hybridMultilevel"/>
+    <w:tmpl w:val="21F4D02E"/>
+    <w:lvl w:ilvl="0" w:tplc="1009000F">
+      <w:start w:val="1"/>
+      <w:numFmt w:val="decimal"/>
+      <w:lvlText w:val="%1."/>
+      <w:lvlJc w:val="left"/>
+      <w:pPr>
+        <w:ind w:left="3240" w:hanging="360"/>
+      </w:pPr>
+    </w:lvl>
+    <w:lvl w:ilvl="1" w:tplc="10090019" w:tentative="1">
+      <w:start w:val="1"/>
+      <w:numFmt w:val="lowerLetter"/>
+      <w:lvlText w:val="%2."/>
+      <w:lvlJc w:val="left"/>
+      <w:pPr>
+        <w:ind w:left="3960" w:hanging="360"/>
+      </w:pPr>
+    </w:lvl>
+    <w:lvl w:ilvl="2" w:tplc="1009001B" w:tentative="1">
+      <w:start w:val="1"/>
+      <w:numFmt w:val="lowerRoman"/>
+      <w:lvlText w:val="%3."/>
+      <w:lvlJc w:val="right"/>
+      <w:pPr>
+        <w:ind w:left="4680" w:hanging="180"/>
+      </w:pPr>
+    </w:lvl>
+    <w:lvl w:ilvl="3" w:tplc="1009000F" w:tentative="1">
+      <w:start w:val="1"/>
+      <w:numFmt w:val="decimal"/>
+      <w:lvlText w:val="%4."/>
+      <w:lvlJc w:val="left"/>
+      <w:pPr>
+        <w:ind w:left="5400" w:hanging="360"/>
+      </w:pPr>
+    </w:lvl>
+    <w:lvl w:ilvl="4" w:tplc="10090019" w:tentative="1">
+      <w:start w:val="1"/>
+      <w:numFmt w:val="lowerLetter"/>
+      <w:lvlText w:val="%5."/>
+      <w:lvlJc w:val="left"/>
+      <w:pPr>
+        <w:ind w:left="6120" w:hanging="360"/>
+      </w:pPr>
+    </w:lvl>
+    <w:lvl w:ilvl="5" w:tplc="1009001B" w:tentative="1">
+      <w:start w:val="1"/>
+      <w:numFmt w:val="lowerRoman"/>
+      <w:lvlText w:val="%6."/>
+      <w:lvlJc w:val="right"/>
+      <w:pPr>
+        <w:ind w:left="6840" w:hanging="180"/>
+      </w:pPr>
+    </w:lvl>
+    <w:lvl w:ilvl="6" w:tplc="1009000F" w:tentative="1">
+      <w:start w:val="1"/>
+      <w:numFmt w:val="decimal"/>
+      <w:lvlText w:val="%7."/>
+      <w:lvlJc w:val="left"/>
+      <w:pPr>
+        <w:ind w:left="7560" w:hanging="360"/>
+      </w:pPr>
+    </w:lvl>
+    <w:lvl w:ilvl="7" w:tplc="10090019" w:tentative="1">
+      <w:start w:val="1"/>
+      <w:numFmt w:val="lowerLetter"/>
+      <w:lvlText w:val="%8."/>
+      <w:lvlJc w:val="left"/>
+      <w:pPr>
+        <w:ind w:left="8280" w:hanging="360"/>
+      </w:pPr>
+    </w:lvl>
+    <w:lvl w:ilvl="8" w:tplc="1009001B" w:tentative="1">
+      <w:start w:val="1"/>
+      <w:numFmt w:val="lowerRoman"/>
+      <w:lvlText w:val="%9."/>
+      <w:lvlJc w:val="right"/>
+      <w:pPr>
+        <w:ind w:left="9000" w:hanging="180"/>
+      </w:pPr>
+    </w:lvl>
+  </w:abstractNum>
+  <w:abstractNum w:abstractNumId="30" w15:restartNumberingAfterBreak="0">
+    <w:nsid w:val="5E3E310B"/>
+    <w:multiLevelType w:val="hybridMultilevel"/>
+    <w:tmpl w:val="E4E2409A"/>
+    <w:lvl w:ilvl="0" w:tplc="1009000D">
+      <w:start w:val="1"/>
+      <w:numFmt w:val="bullet"/>
+      <w:lvlText w:val=""/>
+      <w:lvlJc w:val="left"/>
+      <w:pPr>
+        <w:ind w:left="3960" w:hanging="360"/>
+      </w:pPr>
+      <w:rPr>
+        <w:rFonts w:ascii="Wingdings" w:hAnsi="Wingdings" w:hint="default"/>
+      </w:rPr>
+    </w:lvl>
+    <w:lvl w:ilvl="1" w:tplc="10090003" w:tentative="1">
+      <w:start w:val="1"/>
+      <w:numFmt w:val="bullet"/>
+      <w:lvlText w:val="o"/>
+      <w:lvlJc w:val="left"/>
+      <w:pPr>
+        <w:ind w:left="4680" w:hanging="360"/>
+      </w:pPr>
+      <w:rPr>
+        <w:rFonts w:ascii="Courier New" w:hAnsi="Courier New" w:cs="Courier New" w:hint="default"/>
+      </w:rPr>
+    </w:lvl>
+    <w:lvl w:ilvl="2" w:tplc="10090005" w:tentative="1">
+      <w:start w:val="1"/>
+      <w:numFmt w:val="bullet"/>
+      <w:lvlText w:val=""/>
+      <w:lvlJc w:val="left"/>
+      <w:pPr>
+        <w:ind w:left="5400" w:hanging="360"/>
+      </w:pPr>
+      <w:rPr>
+        <w:rFonts w:ascii="Wingdings" w:hAnsi="Wingdings" w:hint="default"/>
+      </w:rPr>
+    </w:lvl>
+    <w:lvl w:ilvl="3" w:tplc="10090001" w:tentative="1">
+      <w:start w:val="1"/>
+      <w:numFmt w:val="bullet"/>
+      <w:lvlText w:val=""/>
+      <w:lvlJc w:val="left"/>
+      <w:pPr>
+        <w:ind w:left="6120" w:hanging="360"/>
+      </w:pPr>
+      <w:rPr>
+        <w:rFonts w:ascii="Symbol" w:hAnsi="Symbol" w:hint="default"/>
+      </w:rPr>
+    </w:lvl>
+    <w:lvl w:ilvl="4" w:tplc="10090003" w:tentative="1">
+      <w:start w:val="1"/>
+      <w:numFmt w:val="bullet"/>
+      <w:lvlText w:val="o"/>
+      <w:lvlJc w:val="left"/>
+      <w:pPr>
+        <w:ind w:left="6840" w:hanging="360"/>
+      </w:pPr>
+      <w:rPr>
+        <w:rFonts w:ascii="Courier New" w:hAnsi="Courier New" w:cs="Courier New" w:hint="default"/>
+      </w:rPr>
+    </w:lvl>
+    <w:lvl w:ilvl="5" w:tplc="10090005" w:tentative="1">
+      <w:start w:val="1"/>
+      <w:numFmt w:val="bullet"/>
+      <w:lvlText w:val=""/>
+      <w:lvlJc w:val="left"/>
+      <w:pPr>
+        <w:ind w:left="7560" w:hanging="360"/>
+      </w:pPr>
+      <w:rPr>
+        <w:rFonts w:ascii="Wingdings" w:hAnsi="Wingdings" w:hint="default"/>
+      </w:rPr>
+    </w:lvl>
+    <w:lvl w:ilvl="6" w:tplc="10090001" w:tentative="1">
+      <w:start w:val="1"/>
+      <w:numFmt w:val="bullet"/>
+      <w:lvlText w:val=""/>
+      <w:lvlJc w:val="left"/>
+      <w:pPr>
+        <w:ind w:left="8280" w:hanging="360"/>
+      </w:pPr>
+      <w:rPr>
+        <w:rFonts w:ascii="Symbol" w:hAnsi="Symbol" w:hint="default"/>
+      </w:rPr>
+    </w:lvl>
+    <w:lvl w:ilvl="7" w:tplc="10090003" w:tentative="1">
+      <w:start w:val="1"/>
+      <w:numFmt w:val="bullet"/>
+      <w:lvlText w:val="o"/>
+      <w:lvlJc w:val="left"/>
+      <w:pPr>
+        <w:ind w:left="9000" w:hanging="360"/>
+      </w:pPr>
+      <w:rPr>
+        <w:rFonts w:ascii="Courier New" w:hAnsi="Courier New" w:cs="Courier New" w:hint="default"/>
+      </w:rPr>
+    </w:lvl>
+    <w:lvl w:ilvl="8" w:tplc="10090005" w:tentative="1">
+      <w:start w:val="1"/>
+      <w:numFmt w:val="bullet"/>
+      <w:lvlText w:val=""/>
+      <w:lvlJc w:val="left"/>
+      <w:pPr>
+        <w:ind w:left="9720" w:hanging="360"/>
+      </w:pPr>
+      <w:rPr>
+        <w:rFonts w:ascii="Wingdings" w:hAnsi="Wingdings" w:hint="default"/>
+      </w:rPr>
+    </w:lvl>
+  </w:abstractNum>
+  <w:abstractNum w:abstractNumId="31" w15:restartNumberingAfterBreak="0">
     <w:nsid w:val="5E800D5C"/>
     <w:multiLevelType w:val="hybridMultilevel"/>
     <w:tmpl w:val="481006D8"/>
@@ -10319,7 +11013,7 @@
       </w:rPr>
     </w:lvl>
   </w:abstractNum>
-  <w:abstractNum w:abstractNumId="29" w15:restartNumberingAfterBreak="0">
+  <w:abstractNum w:abstractNumId="32" w15:restartNumberingAfterBreak="0">
     <w:nsid w:val="62A116E7"/>
     <w:multiLevelType w:val="hybridMultilevel"/>
     <w:tmpl w:val="AFD28870"/>
@@ -10432,7 +11126,7 @@
       </w:rPr>
     </w:lvl>
   </w:abstractNum>
-  <w:abstractNum w:abstractNumId="30" w15:restartNumberingAfterBreak="0">
+  <w:abstractNum w:abstractNumId="33" w15:restartNumberingAfterBreak="0">
     <w:nsid w:val="68C51740"/>
     <w:multiLevelType w:val="hybridMultilevel"/>
     <w:tmpl w:val="B614CEA8"/>
@@ -10521,7 +11215,7 @@
       </w:pPr>
     </w:lvl>
   </w:abstractNum>
-  <w:abstractNum w:abstractNumId="31" w15:restartNumberingAfterBreak="0">
+  <w:abstractNum w:abstractNumId="34" w15:restartNumberingAfterBreak="0">
     <w:nsid w:val="69010C8B"/>
     <w:multiLevelType w:val="hybridMultilevel"/>
     <w:tmpl w:val="AB9ACF8C"/>
@@ -10634,7 +11328,7 @@
       </w:rPr>
     </w:lvl>
   </w:abstractNum>
-  <w:abstractNum w:abstractNumId="32" w15:restartNumberingAfterBreak="0">
+  <w:abstractNum w:abstractNumId="35" w15:restartNumberingAfterBreak="0">
     <w:nsid w:val="697A3CAE"/>
     <w:multiLevelType w:val="hybridMultilevel"/>
     <w:tmpl w:val="23829878"/>
@@ -10747,7 +11441,7 @@
       </w:rPr>
     </w:lvl>
   </w:abstractNum>
-  <w:abstractNum w:abstractNumId="33" w15:restartNumberingAfterBreak="0">
+  <w:abstractNum w:abstractNumId="36" w15:restartNumberingAfterBreak="0">
     <w:nsid w:val="6A2C7A5A"/>
     <w:multiLevelType w:val="hybridMultilevel"/>
     <w:tmpl w:val="2FB0BC5E"/>
@@ -10860,7 +11554,7 @@
       </w:rPr>
     </w:lvl>
   </w:abstractNum>
-  <w:abstractNum w:abstractNumId="34" w15:restartNumberingAfterBreak="0">
+  <w:abstractNum w:abstractNumId="37" w15:restartNumberingAfterBreak="0">
     <w:nsid w:val="72236AAD"/>
     <w:multiLevelType w:val="hybridMultilevel"/>
     <w:tmpl w:val="1FF8BAB6"/>
@@ -10973,7 +11667,7 @@
       </w:rPr>
     </w:lvl>
   </w:abstractNum>
-  <w:abstractNum w:abstractNumId="35" w15:restartNumberingAfterBreak="0">
+  <w:abstractNum w:abstractNumId="38" w15:restartNumberingAfterBreak="0">
     <w:nsid w:val="74CF7FBC"/>
     <w:multiLevelType w:val="hybridMultilevel"/>
     <w:tmpl w:val="454E1412"/>
@@ -11086,7 +11780,7 @@
       </w:rPr>
     </w:lvl>
   </w:abstractNum>
-  <w:abstractNum w:abstractNumId="36" w15:restartNumberingAfterBreak="0">
+  <w:abstractNum w:abstractNumId="39" w15:restartNumberingAfterBreak="0">
     <w:nsid w:val="754071D0"/>
     <w:multiLevelType w:val="hybridMultilevel"/>
     <w:tmpl w:val="3698CDEC"/>
@@ -11172,7 +11866,7 @@
       </w:pPr>
     </w:lvl>
   </w:abstractNum>
-  <w:abstractNum w:abstractNumId="37" w15:restartNumberingAfterBreak="0">
+  <w:abstractNum w:abstractNumId="40" w15:restartNumberingAfterBreak="0">
     <w:nsid w:val="798F4444"/>
     <w:multiLevelType w:val="hybridMultilevel"/>
     <w:tmpl w:val="07767454"/>
@@ -11261,7 +11955,7 @@
       </w:pPr>
     </w:lvl>
   </w:abstractNum>
-  <w:abstractNum w:abstractNumId="38" w15:restartNumberingAfterBreak="0">
+  <w:abstractNum w:abstractNumId="41" w15:restartNumberingAfterBreak="0">
     <w:nsid w:val="7ABB3642"/>
     <w:multiLevelType w:val="hybridMultilevel"/>
     <w:tmpl w:val="5EA43876"/>
@@ -11374,7 +12068,7 @@
       </w:rPr>
     </w:lvl>
   </w:abstractNum>
-  <w:abstractNum w:abstractNumId="39" w15:restartNumberingAfterBreak="0">
+  <w:abstractNum w:abstractNumId="42" w15:restartNumberingAfterBreak="0">
     <w:nsid w:val="7C935A79"/>
     <w:multiLevelType w:val="hybridMultilevel"/>
     <w:tmpl w:val="56686326"/>
@@ -11487,7 +12181,7 @@
       </w:rPr>
     </w:lvl>
   </w:abstractNum>
-  <w:abstractNum w:abstractNumId="40" w15:restartNumberingAfterBreak="0">
+  <w:abstractNum w:abstractNumId="43" w15:restartNumberingAfterBreak="0">
     <w:nsid w:val="7F6C1CAC"/>
     <w:multiLevelType w:val="hybridMultilevel"/>
     <w:tmpl w:val="4E3EFFE6"/>
@@ -11600,7 +12294,7 @@
       </w:rPr>
     </w:lvl>
   </w:abstractNum>
-  <w:abstractNum w:abstractNumId="41" w15:restartNumberingAfterBreak="0">
+  <w:abstractNum w:abstractNumId="44" w15:restartNumberingAfterBreak="0">
     <w:nsid w:val="7FF10D2F"/>
     <w:multiLevelType w:val="hybridMultilevel"/>
     <w:tmpl w:val="D3F272D4"/>
@@ -11687,64 +12381,64 @@
     </w:lvl>
   </w:abstractNum>
   <w:num w:numId="1" w16cid:durableId="1200126119">
-    <w:abstractNumId w:val="34"/>
+    <w:abstractNumId w:val="37"/>
   </w:num>
   <w:num w:numId="2" w16cid:durableId="2142964796">
     <w:abstractNumId w:val="7"/>
   </w:num>
   <w:num w:numId="3" w16cid:durableId="1686126829">
-    <w:abstractNumId w:val="36"/>
+    <w:abstractNumId w:val="39"/>
   </w:num>
   <w:num w:numId="4" w16cid:durableId="9256738">
-    <w:abstractNumId w:val="27"/>
+    <w:abstractNumId w:val="28"/>
   </w:num>
   <w:num w:numId="5" w16cid:durableId="1929270298">
-    <w:abstractNumId w:val="15"/>
+    <w:abstractNumId w:val="16"/>
   </w:num>
   <w:num w:numId="6" w16cid:durableId="1283686131">
     <w:abstractNumId w:val="5"/>
   </w:num>
   <w:num w:numId="7" w16cid:durableId="1973510224">
-    <w:abstractNumId w:val="17"/>
+    <w:abstractNumId w:val="18"/>
   </w:num>
   <w:num w:numId="8" w16cid:durableId="1322386662">
     <w:abstractNumId w:val="9"/>
   </w:num>
   <w:num w:numId="9" w16cid:durableId="1623069594">
-    <w:abstractNumId w:val="26"/>
+    <w:abstractNumId w:val="27"/>
   </w:num>
   <w:num w:numId="10" w16cid:durableId="389547150">
-    <w:abstractNumId w:val="31"/>
+    <w:abstractNumId w:val="34"/>
   </w:num>
   <w:num w:numId="11" w16cid:durableId="258147424">
-    <w:abstractNumId w:val="40"/>
+    <w:abstractNumId w:val="43"/>
   </w:num>
   <w:num w:numId="12" w16cid:durableId="1740980150">
-    <w:abstractNumId w:val="35"/>
+    <w:abstractNumId w:val="38"/>
   </w:num>
   <w:num w:numId="13" w16cid:durableId="1889342876">
-    <w:abstractNumId w:val="14"/>
+    <w:abstractNumId w:val="15"/>
   </w:num>
   <w:num w:numId="14" w16cid:durableId="253057507">
     <w:abstractNumId w:val="12"/>
   </w:num>
   <w:num w:numId="15" w16cid:durableId="484205992">
-    <w:abstractNumId w:val="21"/>
+    <w:abstractNumId w:val="22"/>
   </w:num>
   <w:num w:numId="16" w16cid:durableId="791091195">
     <w:abstractNumId w:val="13"/>
   </w:num>
   <w:num w:numId="17" w16cid:durableId="657925824">
-    <w:abstractNumId w:val="19"/>
+    <w:abstractNumId w:val="20"/>
   </w:num>
   <w:num w:numId="18" w16cid:durableId="190342337">
-    <w:abstractNumId w:val="39"/>
+    <w:abstractNumId w:val="42"/>
   </w:num>
   <w:num w:numId="19" w16cid:durableId="1952785505">
-    <w:abstractNumId w:val="29"/>
+    <w:abstractNumId w:val="32"/>
   </w:num>
   <w:num w:numId="20" w16cid:durableId="1591154696">
-    <w:abstractNumId w:val="22"/>
+    <w:abstractNumId w:val="23"/>
   </w:num>
   <w:num w:numId="21" w16cid:durableId="1000231668">
     <w:abstractNumId w:val="6"/>
@@ -11753,49 +12447,49 @@
     <w:abstractNumId w:val="2"/>
   </w:num>
   <w:num w:numId="23" w16cid:durableId="449859590">
-    <w:abstractNumId w:val="20"/>
+    <w:abstractNumId w:val="21"/>
   </w:num>
   <w:num w:numId="24" w16cid:durableId="1859462550">
     <w:abstractNumId w:val="11"/>
   </w:num>
   <w:num w:numId="25" w16cid:durableId="10112469">
-    <w:abstractNumId w:val="18"/>
+    <w:abstractNumId w:val="19"/>
   </w:num>
   <w:num w:numId="26" w16cid:durableId="566114269">
-    <w:abstractNumId w:val="33"/>
+    <w:abstractNumId w:val="36"/>
   </w:num>
   <w:num w:numId="27" w16cid:durableId="732119972">
-    <w:abstractNumId w:val="23"/>
+    <w:abstractNumId w:val="24"/>
   </w:num>
   <w:num w:numId="28" w16cid:durableId="528493660">
-    <w:abstractNumId w:val="37"/>
+    <w:abstractNumId w:val="40"/>
   </w:num>
   <w:num w:numId="29" w16cid:durableId="2097246878">
-    <w:abstractNumId w:val="30"/>
+    <w:abstractNumId w:val="33"/>
   </w:num>
   <w:num w:numId="30" w16cid:durableId="1222912462">
     <w:abstractNumId w:val="0"/>
   </w:num>
   <w:num w:numId="31" w16cid:durableId="1487279755">
-    <w:abstractNumId w:val="38"/>
+    <w:abstractNumId w:val="41"/>
   </w:num>
   <w:num w:numId="32" w16cid:durableId="883833939">
     <w:abstractNumId w:val="1"/>
   </w:num>
   <w:num w:numId="33" w16cid:durableId="1152331654">
-    <w:abstractNumId w:val="28"/>
+    <w:abstractNumId w:val="31"/>
   </w:num>
   <w:num w:numId="34" w16cid:durableId="332343992">
     <w:abstractNumId w:val="4"/>
   </w:num>
   <w:num w:numId="35" w16cid:durableId="1809936711">
-    <w:abstractNumId w:val="41"/>
+    <w:abstractNumId w:val="44"/>
   </w:num>
   <w:num w:numId="36" w16cid:durableId="599412453">
-    <w:abstractNumId w:val="32"/>
+    <w:abstractNumId w:val="35"/>
   </w:num>
   <w:num w:numId="37" w16cid:durableId="1371028658">
-    <w:abstractNumId w:val="16"/>
+    <w:abstractNumId w:val="17"/>
   </w:num>
   <w:num w:numId="38" w16cid:durableId="781799529">
     <w:abstractNumId w:val="8"/>
@@ -11804,13 +12498,22 @@
     <w:abstractNumId w:val="10"/>
   </w:num>
   <w:num w:numId="40" w16cid:durableId="671949270">
-    <w:abstractNumId w:val="24"/>
+    <w:abstractNumId w:val="25"/>
   </w:num>
   <w:num w:numId="41" w16cid:durableId="243495873">
     <w:abstractNumId w:val="3"/>
   </w:num>
   <w:num w:numId="42" w16cid:durableId="616251690">
-    <w:abstractNumId w:val="25"/>
+    <w:abstractNumId w:val="26"/>
+  </w:num>
+  <w:num w:numId="43" w16cid:durableId="214321238">
+    <w:abstractNumId w:val="29"/>
+  </w:num>
+  <w:num w:numId="44" w16cid:durableId="365495428">
+    <w:abstractNumId w:val="30"/>
+  </w:num>
+  <w:num w:numId="45" w16cid:durableId="492258305">
+    <w:abstractNumId w:val="14"/>
   </w:num>
 </w:numbering>
 </file>

</xml_diff>

<commit_message>
completed section. remain section and conclusion
</commit_message>
<xml_diff>
--- a/Public Talks/No 147/No 147.docx
+++ b/Public Talks/No 147/No 147.docx
@@ -26,16 +26,16 @@
             <mc:AlternateContent>
               <mc:Choice Requires="wpg">
                 <w:drawing>
-                  <wp:anchor distT="0" distB="0" distL="114300" distR="114300" simplePos="0" relativeHeight="251661312" behindDoc="1" locked="0" layoutInCell="1" allowOverlap="1" wp14:anchorId="4ABB2C18" wp14:editId="713F8767">
+                  <wp:anchor distT="0" distB="0" distL="114300" distR="114300" simplePos="0" relativeHeight="251661312" behindDoc="1" locked="0" layoutInCell="1" allowOverlap="1" wp14:anchorId="4ABB2C18" wp14:editId="3E6576AD">
                     <wp:simplePos x="0" y="0"/>
                     <wp:positionH relativeFrom="page">
-                      <wp:align>center</wp:align>
+                      <wp:posOffset>0</wp:posOffset>
                     </wp:positionH>
                     <wp:positionV relativeFrom="page">
-                      <wp:align>center</wp:align>
+                      <wp:posOffset>0</wp:posOffset>
                     </wp:positionV>
-                    <wp:extent cx="6858000" cy="9144000"/>
-                    <wp:effectExtent l="0" t="0" r="2540" b="635"/>
+                    <wp:extent cx="7762434" cy="10066351"/>
+                    <wp:effectExtent l="0" t="0" r="0" b="0"/>
                     <wp:wrapNone/>
                     <wp:docPr id="48" name="Group 64"/>
                     <wp:cNvGraphicFramePr/>
@@ -46,9 +46,9 @@
                           <wpg:grpSpPr>
                             <a:xfrm>
                               <a:off x="0" y="0"/>
-                              <a:ext cx="6858000" cy="9144000"/>
-                              <a:chOff x="0" y="0"/>
-                              <a:chExt cx="6858000" cy="9144000"/>
+                              <a:ext cx="7762434" cy="10066351"/>
+                              <a:chOff x="-14068" y="0"/>
+                              <a:chExt cx="6867306" cy="9173386"/>
                             </a:xfrm>
                           </wpg:grpSpPr>
                           <wpg:grpSp>
@@ -56,10 +56,10 @@
                             <wpg:cNvGrpSpPr/>
                             <wpg:grpSpPr>
                               <a:xfrm>
-                                <a:off x="0" y="0"/>
-                                <a:ext cx="6858000" cy="9144000"/>
-                                <a:chOff x="0" y="0"/>
-                                <a:chExt cx="6858000" cy="9144000"/>
+                                <a:off x="-14068" y="0"/>
+                                <a:ext cx="6867306" cy="9173386"/>
+                                <a:chOff x="-14068" y="0"/>
+                                <a:chExt cx="6867306" cy="9173386"/>
                               </a:xfrm>
                             </wpg:grpSpPr>
                             <wps:wsp>
@@ -67,8 +67,8 @@
                               <wps:cNvSpPr/>
                               <wps:spPr>
                                 <a:xfrm>
-                                  <a:off x="0" y="0"/>
-                                  <a:ext cx="6858000" cy="9144000"/>
+                                  <a:off x="-14068" y="7246"/>
+                                  <a:ext cx="6866956" cy="9166140"/>
                                 </a:xfrm>
                                 <a:prstGeom prst="rect">
                                   <a:avLst/>
@@ -724,19 +724,19 @@
                       </a:graphicData>
                     </a:graphic>
                     <wp14:sizeRelH relativeFrom="page">
-                      <wp14:pctWidth>88200</wp14:pctWidth>
+                      <wp14:pctWidth>0</wp14:pctWidth>
                     </wp14:sizeRelH>
                     <wp14:sizeRelV relativeFrom="page">
-                      <wp14:pctHeight>90900</wp14:pctHeight>
+                      <wp14:pctHeight>0</wp14:pctHeight>
                     </wp14:sizeRelV>
                   </wp:anchor>
                 </w:drawing>
               </mc:Choice>
               <mc:Fallback>
                 <w:pict>
-                  <v:group w14:anchorId="4ABB2C18" id="Group 64" o:spid="_x0000_s1026" style="position:absolute;margin-left:0;margin-top:0;width:540pt;height:10in;z-index:-251655168;mso-width-percent:882;mso-height-percent:909;mso-position-horizontal:center;mso-position-horizontal-relative:page;mso-position-vertical:center;mso-position-vertical-relative:page;mso-width-percent:882;mso-height-percent:909" coordsize="68580,91440" o:gfxdata="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">
-                    <v:group id="Group 49" o:spid="_x0000_s1027" style="position:absolute;width:68580;height:91440" coordsize="68580,91440" o:gfxdata="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">
-                      <v:rect id="Rectangle 54" o:spid="_x0000_s1028" style="position:absolute;width:68580;height:91440;visibility:visible;mso-wrap-style:square;v-text-anchor:top" o:gfxdata="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" fillcolor="#485870 [3122]" stroked="f" strokeweight="1pt">
+                  <v:group w14:anchorId="4ABB2C18" id="Group 64" o:spid="_x0000_s1026" style="position:absolute;margin-left:0;margin-top:0;width:611.2pt;height:792.65pt;z-index:-251655168;mso-position-horizontal-relative:page;mso-position-vertical-relative:page" coordorigin="-140" coordsize="68673,91733" o:gfxdata="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">
+                    <v:group id="Group 49" o:spid="_x0000_s1027" style="position:absolute;left:-140;width:68672;height:91733" coordorigin="-140" coordsize="68673,91733" o:gfxdata="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">
+                      <v:rect id="Rectangle 54" o:spid="_x0000_s1028" style="position:absolute;left:-140;top:72;width:68668;height:91661;visibility:visible;mso-wrap-style:square;v-text-anchor:top" o:gfxdata="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" fillcolor="#485870 [3122]" stroked="f" strokeweight="1pt">
                         <v:fill color2="#3d4b5f [2882]" angle="348" colors="0 #88acbb;6554f #88acbb" focus="100%" type="gradient"/>
                         <v:textbox inset="54pt,54pt,1in,5in">
                           <w:txbxContent>
@@ -1147,7 +1147,7 @@
         <w:rPr>
           <w:rFonts w:ascii="Segoe UI Light" w:hAnsi="Segoe UI Light" w:cs="Segoe UI Light"/>
         </w:rPr>
-        <w:t>will be such as has never occurred before, and nothing as such will be occurred again. [an amplitude]</w:t>
+        <w:t>will be such as has never occurred before, and nothing as such will occur again. [an amplitude]</w:t>
       </w:r>
     </w:p>
     <w:p>
@@ -7705,15 +7705,462 @@
     </w:p>
     <w:p>
       <w:pPr>
-        <w:rPr>
-          <w:rFonts w:ascii="Segoe UI Light" w:hAnsi="Segoe UI Light" w:cs="Segoe UI Light"/>
-        </w:rPr>
-      </w:pPr>
-      <w:r>
-        <w:rPr>
-          <w:rFonts w:ascii="Segoe UI Light" w:hAnsi="Segoe UI Light" w:cs="Segoe UI Light"/>
-        </w:rPr>
-        <w:t>As we mention in the outset, there will be great tribulation.</w:t>
+        <w:ind w:left="720" w:hanging="720"/>
+        <w:rPr>
+          <w:rFonts w:ascii="Segoe UI Light" w:hAnsi="Segoe UI Light" w:cs="Segoe UI Light"/>
+        </w:rPr>
+      </w:pPr>
+      <w:r>
+        <w:rPr>
+          <w:rFonts w:ascii="Segoe UI Light" w:hAnsi="Segoe UI Light" w:cs="Segoe UI Light"/>
+        </w:rPr>
+        <w:t>As we mention in the outset, there will be great tribulation</w:t>
+      </w:r>
+      <w:r>
+        <w:rPr>
+          <w:rFonts w:ascii="Segoe UI Light" w:hAnsi="Segoe UI Light" w:cs="Segoe UI Light"/>
+        </w:rPr>
+        <w:t xml:space="preserve"> as Jesus foretold</w:t>
+      </w:r>
+      <w:r>
+        <w:rPr>
+          <w:rFonts w:ascii="Segoe UI Light" w:hAnsi="Segoe UI Light" w:cs="Segoe UI Light"/>
+        </w:rPr>
+        <w:t>.</w:t>
+      </w:r>
+      <w:r>
+        <w:rPr>
+          <w:rFonts w:ascii="Segoe UI Light" w:hAnsi="Segoe UI Light" w:cs="Segoe UI Light"/>
+        </w:rPr>
+        <w:t xml:space="preserve"> How will life be during that time? What will be the severity of this </w:t>
+      </w:r>
+      <w:r>
+        <w:rPr>
+          <w:rFonts w:ascii="Segoe UI Light" w:hAnsi="Segoe UI Light" w:cs="Segoe UI Light"/>
+          <w:i/>
+          <w:iCs/>
+        </w:rPr>
+        <w:t>great tribulation</w:t>
+      </w:r>
+      <w:r>
+        <w:rPr>
+          <w:rFonts w:ascii="Segoe UI Light" w:hAnsi="Segoe UI Light" w:cs="Segoe UI Light"/>
+        </w:rPr>
+        <w:t>?</w:t>
+      </w:r>
+    </w:p>
+    <w:p>
+      <w:pPr>
+        <w:ind w:left="1440" w:hanging="720"/>
+        <w:rPr>
+          <w:rFonts w:ascii="Segoe UI Light" w:hAnsi="Segoe UI Light" w:cs="Segoe UI Light"/>
+          <w:b/>
+          <w:bCs/>
+        </w:rPr>
+      </w:pPr>
+      <w:r>
+        <w:rPr>
+          <w:rFonts w:ascii="Segoe UI Light" w:hAnsi="Segoe UI Light" w:cs="Segoe UI Light"/>
+          <w:b/>
+          <w:bCs/>
+        </w:rPr>
+        <w:t>Matthew 24:21.</w:t>
+      </w:r>
+    </w:p>
+    <w:p>
+      <w:pPr>
+        <w:ind w:left="1440"/>
+        <w:rPr>
+          <w:rFonts w:ascii="Segoe UI Light" w:hAnsi="Segoe UI Light" w:cs="Segoe UI Light"/>
+        </w:rPr>
+      </w:pPr>
+      <w:r>
+        <w:rPr>
+          <w:rFonts w:ascii="Segoe UI Light" w:hAnsi="Segoe UI Light" w:cs="Segoe UI Light"/>
+          <w:i/>
+          <w:iCs/>
+        </w:rPr>
+        <w:t>Tribulation</w:t>
+      </w:r>
+      <w:r>
+        <w:rPr>
+          <w:rFonts w:ascii="Segoe UI Light" w:hAnsi="Segoe UI Light" w:cs="Segoe UI Light"/>
+        </w:rPr>
+        <w:t xml:space="preserve">: </w:t>
+      </w:r>
+      <w:r>
+        <w:rPr>
+          <w:rFonts w:ascii="Segoe UI Light" w:hAnsi="Segoe UI Light" w:cs="Segoe UI Light"/>
+        </w:rPr>
+        <w:t>distress, affliction, or suffering resulting from the pressures of circumstances</w:t>
+      </w:r>
+      <w:r>
+        <w:rPr>
+          <w:rFonts w:ascii="Segoe UI Light" w:hAnsi="Segoe UI Light" w:cs="Segoe UI Light"/>
+        </w:rPr>
+        <w:t xml:space="preserve">. </w:t>
+      </w:r>
+    </w:p>
+    <w:p>
+      <w:pPr>
+        <w:ind w:left="2880" w:hanging="720"/>
+        <w:rPr>
+          <w:rFonts w:ascii="Segoe UI Light" w:hAnsi="Segoe UI Light" w:cs="Segoe UI Light"/>
+        </w:rPr>
+      </w:pPr>
+      <w:r>
+        <w:rPr>
+          <w:rFonts w:ascii="Segoe UI Light" w:hAnsi="Segoe UI Light" w:cs="Segoe UI Light"/>
+        </w:rPr>
+        <w:t>This tribulation will be great. But to what extent? “</w:t>
+      </w:r>
+      <w:r>
+        <w:rPr>
+          <w:rFonts w:ascii="Segoe UI Light" w:hAnsi="Segoe UI Light" w:cs="Segoe UI Light"/>
+          <w:i/>
+          <w:iCs/>
+        </w:rPr>
+        <w:t>such as has not occur since the world’s beginning until now</w:t>
+      </w:r>
+      <w:r>
+        <w:rPr>
+          <w:rFonts w:ascii="Segoe UI Light" w:hAnsi="Segoe UI Light" w:cs="Segoe UI Light"/>
+        </w:rPr>
+        <w:t xml:space="preserve">”. </w:t>
+      </w:r>
+    </w:p>
+    <w:p>
+      <w:pPr>
+        <w:ind w:left="3600" w:hanging="720"/>
+        <w:rPr>
+          <w:rFonts w:ascii="Segoe UI Light" w:hAnsi="Segoe UI Light" w:cs="Segoe UI Light"/>
+        </w:rPr>
+      </w:pPr>
+      <w:r>
+        <w:rPr>
+          <w:rFonts w:ascii="Segoe UI Light" w:hAnsi="Segoe UI Light" w:cs="Segoe UI Light"/>
+        </w:rPr>
+        <w:t>To this in perspective, think about:</w:t>
+      </w:r>
+    </w:p>
+    <w:p>
+      <w:pPr>
+        <w:pStyle w:val="ListParagraph"/>
+        <w:numPr>
+          <w:ilvl w:val="0"/>
+          <w:numId w:val="47"/>
+        </w:numPr>
+        <w:rPr>
+          <w:rFonts w:ascii="Segoe UI Light" w:hAnsi="Segoe UI Light" w:cs="Segoe UI Light"/>
+        </w:rPr>
+      </w:pPr>
+      <w:r>
+        <w:rPr>
+          <w:rFonts w:ascii="Segoe UI Light" w:hAnsi="Segoe UI Light" w:cs="Segoe UI Light"/>
+        </w:rPr>
+        <w:t>Your wors</w:t>
+      </w:r>
+      <w:r>
+        <w:rPr>
+          <w:rFonts w:ascii="Segoe UI Light" w:hAnsi="Segoe UI Light" w:cs="Segoe UI Light"/>
+        </w:rPr>
+        <w:t>t</w:t>
+      </w:r>
+      <w:r>
+        <w:rPr>
+          <w:rFonts w:ascii="Segoe UI Light" w:hAnsi="Segoe UI Light" w:cs="Segoe UI Light"/>
+        </w:rPr>
+        <w:t xml:space="preserve"> day, or week, or year ever.</w:t>
+      </w:r>
+    </w:p>
+    <w:p>
+      <w:pPr>
+        <w:pStyle w:val="ListParagraph"/>
+        <w:numPr>
+          <w:ilvl w:val="0"/>
+          <w:numId w:val="47"/>
+        </w:numPr>
+        <w:rPr>
+          <w:rFonts w:ascii="Segoe UI Light" w:hAnsi="Segoe UI Light" w:cs="Segoe UI Light"/>
+        </w:rPr>
+      </w:pPr>
+      <w:r>
+        <w:rPr>
+          <w:rFonts w:ascii="Segoe UI Light" w:hAnsi="Segoe UI Light" w:cs="Segoe UI Light"/>
+        </w:rPr>
+        <w:t>Or the stress we experience</w:t>
+      </w:r>
+      <w:r>
+        <w:rPr>
+          <w:rFonts w:ascii="Segoe UI Light" w:hAnsi="Segoe UI Light" w:cs="Segoe UI Light"/>
+        </w:rPr>
+        <w:t>d</w:t>
+      </w:r>
+      <w:r>
+        <w:rPr>
+          <w:rFonts w:ascii="Segoe UI Light" w:hAnsi="Segoe UI Light" w:cs="Segoe UI Light"/>
+        </w:rPr>
+        <w:t xml:space="preserve"> during </w:t>
+      </w:r>
+      <w:r>
+        <w:rPr>
+          <w:rFonts w:ascii="Segoe UI Light" w:hAnsi="Segoe UI Light" w:cs="Segoe UI Light"/>
+        </w:rPr>
+        <w:t xml:space="preserve">the </w:t>
+      </w:r>
+      <w:r>
+        <w:rPr>
+          <w:rFonts w:ascii="Segoe UI Light" w:hAnsi="Segoe UI Light" w:cs="Segoe UI Light"/>
+        </w:rPr>
+        <w:t>COVID</w:t>
+      </w:r>
+      <w:r>
+        <w:rPr>
+          <w:rFonts w:ascii="Segoe UI Light" w:hAnsi="Segoe UI Light" w:cs="Segoe UI Light"/>
+        </w:rPr>
+        <w:t>19 pandemic</w:t>
+      </w:r>
+    </w:p>
+    <w:p>
+      <w:pPr>
+        <w:pStyle w:val="ListParagraph"/>
+        <w:numPr>
+          <w:ilvl w:val="0"/>
+          <w:numId w:val="47"/>
+        </w:numPr>
+        <w:rPr>
+          <w:rFonts w:ascii="Segoe UI Light" w:hAnsi="Segoe UI Light" w:cs="Segoe UI Light"/>
+        </w:rPr>
+      </w:pPr>
+      <w:r>
+        <w:rPr>
+          <w:rFonts w:ascii="Segoe UI Light" w:hAnsi="Segoe UI Light" w:cs="Segoe UI Light"/>
+        </w:rPr>
+        <w:t>Or the amount of distress and affliction experienced during wars and armed conflicts</w:t>
+      </w:r>
+    </w:p>
+    <w:p>
+      <w:pPr>
+        <w:pStyle w:val="ListParagraph"/>
+        <w:ind w:left="3958" w:hanging="720"/>
+        <w:rPr>
+          <w:rFonts w:ascii="Segoe UI Light" w:hAnsi="Segoe UI Light" w:cs="Segoe UI Light"/>
+        </w:rPr>
+      </w:pPr>
+      <w:r>
+        <w:rPr>
+          <w:rFonts w:ascii="Segoe UI Light" w:hAnsi="Segoe UI Light" w:cs="Segoe UI Light"/>
+        </w:rPr>
+        <w:t xml:space="preserve">They do not come close to what will be experienced during the </w:t>
+      </w:r>
+      <w:r>
+        <w:rPr>
+          <w:rFonts w:ascii="Segoe UI Light" w:hAnsi="Segoe UI Light" w:cs="Segoe UI Light"/>
+          <w:i/>
+          <w:iCs/>
+        </w:rPr>
+        <w:t>great tribulation</w:t>
+      </w:r>
+      <w:r>
+        <w:rPr>
+          <w:rFonts w:ascii="Segoe UI Light" w:hAnsi="Segoe UI Light" w:cs="Segoe UI Light"/>
+        </w:rPr>
+        <w:t xml:space="preserve"> Jesus mentioned. </w:t>
+      </w:r>
+    </w:p>
+    <w:p>
+      <w:pPr>
+        <w:pStyle w:val="ListParagraph"/>
+        <w:ind w:left="3958" w:hanging="720"/>
+        <w:rPr>
+          <w:rFonts w:ascii="Segoe UI Light" w:hAnsi="Segoe UI Light" w:cs="Segoe UI Light"/>
+        </w:rPr>
+      </w:pPr>
+      <w:r>
+        <w:rPr>
+          <w:rFonts w:ascii="Segoe UI Light" w:hAnsi="Segoe UI Light" w:cs="Segoe UI Light"/>
+        </w:rPr>
+        <w:t>In fact</w:t>
+      </w:r>
+      <w:r>
+        <w:rPr>
+          <w:rFonts w:ascii="Segoe UI Light" w:hAnsi="Segoe UI Light" w:cs="Segoe UI Light"/>
+        </w:rPr>
+        <w:t>,</w:t>
+      </w:r>
+      <w:r>
+        <w:rPr>
+          <w:rFonts w:ascii="Segoe UI Light" w:hAnsi="Segoe UI Light" w:cs="Segoe UI Light"/>
+        </w:rPr>
+        <w:t xml:space="preserve"> in </w:t>
+      </w:r>
+      <w:r>
+        <w:rPr>
+          <w:rFonts w:ascii="Segoe UI Light" w:hAnsi="Segoe UI Light" w:cs="Segoe UI Light"/>
+          <w:b/>
+          <w:bCs/>
+        </w:rPr>
+        <w:t>verse 22</w:t>
+      </w:r>
+      <w:r>
+        <w:rPr>
+          <w:rFonts w:ascii="Segoe UI Light" w:hAnsi="Segoe UI Light" w:cs="Segoe UI Light"/>
+        </w:rPr>
+        <w:t xml:space="preserve"> Jesus said that if the </w:t>
+      </w:r>
+      <w:r>
+        <w:rPr>
+          <w:rFonts w:ascii="Segoe UI Light" w:hAnsi="Segoe UI Light" w:cs="Segoe UI Light"/>
+          <w:i/>
+          <w:iCs/>
+        </w:rPr>
+        <w:t>great tribulation</w:t>
+      </w:r>
+      <w:r>
+        <w:rPr>
+          <w:rFonts w:ascii="Segoe UI Light" w:hAnsi="Segoe UI Light" w:cs="Segoe UI Light"/>
+        </w:rPr>
+        <w:t xml:space="preserve"> was not cut short, no flesh would be saved.</w:t>
+      </w:r>
+    </w:p>
+    <w:p>
+      <w:pPr>
+        <w:ind w:left="2160" w:hanging="720"/>
+        <w:rPr>
+          <w:rFonts w:ascii="Segoe UI Light" w:hAnsi="Segoe UI Light" w:cs="Segoe UI Light"/>
+        </w:rPr>
+      </w:pPr>
+      <w:r>
+        <w:rPr>
+          <w:rFonts w:ascii="Segoe UI Light" w:hAnsi="Segoe UI Light" w:cs="Segoe UI Light"/>
+        </w:rPr>
+        <w:t>This great tribulation will start with the destruction of all false religions and will culminate with the attack on us, God’s people.</w:t>
+      </w:r>
+    </w:p>
+    <w:p>
+      <w:pPr>
+        <w:pStyle w:val="ListParagraph"/>
+        <w:numPr>
+          <w:ilvl w:val="0"/>
+          <w:numId w:val="48"/>
+        </w:numPr>
+        <w:rPr>
+          <w:rFonts w:ascii="Segoe UI Light" w:hAnsi="Segoe UI Light" w:cs="Segoe UI Light"/>
+        </w:rPr>
+      </w:pPr>
+      <w:r>
+        <w:rPr>
+          <w:rFonts w:ascii="Segoe UI Light" w:hAnsi="Segoe UI Light" w:cs="Segoe UI Light"/>
+        </w:rPr>
+        <w:lastRenderedPageBreak/>
+        <w:t>At that time, we will not be able to openly gather for Christian meetings or assemblies</w:t>
+      </w:r>
+    </w:p>
+    <w:p>
+      <w:pPr>
+        <w:pStyle w:val="ListParagraph"/>
+        <w:numPr>
+          <w:ilvl w:val="0"/>
+          <w:numId w:val="48"/>
+        </w:numPr>
+        <w:rPr>
+          <w:rFonts w:ascii="Segoe UI Light" w:hAnsi="Segoe UI Light" w:cs="Segoe UI Light"/>
+        </w:rPr>
+      </w:pPr>
+      <w:r>
+        <w:rPr>
+          <w:rFonts w:ascii="Segoe UI Light" w:hAnsi="Segoe UI Light" w:cs="Segoe UI Light"/>
+        </w:rPr>
+        <w:t xml:space="preserve">The </w:t>
+      </w:r>
+      <w:r>
+        <w:rPr>
+          <w:rFonts w:ascii="Segoe UI Light" w:hAnsi="Segoe UI Light" w:cs="Segoe UI Light"/>
+        </w:rPr>
+        <w:t xml:space="preserve">JW.ORG website will be offline. No more </w:t>
+      </w:r>
+      <w:r>
+        <w:rPr>
+          <w:rFonts w:ascii="Segoe UI Light" w:hAnsi="Segoe UI Light" w:cs="Segoe UI Light"/>
+        </w:rPr>
+        <w:t>monthly Broadcasting, morning worship videos, or Governing Body updates</w:t>
+      </w:r>
+    </w:p>
+    <w:p>
+      <w:pPr>
+        <w:pStyle w:val="ListParagraph"/>
+        <w:numPr>
+          <w:ilvl w:val="0"/>
+          <w:numId w:val="48"/>
+        </w:numPr>
+        <w:rPr>
+          <w:rFonts w:ascii="Segoe UI Light" w:hAnsi="Segoe UI Light" w:cs="Segoe UI Light"/>
+        </w:rPr>
+      </w:pPr>
+      <w:r>
+        <w:rPr>
+          <w:rFonts w:ascii="Segoe UI Light" w:hAnsi="Segoe UI Light" w:cs="Segoe UI Light"/>
+        </w:rPr>
+        <w:t>Authorities will be actively looking for us – our husbands, wives, and children.</w:t>
+      </w:r>
+    </w:p>
+    <w:p>
+      <w:pPr>
+        <w:ind w:left="2160" w:hanging="720"/>
+        <w:rPr>
+          <w:rFonts w:ascii="Segoe UI Light" w:hAnsi="Segoe UI Light" w:cs="Segoe UI Light"/>
+        </w:rPr>
+      </w:pPr>
+      <w:r>
+        <w:rPr>
+          <w:rFonts w:ascii="Segoe UI Light" w:hAnsi="Segoe UI Light" w:cs="Segoe UI Light"/>
+        </w:rPr>
+        <w:t>During that time, the nations will try to destroy those who worship Jehovah</w:t>
+      </w:r>
+      <w:r>
+        <w:rPr>
+          <w:rFonts w:ascii="Segoe UI Light" w:hAnsi="Segoe UI Light" w:cs="Segoe UI Light"/>
+        </w:rPr>
+        <w:t xml:space="preserve">. This was well dramatized </w:t>
+      </w:r>
+      <w:r>
+        <w:rPr>
+          <w:rFonts w:ascii="Segoe UI Light" w:hAnsi="Segoe UI Light" w:cs="Segoe UI Light"/>
+        </w:rPr>
+        <w:t>in our 2016 regional convention</w:t>
+      </w:r>
+      <w:r>
+        <w:rPr>
+          <w:rFonts w:ascii="Segoe UI Light" w:hAnsi="Segoe UI Light" w:cs="Segoe UI Light"/>
+        </w:rPr>
+        <w:t>,</w:t>
+      </w:r>
+      <w:r>
+        <w:rPr>
+          <w:rFonts w:ascii="Segoe UI Light" w:hAnsi="Segoe UI Light" w:cs="Segoe UI Light"/>
+        </w:rPr>
+        <w:t xml:space="preserve"> </w:t>
+      </w:r>
+      <w:r>
+        <w:rPr>
+          <w:rFonts w:ascii="Segoe UI Light" w:hAnsi="Segoe UI Light" w:cs="Segoe UI Light"/>
+          <w:i/>
+          <w:iCs/>
+        </w:rPr>
+        <w:t>Remain Loyal to Jehovah!</w:t>
+      </w:r>
+    </w:p>
+    <w:p>
+      <w:pPr>
+        <w:rPr>
+          <w:rFonts w:ascii="Segoe UI Light" w:hAnsi="Segoe UI Light" w:cs="Segoe UI Light"/>
+        </w:rPr>
+      </w:pPr>
+      <w:r>
+        <w:rPr>
+          <w:rFonts w:ascii="Segoe UI Light" w:hAnsi="Segoe UI Light" w:cs="Segoe UI Light"/>
+        </w:rPr>
+        <w:t>How will we survive the coming perilous time?</w:t>
       </w:r>
     </w:p>
     <w:p>
@@ -7727,8 +8174,465 @@
         <w:rPr>
           <w:rFonts w:ascii="Segoe UI Light" w:hAnsi="Segoe UI Light" w:cs="Segoe UI Light"/>
         </w:rPr>
-        <w:t>During that time, the nations will try to destroy those who worship Jehovah</w:t>
-      </w:r>
+        <w:t xml:space="preserve">Jehovah will show his saving power by rescuing </w:t>
+      </w:r>
+      <w:r>
+        <w:rPr>
+          <w:rFonts w:ascii="Segoe UI Light" w:hAnsi="Segoe UI Light" w:cs="Segoe UI Light"/>
+        </w:rPr>
+        <w:t xml:space="preserve">us, </w:t>
+      </w:r>
+      <w:r>
+        <w:rPr>
+          <w:rFonts w:ascii="Segoe UI Light" w:hAnsi="Segoe UI Light" w:cs="Segoe UI Light"/>
+        </w:rPr>
+        <w:t>his people</w:t>
+      </w:r>
+      <w:r>
+        <w:rPr>
+          <w:rFonts w:ascii="Segoe UI Light" w:hAnsi="Segoe UI Light" w:cs="Segoe UI Light"/>
+        </w:rPr>
+        <w:t xml:space="preserve">. </w:t>
+      </w:r>
+    </w:p>
+    <w:p>
+      <w:pPr>
+        <w:ind w:left="2160" w:hanging="720"/>
+        <w:rPr>
+          <w:rFonts w:ascii="Segoe UI Light" w:hAnsi="Segoe UI Light" w:cs="Segoe UI Light"/>
+        </w:rPr>
+      </w:pPr>
+      <w:r>
+        <w:rPr>
+          <w:rFonts w:ascii="Segoe UI Light" w:hAnsi="Segoe UI Light" w:cs="Segoe UI Light"/>
+        </w:rPr>
+        <w:t xml:space="preserve">First, </w:t>
+      </w:r>
+      <w:r>
+        <w:rPr>
+          <w:rFonts w:ascii="Segoe UI Light" w:hAnsi="Segoe UI Light" w:cs="Segoe UI Light"/>
+        </w:rPr>
+        <w:t>just as in Hezekiah’s days, Jehovah</w:t>
+      </w:r>
+      <w:r>
+        <w:rPr>
+          <w:rFonts w:ascii="Segoe UI Light" w:hAnsi="Segoe UI Light" w:cs="Segoe UI Light"/>
+        </w:rPr>
+        <w:t xml:space="preserve"> will give us the strength to endure that turbulent time. How?</w:t>
+      </w:r>
+    </w:p>
+    <w:p>
+      <w:pPr>
+        <w:ind w:left="2880" w:hanging="720"/>
+        <w:rPr>
+          <w:rFonts w:ascii="Segoe UI Light" w:hAnsi="Segoe UI Light" w:cs="Segoe UI Light"/>
+        </w:rPr>
+      </w:pPr>
+      <w:r>
+        <w:rPr>
+          <w:rFonts w:ascii="Segoe UI Light" w:hAnsi="Segoe UI Light" w:cs="Segoe UI Light"/>
+        </w:rPr>
+        <w:t xml:space="preserve">Do you remember what the friends were doing in the basement in the video dramatization of the </w:t>
+      </w:r>
+      <w:r>
+        <w:rPr>
+          <w:rFonts w:ascii="Segoe UI Light" w:hAnsi="Segoe UI Light" w:cs="Segoe UI Light"/>
+        </w:rPr>
+        <w:t>great tribulation</w:t>
+      </w:r>
+      <w:r>
+        <w:rPr>
+          <w:rFonts w:ascii="Segoe UI Light" w:hAnsi="Segoe UI Light" w:cs="Segoe UI Light"/>
+        </w:rPr>
+        <w:t>?</w:t>
+      </w:r>
+    </w:p>
+    <w:p>
+      <w:pPr>
+        <w:ind w:left="3600" w:hanging="720"/>
+        <w:rPr>
+          <w:rFonts w:ascii="Segoe UI Light" w:hAnsi="Segoe UI Light" w:cs="Segoe UI Light"/>
+        </w:rPr>
+      </w:pPr>
+      <w:r>
+        <w:rPr>
+          <w:rFonts w:ascii="Segoe UI Light" w:hAnsi="Segoe UI Light" w:cs="Segoe UI Light"/>
+        </w:rPr>
+        <w:t>They were sharing how Jehovah saved</w:t>
+      </w:r>
+      <w:r>
+        <w:rPr>
+          <w:rFonts w:ascii="Segoe UI Light" w:hAnsi="Segoe UI Light" w:cs="Segoe UI Light"/>
+        </w:rPr>
+        <w:t xml:space="preserve"> them</w:t>
+      </w:r>
+      <w:r>
+        <w:rPr>
+          <w:rFonts w:ascii="Segoe UI Light" w:hAnsi="Segoe UI Light" w:cs="Segoe UI Light"/>
+        </w:rPr>
+        <w:t xml:space="preserve"> from an Assyrian-like </w:t>
+      </w:r>
+      <w:r>
+        <w:rPr>
+          <w:rFonts w:ascii="Segoe UI Light" w:hAnsi="Segoe UI Light" w:cs="Segoe UI Light"/>
+        </w:rPr>
+        <w:t>threat</w:t>
+      </w:r>
+      <w:r>
+        <w:rPr>
+          <w:rFonts w:ascii="Segoe UI Light" w:hAnsi="Segoe UI Light" w:cs="Segoe UI Light"/>
+        </w:rPr>
+        <w:t xml:space="preserve"> that was undermining their loyalty to Jehovah</w:t>
+      </w:r>
+      <w:r>
+        <w:rPr>
+          <w:rFonts w:ascii="Segoe UI Light" w:hAnsi="Segoe UI Light" w:cs="Segoe UI Light"/>
+        </w:rPr>
+        <w:t xml:space="preserve">, and </w:t>
+      </w:r>
+      <w:r>
+        <w:rPr>
+          <w:rFonts w:ascii="Segoe UI Light" w:hAnsi="Segoe UI Light" w:cs="Segoe UI Light"/>
+        </w:rPr>
+        <w:t>Jehovah’s word</w:t>
+      </w:r>
+      <w:r>
+        <w:rPr>
+          <w:rFonts w:ascii="Segoe UI Light" w:hAnsi="Segoe UI Light" w:cs="Segoe UI Light"/>
+        </w:rPr>
+        <w:t xml:space="preserve"> was</w:t>
+      </w:r>
+      <w:r>
+        <w:rPr>
+          <w:rFonts w:ascii="Segoe UI Light" w:hAnsi="Segoe UI Light" w:cs="Segoe UI Light"/>
+        </w:rPr>
+        <w:t xml:space="preserve"> for them.</w:t>
+      </w:r>
+    </w:p>
+    <w:p>
+      <w:pPr>
+        <w:ind w:left="3600" w:hanging="720"/>
+        <w:rPr>
+          <w:rFonts w:ascii="Segoe UI Light" w:hAnsi="Segoe UI Light" w:cs="Segoe UI Light"/>
+        </w:rPr>
+      </w:pPr>
+      <w:r>
+        <w:rPr>
+          <w:rFonts w:ascii="Segoe UI Light" w:hAnsi="Segoe UI Light" w:cs="Segoe UI Light"/>
+        </w:rPr>
+        <w:t>And each one sharing how Jehovah saved them from the trials they faced build</w:t>
+      </w:r>
+      <w:r>
+        <w:rPr>
+          <w:rFonts w:ascii="Segoe UI Light" w:hAnsi="Segoe UI Light" w:cs="Segoe UI Light"/>
+        </w:rPr>
+        <w:t>s</w:t>
+      </w:r>
+      <w:r>
+        <w:rPr>
+          <w:rFonts w:ascii="Segoe UI Light" w:hAnsi="Segoe UI Light" w:cs="Segoe UI Light"/>
+        </w:rPr>
+        <w:t xml:space="preserve"> the trust of the entire group </w:t>
+      </w:r>
+      <w:r>
+        <w:rPr>
+          <w:rFonts w:ascii="Segoe UI Light" w:hAnsi="Segoe UI Light" w:cs="Segoe UI Light"/>
+        </w:rPr>
+        <w:t>i</w:t>
+      </w:r>
+      <w:r>
+        <w:rPr>
+          <w:rFonts w:ascii="Segoe UI Light" w:hAnsi="Segoe UI Light" w:cs="Segoe UI Light"/>
+        </w:rPr>
+        <w:t>n Jehovah’s saving power.</w:t>
+      </w:r>
+    </w:p>
+    <w:p>
+      <w:pPr>
+        <w:ind w:left="3600" w:hanging="720"/>
+        <w:rPr>
+          <w:rFonts w:ascii="Segoe UI Light" w:hAnsi="Segoe UI Light" w:cs="Segoe UI Light"/>
+        </w:rPr>
+      </w:pPr>
+      <w:r>
+        <w:rPr>
+          <w:rFonts w:ascii="Segoe UI Light" w:hAnsi="Segoe UI Light" w:cs="Segoe UI Light"/>
+        </w:rPr>
+        <w:t>What story will you share in the basement where you will be</w:t>
+      </w:r>
+      <w:r>
+        <w:rPr>
+          <w:rFonts w:ascii="Segoe UI Light" w:hAnsi="Segoe UI Light" w:cs="Segoe UI Light"/>
+        </w:rPr>
+        <w:t xml:space="preserve"> during the great tribulation</w:t>
+      </w:r>
+      <w:r>
+        <w:rPr>
+          <w:rFonts w:ascii="Segoe UI Light" w:hAnsi="Segoe UI Light" w:cs="Segoe UI Light"/>
+        </w:rPr>
+        <w:t>?</w:t>
+      </w:r>
+    </w:p>
+    <w:p>
+      <w:pPr>
+        <w:ind w:left="2160" w:hanging="720"/>
+        <w:rPr>
+          <w:rFonts w:ascii="Segoe UI Light" w:hAnsi="Segoe UI Light" w:cs="Segoe UI Light"/>
+        </w:rPr>
+      </w:pPr>
+      <w:r>
+        <w:rPr>
+          <w:rFonts w:ascii="Segoe UI Light" w:hAnsi="Segoe UI Light" w:cs="Segoe UI Light"/>
+        </w:rPr>
+        <w:t xml:space="preserve">Second, just as in Hezekiah’s days, Jehovah will send not </w:t>
+      </w:r>
+      <w:r>
+        <w:rPr>
+          <w:rFonts w:ascii="Segoe UI Light" w:hAnsi="Segoe UI Light" w:cs="Segoe UI Light"/>
+        </w:rPr>
+        <w:t>one</w:t>
+      </w:r>
+      <w:r>
+        <w:rPr>
+          <w:rFonts w:ascii="Segoe UI Light" w:hAnsi="Segoe UI Light" w:cs="Segoe UI Light"/>
+        </w:rPr>
+        <w:t xml:space="preserve"> angel but a divine army made </w:t>
+      </w:r>
+      <w:r>
+        <w:rPr>
+          <w:rFonts w:ascii="Segoe UI Light" w:hAnsi="Segoe UI Light" w:cs="Segoe UI Light"/>
+        </w:rPr>
+        <w:t xml:space="preserve">up </w:t>
+      </w:r>
+      <w:r>
+        <w:rPr>
+          <w:rFonts w:ascii="Segoe UI Light" w:hAnsi="Segoe UI Light" w:cs="Segoe UI Light"/>
+        </w:rPr>
+        <w:t>of Jesus, the 144,000</w:t>
+      </w:r>
+      <w:r>
+        <w:rPr>
+          <w:rFonts w:ascii="Segoe UI Light" w:hAnsi="Segoe UI Light" w:cs="Segoe UI Light"/>
+        </w:rPr>
+        <w:t>,</w:t>
+      </w:r>
+      <w:r>
+        <w:rPr>
+          <w:rFonts w:ascii="Segoe UI Light" w:hAnsi="Segoe UI Light" w:cs="Segoe UI Light"/>
+        </w:rPr>
+        <w:t xml:space="preserve"> and </w:t>
+      </w:r>
+      <w:r>
+        <w:rPr>
+          <w:rFonts w:ascii="Segoe UI Light" w:hAnsi="Segoe UI Light" w:cs="Segoe UI Light"/>
+        </w:rPr>
+        <w:t>angels.</w:t>
+      </w:r>
+    </w:p>
+    <w:p>
+      <w:pPr>
+        <w:ind w:left="2880" w:hanging="720"/>
+        <w:rPr>
+          <w:rFonts w:ascii="Segoe UI Light" w:hAnsi="Segoe UI Light" w:cs="Segoe UI Light"/>
+        </w:rPr>
+      </w:pPr>
+      <w:r>
+        <w:rPr>
+          <w:rFonts w:ascii="Segoe UI Light" w:hAnsi="Segoe UI Light" w:cs="Segoe UI Light"/>
+        </w:rPr>
+        <w:t>Now, do you want a tip on what you can share in the basement during the great tribulation?</w:t>
+      </w:r>
+    </w:p>
+    <w:p>
+      <w:pPr>
+        <w:pStyle w:val="ListParagraph"/>
+        <w:numPr>
+          <w:ilvl w:val="0"/>
+          <w:numId w:val="49"/>
+        </w:numPr>
+        <w:rPr>
+          <w:rFonts w:ascii="Segoe UI Light" w:hAnsi="Segoe UI Light" w:cs="Segoe UI Light"/>
+        </w:rPr>
+      </w:pPr>
+      <w:r>
+        <w:rPr>
+          <w:rFonts w:ascii="Segoe UI Light" w:hAnsi="Segoe UI Light" w:cs="Segoe UI Light"/>
+        </w:rPr>
+        <w:t>Pull out the calculator on your phone or tablet.</w:t>
+      </w:r>
+    </w:p>
+    <w:p>
+      <w:pPr>
+        <w:pStyle w:val="ListParagraph"/>
+        <w:numPr>
+          <w:ilvl w:val="0"/>
+          <w:numId w:val="49"/>
+        </w:numPr>
+        <w:rPr>
+          <w:rFonts w:ascii="Segoe UI Light" w:hAnsi="Segoe UI Light" w:cs="Segoe UI Light"/>
+        </w:rPr>
+      </w:pPr>
+      <w:r>
+        <w:rPr>
+          <w:rFonts w:ascii="Segoe UI Light" w:hAnsi="Segoe UI Light" w:cs="Segoe UI Light"/>
+        </w:rPr>
+        <w:t>Do this this equation; x = 185,000 x 144,00</w:t>
+      </w:r>
+      <w:r>
+        <w:rPr>
+          <w:rFonts w:ascii="Segoe UI Light" w:hAnsi="Segoe UI Light" w:cs="Segoe UI Light"/>
+        </w:rPr>
+        <w:t>1</w:t>
+      </w:r>
+    </w:p>
+    <w:p>
+      <w:pPr>
+        <w:pStyle w:val="ListParagraph"/>
+        <w:numPr>
+          <w:ilvl w:val="0"/>
+          <w:numId w:val="49"/>
+        </w:numPr>
+        <w:rPr>
+          <w:rFonts w:ascii="Segoe UI Light" w:hAnsi="Segoe UI Light" w:cs="Segoe UI Light"/>
+        </w:rPr>
+      </w:pPr>
+      <w:r>
+        <w:rPr>
+          <w:rFonts w:ascii="Segoe UI Light" w:hAnsi="Segoe UI Light" w:cs="Segoe UI Light"/>
+        </w:rPr>
+        <w:t>What did you get?</w:t>
+      </w:r>
+      <w:r>
+        <w:rPr>
+          <w:rFonts w:ascii="Segoe UI Light" w:hAnsi="Segoe UI Light" w:cs="Segoe UI Light"/>
+        </w:rPr>
+        <w:t xml:space="preserve"> 26.6 billion - </w:t>
+      </w:r>
+      <w:r>
+        <w:rPr>
+          <w:rFonts w:ascii="Segoe UI Light" w:hAnsi="Segoe UI Light" w:cs="Segoe UI Light"/>
+        </w:rPr>
+        <w:t>roughly three times the world’s population</w:t>
+      </w:r>
+    </w:p>
+    <w:p>
+      <w:pPr>
+        <w:pStyle w:val="ListParagraph"/>
+        <w:numPr>
+          <w:ilvl w:val="0"/>
+          <w:numId w:val="49"/>
+        </w:numPr>
+        <w:rPr>
+          <w:rFonts w:ascii="Segoe UI Light" w:hAnsi="Segoe UI Light" w:cs="Segoe UI Light"/>
+        </w:rPr>
+      </w:pPr>
+      <w:r>
+        <w:rPr>
+          <w:rFonts w:ascii="Segoe UI Light" w:hAnsi="Segoe UI Light" w:cs="Segoe UI Light"/>
+        </w:rPr>
+        <w:t xml:space="preserve">This number represents how many people Jesus and the 144,000 can destroy in </w:t>
+      </w:r>
+      <w:r>
+        <w:rPr>
+          <w:rFonts w:ascii="Segoe UI Light" w:hAnsi="Segoe UI Light" w:cs="Segoe UI Light"/>
+        </w:rPr>
+        <w:t>one</w:t>
+      </w:r>
+      <w:r>
+        <w:rPr>
+          <w:rFonts w:ascii="Segoe UI Light" w:hAnsi="Segoe UI Light" w:cs="Segoe UI Light"/>
+        </w:rPr>
+        <w:t xml:space="preserve"> night. How many </w:t>
+      </w:r>
+      <w:r>
+        <w:rPr>
+          <w:rFonts w:ascii="Segoe UI Light" w:hAnsi="Segoe UI Light" w:cs="Segoe UI Light"/>
+        </w:rPr>
+        <w:t>people live</w:t>
+      </w:r>
+      <w:r>
+        <w:rPr>
+          <w:rFonts w:ascii="Segoe UI Light" w:hAnsi="Segoe UI Light" w:cs="Segoe UI Light"/>
+        </w:rPr>
+        <w:t xml:space="preserve"> earth today?</w:t>
+      </w:r>
+    </w:p>
+    <w:p>
+      <w:pPr>
+        <w:pStyle w:val="ListParagraph"/>
+        <w:numPr>
+          <w:ilvl w:val="0"/>
+          <w:numId w:val="49"/>
+        </w:numPr>
+        <w:rPr>
+          <w:rFonts w:ascii="Segoe UI Light" w:hAnsi="Segoe UI Light" w:cs="Segoe UI Light"/>
+        </w:rPr>
+      </w:pPr>
+      <w:r>
+        <w:rPr>
+          <w:rFonts w:ascii="Segoe UI Light" w:hAnsi="Segoe UI Light" w:cs="Segoe UI Light"/>
+        </w:rPr>
+        <w:t>This mean</w:t>
+      </w:r>
+      <w:r>
+        <w:rPr>
+          <w:rFonts w:ascii="Segoe UI Light" w:hAnsi="Segoe UI Light" w:cs="Segoe UI Light"/>
+        </w:rPr>
+        <w:t>s that</w:t>
+      </w:r>
+      <w:r>
+        <w:rPr>
+          <w:rFonts w:ascii="Segoe UI Light" w:hAnsi="Segoe UI Light" w:cs="Segoe UI Light"/>
+        </w:rPr>
+        <w:t xml:space="preserve"> if Jehovah wants Armagedon to happen in </w:t>
+      </w:r>
+      <w:r>
+        <w:rPr>
+          <w:rFonts w:ascii="Segoe UI Light" w:hAnsi="Segoe UI Light" w:cs="Segoe UI Light"/>
+        </w:rPr>
+        <w:t>one</w:t>
+      </w:r>
+      <w:r>
+        <w:rPr>
+          <w:rFonts w:ascii="Segoe UI Light" w:hAnsi="Segoe UI Light" w:cs="Segoe UI Light"/>
+        </w:rPr>
+        <w:t xml:space="preserve"> night, it will happen. </w:t>
+      </w:r>
+    </w:p>
+    <w:p>
+      <w:pPr>
+        <w:pStyle w:val="ListParagraph"/>
+        <w:numPr>
+          <w:ilvl w:val="0"/>
+          <w:numId w:val="49"/>
+        </w:numPr>
+        <w:rPr>
+          <w:rFonts w:ascii="Segoe UI Light" w:hAnsi="Segoe UI Light" w:cs="Segoe UI Light"/>
+        </w:rPr>
+      </w:pPr>
+      <w:r>
+        <w:rPr>
+          <w:rFonts w:ascii="Segoe UI Light" w:hAnsi="Segoe UI Light" w:cs="Segoe UI Light"/>
+        </w:rPr>
+        <w:lastRenderedPageBreak/>
+        <w:t>I am not saying it will happen in 1 night. But this number helps us to put things in perspective. Is Jehovah able to protect his servants during the great tribulation? The answer is a resounding yes. Why? Because the math adds up.</w:t>
+      </w:r>
+    </w:p>
+    <w:p>
+      <w:pPr>
+        <w:ind w:left="3600" w:hanging="720"/>
+        <w:rPr>
+          <w:rFonts w:ascii="Segoe UI Light" w:hAnsi="Segoe UI Light" w:cs="Segoe UI Light"/>
+        </w:rPr>
+      </w:pPr>
+    </w:p>
+    <w:p>
+      <w:pPr>
+        <w:ind w:left="3600" w:hanging="720"/>
+        <w:rPr>
+          <w:rFonts w:ascii="Segoe UI Light" w:hAnsi="Segoe UI Light" w:cs="Segoe UI Light"/>
+        </w:rPr>
+      </w:pPr>
     </w:p>
     <w:p/>
     <w:sectPr>
@@ -10816,6 +11720,119 @@
     </w:lvl>
   </w:abstractNum>
   <w:abstractNum w:abstractNumId="27" w15:restartNumberingAfterBreak="0">
+    <w:nsid w:val="39C20519"/>
+    <w:multiLevelType w:val="hybridMultilevel"/>
+    <w:tmpl w:val="C40EE67A"/>
+    <w:lvl w:ilvl="0" w:tplc="10090001">
+      <w:start w:val="1"/>
+      <w:numFmt w:val="bullet"/>
+      <w:lvlText w:val=""/>
+      <w:lvlJc w:val="left"/>
+      <w:pPr>
+        <w:ind w:left="2160" w:hanging="360"/>
+      </w:pPr>
+      <w:rPr>
+        <w:rFonts w:ascii="Symbol" w:hAnsi="Symbol" w:hint="default"/>
+      </w:rPr>
+    </w:lvl>
+    <w:lvl w:ilvl="1" w:tplc="10090003" w:tentative="1">
+      <w:start w:val="1"/>
+      <w:numFmt w:val="bullet"/>
+      <w:lvlText w:val="o"/>
+      <w:lvlJc w:val="left"/>
+      <w:pPr>
+        <w:ind w:left="2880" w:hanging="360"/>
+      </w:pPr>
+      <w:rPr>
+        <w:rFonts w:ascii="Courier New" w:hAnsi="Courier New" w:cs="Courier New" w:hint="default"/>
+      </w:rPr>
+    </w:lvl>
+    <w:lvl w:ilvl="2" w:tplc="10090005" w:tentative="1">
+      <w:start w:val="1"/>
+      <w:numFmt w:val="bullet"/>
+      <w:lvlText w:val=""/>
+      <w:lvlJc w:val="left"/>
+      <w:pPr>
+        <w:ind w:left="3600" w:hanging="360"/>
+      </w:pPr>
+      <w:rPr>
+        <w:rFonts w:ascii="Wingdings" w:hAnsi="Wingdings" w:hint="default"/>
+      </w:rPr>
+    </w:lvl>
+    <w:lvl w:ilvl="3" w:tplc="10090001" w:tentative="1">
+      <w:start w:val="1"/>
+      <w:numFmt w:val="bullet"/>
+      <w:lvlText w:val=""/>
+      <w:lvlJc w:val="left"/>
+      <w:pPr>
+        <w:ind w:left="4320" w:hanging="360"/>
+      </w:pPr>
+      <w:rPr>
+        <w:rFonts w:ascii="Symbol" w:hAnsi="Symbol" w:hint="default"/>
+      </w:rPr>
+    </w:lvl>
+    <w:lvl w:ilvl="4" w:tplc="10090003" w:tentative="1">
+      <w:start w:val="1"/>
+      <w:numFmt w:val="bullet"/>
+      <w:lvlText w:val="o"/>
+      <w:lvlJc w:val="left"/>
+      <w:pPr>
+        <w:ind w:left="5040" w:hanging="360"/>
+      </w:pPr>
+      <w:rPr>
+        <w:rFonts w:ascii="Courier New" w:hAnsi="Courier New" w:cs="Courier New" w:hint="default"/>
+      </w:rPr>
+    </w:lvl>
+    <w:lvl w:ilvl="5" w:tplc="10090005" w:tentative="1">
+      <w:start w:val="1"/>
+      <w:numFmt w:val="bullet"/>
+      <w:lvlText w:val=""/>
+      <w:lvlJc w:val="left"/>
+      <w:pPr>
+        <w:ind w:left="5760" w:hanging="360"/>
+      </w:pPr>
+      <w:rPr>
+        <w:rFonts w:ascii="Wingdings" w:hAnsi="Wingdings" w:hint="default"/>
+      </w:rPr>
+    </w:lvl>
+    <w:lvl w:ilvl="6" w:tplc="10090001" w:tentative="1">
+      <w:start w:val="1"/>
+      <w:numFmt w:val="bullet"/>
+      <w:lvlText w:val=""/>
+      <w:lvlJc w:val="left"/>
+      <w:pPr>
+        <w:ind w:left="6480" w:hanging="360"/>
+      </w:pPr>
+      <w:rPr>
+        <w:rFonts w:ascii="Symbol" w:hAnsi="Symbol" w:hint="default"/>
+      </w:rPr>
+    </w:lvl>
+    <w:lvl w:ilvl="7" w:tplc="10090003" w:tentative="1">
+      <w:start w:val="1"/>
+      <w:numFmt w:val="bullet"/>
+      <w:lvlText w:val="o"/>
+      <w:lvlJc w:val="left"/>
+      <w:pPr>
+        <w:ind w:left="7200" w:hanging="360"/>
+      </w:pPr>
+      <w:rPr>
+        <w:rFonts w:ascii="Courier New" w:hAnsi="Courier New" w:cs="Courier New" w:hint="default"/>
+      </w:rPr>
+    </w:lvl>
+    <w:lvl w:ilvl="8" w:tplc="10090005" w:tentative="1">
+      <w:start w:val="1"/>
+      <w:numFmt w:val="bullet"/>
+      <w:lvlText w:val=""/>
+      <w:lvlJc w:val="left"/>
+      <w:pPr>
+        <w:ind w:left="7920" w:hanging="360"/>
+      </w:pPr>
+      <w:rPr>
+        <w:rFonts w:ascii="Wingdings" w:hAnsi="Wingdings" w:hint="default"/>
+      </w:rPr>
+    </w:lvl>
+  </w:abstractNum>
+  <w:abstractNum w:abstractNumId="28" w15:restartNumberingAfterBreak="0">
     <w:nsid w:val="3CBF39D7"/>
     <w:multiLevelType w:val="hybridMultilevel"/>
     <w:tmpl w:val="C40823F6"/>
@@ -10928,7 +11945,7 @@
       </w:rPr>
     </w:lvl>
   </w:abstractNum>
-  <w:abstractNum w:abstractNumId="28" w15:restartNumberingAfterBreak="0">
+  <w:abstractNum w:abstractNumId="29" w15:restartNumberingAfterBreak="0">
     <w:nsid w:val="3E4E7E1D"/>
     <w:multiLevelType w:val="hybridMultilevel"/>
     <w:tmpl w:val="C4183DF8"/>
@@ -11041,7 +12058,7 @@
       </w:rPr>
     </w:lvl>
   </w:abstractNum>
-  <w:abstractNum w:abstractNumId="29" w15:restartNumberingAfterBreak="0">
+  <w:abstractNum w:abstractNumId="30" w15:restartNumberingAfterBreak="0">
     <w:nsid w:val="3EC24676"/>
     <w:multiLevelType w:val="hybridMultilevel"/>
     <w:tmpl w:val="AD10C83C"/>
@@ -11127,7 +12144,120 @@
       </w:pPr>
     </w:lvl>
   </w:abstractNum>
-  <w:abstractNum w:abstractNumId="30" w15:restartNumberingAfterBreak="0">
+  <w:abstractNum w:abstractNumId="31" w15:restartNumberingAfterBreak="0">
+    <w:nsid w:val="4F8B54E8"/>
+    <w:multiLevelType w:val="hybridMultilevel"/>
+    <w:tmpl w:val="955A1AB6"/>
+    <w:lvl w:ilvl="0" w:tplc="1009000B">
+      <w:start w:val="1"/>
+      <w:numFmt w:val="bullet"/>
+      <w:lvlText w:val=""/>
+      <w:lvlJc w:val="left"/>
+      <w:pPr>
+        <w:ind w:left="3600" w:hanging="360"/>
+      </w:pPr>
+      <w:rPr>
+        <w:rFonts w:ascii="Wingdings" w:hAnsi="Wingdings" w:hint="default"/>
+      </w:rPr>
+    </w:lvl>
+    <w:lvl w:ilvl="1" w:tplc="10090003" w:tentative="1">
+      <w:start w:val="1"/>
+      <w:numFmt w:val="bullet"/>
+      <w:lvlText w:val="o"/>
+      <w:lvlJc w:val="left"/>
+      <w:pPr>
+        <w:ind w:left="4320" w:hanging="360"/>
+      </w:pPr>
+      <w:rPr>
+        <w:rFonts w:ascii="Courier New" w:hAnsi="Courier New" w:cs="Courier New" w:hint="default"/>
+      </w:rPr>
+    </w:lvl>
+    <w:lvl w:ilvl="2" w:tplc="10090005" w:tentative="1">
+      <w:start w:val="1"/>
+      <w:numFmt w:val="bullet"/>
+      <w:lvlText w:val=""/>
+      <w:lvlJc w:val="left"/>
+      <w:pPr>
+        <w:ind w:left="5040" w:hanging="360"/>
+      </w:pPr>
+      <w:rPr>
+        <w:rFonts w:ascii="Wingdings" w:hAnsi="Wingdings" w:hint="default"/>
+      </w:rPr>
+    </w:lvl>
+    <w:lvl w:ilvl="3" w:tplc="10090001" w:tentative="1">
+      <w:start w:val="1"/>
+      <w:numFmt w:val="bullet"/>
+      <w:lvlText w:val=""/>
+      <w:lvlJc w:val="left"/>
+      <w:pPr>
+        <w:ind w:left="5760" w:hanging="360"/>
+      </w:pPr>
+      <w:rPr>
+        <w:rFonts w:ascii="Symbol" w:hAnsi="Symbol" w:hint="default"/>
+      </w:rPr>
+    </w:lvl>
+    <w:lvl w:ilvl="4" w:tplc="10090003" w:tentative="1">
+      <w:start w:val="1"/>
+      <w:numFmt w:val="bullet"/>
+      <w:lvlText w:val="o"/>
+      <w:lvlJc w:val="left"/>
+      <w:pPr>
+        <w:ind w:left="6480" w:hanging="360"/>
+      </w:pPr>
+      <w:rPr>
+        <w:rFonts w:ascii="Courier New" w:hAnsi="Courier New" w:cs="Courier New" w:hint="default"/>
+      </w:rPr>
+    </w:lvl>
+    <w:lvl w:ilvl="5" w:tplc="10090005" w:tentative="1">
+      <w:start w:val="1"/>
+      <w:numFmt w:val="bullet"/>
+      <w:lvlText w:val=""/>
+      <w:lvlJc w:val="left"/>
+      <w:pPr>
+        <w:ind w:left="7200" w:hanging="360"/>
+      </w:pPr>
+      <w:rPr>
+        <w:rFonts w:ascii="Wingdings" w:hAnsi="Wingdings" w:hint="default"/>
+      </w:rPr>
+    </w:lvl>
+    <w:lvl w:ilvl="6" w:tplc="10090001" w:tentative="1">
+      <w:start w:val="1"/>
+      <w:numFmt w:val="bullet"/>
+      <w:lvlText w:val=""/>
+      <w:lvlJc w:val="left"/>
+      <w:pPr>
+        <w:ind w:left="7920" w:hanging="360"/>
+      </w:pPr>
+      <w:rPr>
+        <w:rFonts w:ascii="Symbol" w:hAnsi="Symbol" w:hint="default"/>
+      </w:rPr>
+    </w:lvl>
+    <w:lvl w:ilvl="7" w:tplc="10090003" w:tentative="1">
+      <w:start w:val="1"/>
+      <w:numFmt w:val="bullet"/>
+      <w:lvlText w:val="o"/>
+      <w:lvlJc w:val="left"/>
+      <w:pPr>
+        <w:ind w:left="8640" w:hanging="360"/>
+      </w:pPr>
+      <w:rPr>
+        <w:rFonts w:ascii="Courier New" w:hAnsi="Courier New" w:cs="Courier New" w:hint="default"/>
+      </w:rPr>
+    </w:lvl>
+    <w:lvl w:ilvl="8" w:tplc="10090005" w:tentative="1">
+      <w:start w:val="1"/>
+      <w:numFmt w:val="bullet"/>
+      <w:lvlText w:val=""/>
+      <w:lvlJc w:val="left"/>
+      <w:pPr>
+        <w:ind w:left="9360" w:hanging="360"/>
+      </w:pPr>
+      <w:rPr>
+        <w:rFonts w:ascii="Wingdings" w:hAnsi="Wingdings" w:hint="default"/>
+      </w:rPr>
+    </w:lvl>
+  </w:abstractNum>
+  <w:abstractNum w:abstractNumId="32" w15:restartNumberingAfterBreak="0">
     <w:nsid w:val="5C2550B2"/>
     <w:multiLevelType w:val="hybridMultilevel"/>
     <w:tmpl w:val="21F4D02E"/>
@@ -11213,7 +12343,7 @@
       </w:pPr>
     </w:lvl>
   </w:abstractNum>
-  <w:abstractNum w:abstractNumId="31" w15:restartNumberingAfterBreak="0">
+  <w:abstractNum w:abstractNumId="33" w15:restartNumberingAfterBreak="0">
     <w:nsid w:val="5E3E310B"/>
     <w:multiLevelType w:val="hybridMultilevel"/>
     <w:tmpl w:val="E4E2409A"/>
@@ -11326,7 +12456,7 @@
       </w:rPr>
     </w:lvl>
   </w:abstractNum>
-  <w:abstractNum w:abstractNumId="32" w15:restartNumberingAfterBreak="0">
+  <w:abstractNum w:abstractNumId="34" w15:restartNumberingAfterBreak="0">
     <w:nsid w:val="5E800D5C"/>
     <w:multiLevelType w:val="hybridMultilevel"/>
     <w:tmpl w:val="481006D8"/>
@@ -11439,7 +12569,7 @@
       </w:rPr>
     </w:lvl>
   </w:abstractNum>
-  <w:abstractNum w:abstractNumId="33" w15:restartNumberingAfterBreak="0">
+  <w:abstractNum w:abstractNumId="35" w15:restartNumberingAfterBreak="0">
     <w:nsid w:val="62A116E7"/>
     <w:multiLevelType w:val="hybridMultilevel"/>
     <w:tmpl w:val="AFD28870"/>
@@ -11552,7 +12682,120 @@
       </w:rPr>
     </w:lvl>
   </w:abstractNum>
-  <w:abstractNum w:abstractNumId="34" w15:restartNumberingAfterBreak="0">
+  <w:abstractNum w:abstractNumId="36" w15:restartNumberingAfterBreak="0">
+    <w:nsid w:val="67FD2C33"/>
+    <w:multiLevelType w:val="hybridMultilevel"/>
+    <w:tmpl w:val="BED22B72"/>
+    <w:lvl w:ilvl="0" w:tplc="10090001">
+      <w:start w:val="1"/>
+      <w:numFmt w:val="bullet"/>
+      <w:lvlText w:val=""/>
+      <w:lvlJc w:val="left"/>
+      <w:pPr>
+        <w:ind w:left="3600" w:hanging="360"/>
+      </w:pPr>
+      <w:rPr>
+        <w:rFonts w:ascii="Symbol" w:hAnsi="Symbol" w:hint="default"/>
+      </w:rPr>
+    </w:lvl>
+    <w:lvl w:ilvl="1" w:tplc="10090003" w:tentative="1">
+      <w:start w:val="1"/>
+      <w:numFmt w:val="bullet"/>
+      <w:lvlText w:val="o"/>
+      <w:lvlJc w:val="left"/>
+      <w:pPr>
+        <w:ind w:left="4320" w:hanging="360"/>
+      </w:pPr>
+      <w:rPr>
+        <w:rFonts w:ascii="Courier New" w:hAnsi="Courier New" w:cs="Courier New" w:hint="default"/>
+      </w:rPr>
+    </w:lvl>
+    <w:lvl w:ilvl="2" w:tplc="10090005" w:tentative="1">
+      <w:start w:val="1"/>
+      <w:numFmt w:val="bullet"/>
+      <w:lvlText w:val=""/>
+      <w:lvlJc w:val="left"/>
+      <w:pPr>
+        <w:ind w:left="5040" w:hanging="360"/>
+      </w:pPr>
+      <w:rPr>
+        <w:rFonts w:ascii="Wingdings" w:hAnsi="Wingdings" w:hint="default"/>
+      </w:rPr>
+    </w:lvl>
+    <w:lvl w:ilvl="3" w:tplc="10090001" w:tentative="1">
+      <w:start w:val="1"/>
+      <w:numFmt w:val="bullet"/>
+      <w:lvlText w:val=""/>
+      <w:lvlJc w:val="left"/>
+      <w:pPr>
+        <w:ind w:left="5760" w:hanging="360"/>
+      </w:pPr>
+      <w:rPr>
+        <w:rFonts w:ascii="Symbol" w:hAnsi="Symbol" w:hint="default"/>
+      </w:rPr>
+    </w:lvl>
+    <w:lvl w:ilvl="4" w:tplc="10090003" w:tentative="1">
+      <w:start w:val="1"/>
+      <w:numFmt w:val="bullet"/>
+      <w:lvlText w:val="o"/>
+      <w:lvlJc w:val="left"/>
+      <w:pPr>
+        <w:ind w:left="6480" w:hanging="360"/>
+      </w:pPr>
+      <w:rPr>
+        <w:rFonts w:ascii="Courier New" w:hAnsi="Courier New" w:cs="Courier New" w:hint="default"/>
+      </w:rPr>
+    </w:lvl>
+    <w:lvl w:ilvl="5" w:tplc="10090005" w:tentative="1">
+      <w:start w:val="1"/>
+      <w:numFmt w:val="bullet"/>
+      <w:lvlText w:val=""/>
+      <w:lvlJc w:val="left"/>
+      <w:pPr>
+        <w:ind w:left="7200" w:hanging="360"/>
+      </w:pPr>
+      <w:rPr>
+        <w:rFonts w:ascii="Wingdings" w:hAnsi="Wingdings" w:hint="default"/>
+      </w:rPr>
+    </w:lvl>
+    <w:lvl w:ilvl="6" w:tplc="10090001" w:tentative="1">
+      <w:start w:val="1"/>
+      <w:numFmt w:val="bullet"/>
+      <w:lvlText w:val=""/>
+      <w:lvlJc w:val="left"/>
+      <w:pPr>
+        <w:ind w:left="7920" w:hanging="360"/>
+      </w:pPr>
+      <w:rPr>
+        <w:rFonts w:ascii="Symbol" w:hAnsi="Symbol" w:hint="default"/>
+      </w:rPr>
+    </w:lvl>
+    <w:lvl w:ilvl="7" w:tplc="10090003" w:tentative="1">
+      <w:start w:val="1"/>
+      <w:numFmt w:val="bullet"/>
+      <w:lvlText w:val="o"/>
+      <w:lvlJc w:val="left"/>
+      <w:pPr>
+        <w:ind w:left="8640" w:hanging="360"/>
+      </w:pPr>
+      <w:rPr>
+        <w:rFonts w:ascii="Courier New" w:hAnsi="Courier New" w:cs="Courier New" w:hint="default"/>
+      </w:rPr>
+    </w:lvl>
+    <w:lvl w:ilvl="8" w:tplc="10090005" w:tentative="1">
+      <w:start w:val="1"/>
+      <w:numFmt w:val="bullet"/>
+      <w:lvlText w:val=""/>
+      <w:lvlJc w:val="left"/>
+      <w:pPr>
+        <w:ind w:left="9360" w:hanging="360"/>
+      </w:pPr>
+      <w:rPr>
+        <w:rFonts w:ascii="Wingdings" w:hAnsi="Wingdings" w:hint="default"/>
+      </w:rPr>
+    </w:lvl>
+  </w:abstractNum>
+  <w:abstractNum w:abstractNumId="37" w15:restartNumberingAfterBreak="0">
     <w:nsid w:val="68C51740"/>
     <w:multiLevelType w:val="hybridMultilevel"/>
     <w:tmpl w:val="B614CEA8"/>
@@ -11641,7 +12884,7 @@
       </w:pPr>
     </w:lvl>
   </w:abstractNum>
-  <w:abstractNum w:abstractNumId="35" w15:restartNumberingAfterBreak="0">
+  <w:abstractNum w:abstractNumId="38" w15:restartNumberingAfterBreak="0">
     <w:nsid w:val="69010C8B"/>
     <w:multiLevelType w:val="hybridMultilevel"/>
     <w:tmpl w:val="AB9ACF8C"/>
@@ -11754,7 +12997,7 @@
       </w:rPr>
     </w:lvl>
   </w:abstractNum>
-  <w:abstractNum w:abstractNumId="36" w15:restartNumberingAfterBreak="0">
+  <w:abstractNum w:abstractNumId="39" w15:restartNumberingAfterBreak="0">
     <w:nsid w:val="697A3CAE"/>
     <w:multiLevelType w:val="hybridMultilevel"/>
     <w:tmpl w:val="23829878"/>
@@ -11867,7 +13110,7 @@
       </w:rPr>
     </w:lvl>
   </w:abstractNum>
-  <w:abstractNum w:abstractNumId="37" w15:restartNumberingAfterBreak="0">
+  <w:abstractNum w:abstractNumId="40" w15:restartNumberingAfterBreak="0">
     <w:nsid w:val="6A2C7A5A"/>
     <w:multiLevelType w:val="hybridMultilevel"/>
     <w:tmpl w:val="2FB0BC5E"/>
@@ -11980,7 +13223,7 @@
       </w:rPr>
     </w:lvl>
   </w:abstractNum>
-  <w:abstractNum w:abstractNumId="38" w15:restartNumberingAfterBreak="0">
+  <w:abstractNum w:abstractNumId="41" w15:restartNumberingAfterBreak="0">
     <w:nsid w:val="72236AAD"/>
     <w:multiLevelType w:val="hybridMultilevel"/>
     <w:tmpl w:val="1FF8BAB6"/>
@@ -12093,7 +13336,7 @@
       </w:rPr>
     </w:lvl>
   </w:abstractNum>
-  <w:abstractNum w:abstractNumId="39" w15:restartNumberingAfterBreak="0">
+  <w:abstractNum w:abstractNumId="42" w15:restartNumberingAfterBreak="0">
     <w:nsid w:val="74CF7FBC"/>
     <w:multiLevelType w:val="hybridMultilevel"/>
     <w:tmpl w:val="454E1412"/>
@@ -12206,7 +13449,7 @@
       </w:rPr>
     </w:lvl>
   </w:abstractNum>
-  <w:abstractNum w:abstractNumId="40" w15:restartNumberingAfterBreak="0">
+  <w:abstractNum w:abstractNumId="43" w15:restartNumberingAfterBreak="0">
     <w:nsid w:val="754071D0"/>
     <w:multiLevelType w:val="hybridMultilevel"/>
     <w:tmpl w:val="3698CDEC"/>
@@ -12292,7 +13535,7 @@
       </w:pPr>
     </w:lvl>
   </w:abstractNum>
-  <w:abstractNum w:abstractNumId="41" w15:restartNumberingAfterBreak="0">
+  <w:abstractNum w:abstractNumId="44" w15:restartNumberingAfterBreak="0">
     <w:nsid w:val="798F4444"/>
     <w:multiLevelType w:val="hybridMultilevel"/>
     <w:tmpl w:val="07767454"/>
@@ -12381,7 +13624,7 @@
       </w:pPr>
     </w:lvl>
   </w:abstractNum>
-  <w:abstractNum w:abstractNumId="42" w15:restartNumberingAfterBreak="0">
+  <w:abstractNum w:abstractNumId="45" w15:restartNumberingAfterBreak="0">
     <w:nsid w:val="7ABB3642"/>
     <w:multiLevelType w:val="hybridMultilevel"/>
     <w:tmpl w:val="5EA43876"/>
@@ -12494,7 +13737,7 @@
       </w:rPr>
     </w:lvl>
   </w:abstractNum>
-  <w:abstractNum w:abstractNumId="43" w15:restartNumberingAfterBreak="0">
+  <w:abstractNum w:abstractNumId="46" w15:restartNumberingAfterBreak="0">
     <w:nsid w:val="7C935A79"/>
     <w:multiLevelType w:val="hybridMultilevel"/>
     <w:tmpl w:val="56686326"/>
@@ -12607,7 +13850,7 @@
       </w:rPr>
     </w:lvl>
   </w:abstractNum>
-  <w:abstractNum w:abstractNumId="44" w15:restartNumberingAfterBreak="0">
+  <w:abstractNum w:abstractNumId="47" w15:restartNumberingAfterBreak="0">
     <w:nsid w:val="7F6C1CAC"/>
     <w:multiLevelType w:val="hybridMultilevel"/>
     <w:tmpl w:val="4E3EFFE6"/>
@@ -12720,7 +13963,7 @@
       </w:rPr>
     </w:lvl>
   </w:abstractNum>
-  <w:abstractNum w:abstractNumId="45" w15:restartNumberingAfterBreak="0">
+  <w:abstractNum w:abstractNumId="48" w15:restartNumberingAfterBreak="0">
     <w:nsid w:val="7FF10D2F"/>
     <w:multiLevelType w:val="hybridMultilevel"/>
     <w:tmpl w:val="D3F272D4"/>
@@ -12807,16 +14050,16 @@
     </w:lvl>
   </w:abstractNum>
   <w:num w:numId="1" w16cid:durableId="1200126119">
-    <w:abstractNumId w:val="38"/>
+    <w:abstractNumId w:val="41"/>
   </w:num>
   <w:num w:numId="2" w16cid:durableId="2142964796">
     <w:abstractNumId w:val="8"/>
   </w:num>
   <w:num w:numId="3" w16cid:durableId="1686126829">
-    <w:abstractNumId w:val="40"/>
+    <w:abstractNumId w:val="43"/>
   </w:num>
   <w:num w:numId="4" w16cid:durableId="9256738">
-    <w:abstractNumId w:val="29"/>
+    <w:abstractNumId w:val="30"/>
   </w:num>
   <w:num w:numId="5" w16cid:durableId="1929270298">
     <w:abstractNumId w:val="17"/>
@@ -12831,16 +14074,16 @@
     <w:abstractNumId w:val="10"/>
   </w:num>
   <w:num w:numId="9" w16cid:durableId="1623069594">
-    <w:abstractNumId w:val="28"/>
+    <w:abstractNumId w:val="29"/>
   </w:num>
   <w:num w:numId="10" w16cid:durableId="389547150">
-    <w:abstractNumId w:val="35"/>
+    <w:abstractNumId w:val="38"/>
   </w:num>
   <w:num w:numId="11" w16cid:durableId="258147424">
-    <w:abstractNumId w:val="44"/>
+    <w:abstractNumId w:val="47"/>
   </w:num>
   <w:num w:numId="12" w16cid:durableId="1740980150">
-    <w:abstractNumId w:val="39"/>
+    <w:abstractNumId w:val="42"/>
   </w:num>
   <w:num w:numId="13" w16cid:durableId="1889342876">
     <w:abstractNumId w:val="16"/>
@@ -12858,10 +14101,10 @@
     <w:abstractNumId w:val="21"/>
   </w:num>
   <w:num w:numId="18" w16cid:durableId="190342337">
-    <w:abstractNumId w:val="43"/>
+    <w:abstractNumId w:val="46"/>
   </w:num>
   <w:num w:numId="19" w16cid:durableId="1952785505">
-    <w:abstractNumId w:val="33"/>
+    <w:abstractNumId w:val="35"/>
   </w:num>
   <w:num w:numId="20" w16cid:durableId="1591154696">
     <w:abstractNumId w:val="24"/>
@@ -12882,37 +14125,37 @@
     <w:abstractNumId w:val="20"/>
   </w:num>
   <w:num w:numId="26" w16cid:durableId="566114269">
-    <w:abstractNumId w:val="37"/>
+    <w:abstractNumId w:val="40"/>
   </w:num>
   <w:num w:numId="27" w16cid:durableId="732119972">
     <w:abstractNumId w:val="25"/>
   </w:num>
   <w:num w:numId="28" w16cid:durableId="528493660">
-    <w:abstractNumId w:val="41"/>
+    <w:abstractNumId w:val="44"/>
   </w:num>
   <w:num w:numId="29" w16cid:durableId="2097246878">
-    <w:abstractNumId w:val="34"/>
+    <w:abstractNumId w:val="37"/>
   </w:num>
   <w:num w:numId="30" w16cid:durableId="1222912462">
     <w:abstractNumId w:val="0"/>
   </w:num>
   <w:num w:numId="31" w16cid:durableId="1487279755">
-    <w:abstractNumId w:val="42"/>
+    <w:abstractNumId w:val="45"/>
   </w:num>
   <w:num w:numId="32" w16cid:durableId="883833939">
     <w:abstractNumId w:val="2"/>
   </w:num>
   <w:num w:numId="33" w16cid:durableId="1152331654">
-    <w:abstractNumId w:val="32"/>
+    <w:abstractNumId w:val="34"/>
   </w:num>
   <w:num w:numId="34" w16cid:durableId="332343992">
     <w:abstractNumId w:val="5"/>
   </w:num>
   <w:num w:numId="35" w16cid:durableId="1809936711">
-    <w:abstractNumId w:val="45"/>
+    <w:abstractNumId w:val="48"/>
   </w:num>
   <w:num w:numId="36" w16cid:durableId="599412453">
-    <w:abstractNumId w:val="36"/>
+    <w:abstractNumId w:val="39"/>
   </w:num>
   <w:num w:numId="37" w16cid:durableId="1371028658">
     <w:abstractNumId w:val="18"/>
@@ -12930,19 +14173,28 @@
     <w:abstractNumId w:val="4"/>
   </w:num>
   <w:num w:numId="42" w16cid:durableId="616251690">
-    <w:abstractNumId w:val="27"/>
+    <w:abstractNumId w:val="28"/>
   </w:num>
   <w:num w:numId="43" w16cid:durableId="214321238">
-    <w:abstractNumId w:val="30"/>
+    <w:abstractNumId w:val="32"/>
   </w:num>
   <w:num w:numId="44" w16cid:durableId="365495428">
-    <w:abstractNumId w:val="31"/>
+    <w:abstractNumId w:val="33"/>
   </w:num>
   <w:num w:numId="45" w16cid:durableId="492258305">
     <w:abstractNumId w:val="15"/>
   </w:num>
   <w:num w:numId="46" w16cid:durableId="551817623">
     <w:abstractNumId w:val="1"/>
+  </w:num>
+  <w:num w:numId="47" w16cid:durableId="671220424">
+    <w:abstractNumId w:val="31"/>
+  </w:num>
+  <w:num w:numId="48" w16cid:durableId="102381402">
+    <w:abstractNumId w:val="27"/>
+  </w:num>
+  <w:num w:numId="49" w16cid:durableId="1590963441">
+    <w:abstractNumId w:val="36"/>
   </w:num>
 </w:numbering>
 </file>

</xml_diff>